<commit_message>
Adding Selection Sort Algo
</commit_message>
<xml_diff>
--- a/Sorting Algorithms/Sortings.docx
+++ b/Sorting Algorithms/Sortings.docx
@@ -992,7 +992,1231 @@
     </w:p>
     <w:p>
       <w:pPr>
-        <w:rPr>
+        <w:jc w:val="center"/>
+        <w:rPr>
+          <w:b/>
+          <w:sz w:val="36"/>
+          <w:szCs w:val="36"/>
+        </w:rPr>
+      </w:pPr>
+      <w:r>
+        <w:rPr>
+          <w:b/>
+          <w:sz w:val="36"/>
+          <w:szCs w:val="36"/>
+        </w:rPr>
+        <w:lastRenderedPageBreak/>
+        <w:t>Selection Sort</w:t>
+      </w:r>
+    </w:p>
+    <w:p>
+      <w:pPr>
+        <w:spacing w:before="100" w:beforeAutospacing="1" w:after="100" w:afterAutospacing="1" w:line="240" w:lineRule="auto"/>
+        <w:rPr>
+          <w:rFonts w:ascii="Times New Roman" w:eastAsia="Times New Roman" w:hAnsi="Times New Roman" w:cs="Times New Roman"/>
+          <w:sz w:val="24"/>
+          <w:szCs w:val="24"/>
+        </w:rPr>
+      </w:pPr>
+      <w:r>
+        <w:rPr>
+          <w:rFonts w:ascii="Times New Roman" w:eastAsia="Times New Roman" w:hAnsi="Times New Roman" w:cs="Times New Roman"/>
+          <w:b/>
+          <w:bCs/>
+          <w:sz w:val="24"/>
+          <w:szCs w:val="24"/>
+        </w:rPr>
+        <w:t>Selection Sort</w:t>
+      </w:r>
+      <w:r>
+        <w:rPr>
+          <w:rFonts w:ascii="Times New Roman" w:eastAsia="Times New Roman" w:hAnsi="Times New Roman" w:cs="Times New Roman"/>
+          <w:sz w:val="24"/>
+          <w:szCs w:val="24"/>
+        </w:rPr>
+        <w:t xml:space="preserve"> is the "bargain hunter." It scans the entire list to find the absolute smallest item, picks it up, and puts it exactly where it belongs at the front. Then it goes back to look for the next best deal.</w:t>
+      </w:r>
+    </w:p>
+    <w:p>
+      <w:pPr>
+        <w:spacing w:before="100" w:beforeAutospacing="1" w:after="100" w:afterAutospacing="1" w:line="240" w:lineRule="auto"/>
+        <w:outlineLvl w:val="2"/>
+        <w:rPr>
+          <w:rFonts w:ascii="Times New Roman" w:eastAsia="Times New Roman" w:hAnsi="Times New Roman" w:cs="Times New Roman"/>
+          <w:b/>
+          <w:bCs/>
+          <w:sz w:val="27"/>
+          <w:szCs w:val="27"/>
+        </w:rPr>
+      </w:pPr>
+      <w:r>
+        <w:rPr>
+          <w:rFonts w:ascii="Times New Roman" w:eastAsia="Times New Roman" w:hAnsi="Times New Roman" w:cs="Times New Roman"/>
+          <w:b/>
+          <w:bCs/>
+          <w:sz w:val="27"/>
+          <w:szCs w:val="27"/>
+        </w:rPr>
+        <w:t>Steps</w:t>
+      </w:r>
+    </w:p>
+    <w:p>
+      <w:pPr>
+        <w:spacing w:before="100" w:beforeAutospacing="1" w:after="100" w:afterAutospacing="1" w:line="240" w:lineRule="auto"/>
+        <w:rPr>
+          <w:rFonts w:ascii="Times New Roman" w:eastAsia="Times New Roman" w:hAnsi="Times New Roman" w:cs="Times New Roman"/>
+          <w:sz w:val="24"/>
+          <w:szCs w:val="24"/>
+        </w:rPr>
+      </w:pPr>
+      <w:r>
+        <w:rPr>
+          <w:rFonts w:ascii="Times New Roman" w:eastAsia="Times New Roman" w:hAnsi="Times New Roman" w:cs="Times New Roman"/>
+          <w:sz w:val="24"/>
+          <w:szCs w:val="24"/>
+        </w:rPr>
+        <w:t xml:space="preserve">The algorithm divides the list into two parts: a </w:t>
+      </w:r>
+      <w:r>
+        <w:rPr>
+          <w:rFonts w:ascii="Times New Roman" w:eastAsia="Times New Roman" w:hAnsi="Times New Roman" w:cs="Times New Roman"/>
+          <w:b/>
+          <w:bCs/>
+          <w:sz w:val="24"/>
+          <w:szCs w:val="24"/>
+        </w:rPr>
+        <w:t>sorted</w:t>
+      </w:r>
+      <w:r>
+        <w:rPr>
+          <w:rFonts w:ascii="Times New Roman" w:eastAsia="Times New Roman" w:hAnsi="Times New Roman" w:cs="Times New Roman"/>
+          <w:sz w:val="24"/>
+          <w:szCs w:val="24"/>
+        </w:rPr>
+        <w:t xml:space="preserve"> section (left) and an </w:t>
+      </w:r>
+      <w:r>
+        <w:rPr>
+          <w:rFonts w:ascii="Times New Roman" w:eastAsia="Times New Roman" w:hAnsi="Times New Roman" w:cs="Times New Roman"/>
+          <w:b/>
+          <w:bCs/>
+          <w:sz w:val="24"/>
+          <w:szCs w:val="24"/>
+        </w:rPr>
+        <w:t>unsorted</w:t>
+      </w:r>
+      <w:r>
+        <w:rPr>
+          <w:rFonts w:ascii="Times New Roman" w:eastAsia="Times New Roman" w:hAnsi="Times New Roman" w:cs="Times New Roman"/>
+          <w:sz w:val="24"/>
+          <w:szCs w:val="24"/>
+        </w:rPr>
+        <w:t xml:space="preserve"> section (right).</w:t>
+      </w:r>
+    </w:p>
+    <w:p>
+      <w:pPr>
+        <w:numPr>
+          <w:ilvl w:val="0"/>
+          <w:numId w:val="3"/>
+        </w:numPr>
+        <w:spacing w:before="100" w:beforeAutospacing="1" w:after="100" w:afterAutospacing="1" w:line="240" w:lineRule="auto"/>
+        <w:rPr>
+          <w:rFonts w:ascii="Times New Roman" w:eastAsia="Times New Roman" w:hAnsi="Times New Roman" w:cs="Times New Roman"/>
+          <w:sz w:val="24"/>
+          <w:szCs w:val="24"/>
+        </w:rPr>
+      </w:pPr>
+      <w:r>
+        <w:rPr>
+          <w:rFonts w:ascii="Times New Roman" w:eastAsia="Times New Roman" w:hAnsi="Times New Roman" w:cs="Times New Roman"/>
+          <w:sz w:val="24"/>
+          <w:szCs w:val="24"/>
+        </w:rPr>
+        <w:t xml:space="preserve">Assume the first unsorted element is the </w:t>
+      </w:r>
+      <w:r>
+        <w:rPr>
+          <w:rFonts w:ascii="Times New Roman" w:eastAsia="Times New Roman" w:hAnsi="Times New Roman" w:cs="Times New Roman"/>
+          <w:b/>
+          <w:bCs/>
+          <w:sz w:val="24"/>
+          <w:szCs w:val="24"/>
+        </w:rPr>
+        <w:t>minimum</w:t>
+      </w:r>
+      <w:r>
+        <w:rPr>
+          <w:rFonts w:ascii="Times New Roman" w:eastAsia="Times New Roman" w:hAnsi="Times New Roman" w:cs="Times New Roman"/>
+          <w:sz w:val="24"/>
+          <w:szCs w:val="24"/>
+        </w:rPr>
+        <w:t>.</w:t>
+      </w:r>
+    </w:p>
+    <w:p>
+      <w:pPr>
+        <w:numPr>
+          <w:ilvl w:val="0"/>
+          <w:numId w:val="3"/>
+        </w:numPr>
+        <w:spacing w:before="100" w:beforeAutospacing="1" w:after="100" w:afterAutospacing="1" w:line="240" w:lineRule="auto"/>
+        <w:rPr>
+          <w:rFonts w:ascii="Times New Roman" w:eastAsia="Times New Roman" w:hAnsi="Times New Roman" w:cs="Times New Roman"/>
+          <w:sz w:val="24"/>
+          <w:szCs w:val="24"/>
+        </w:rPr>
+      </w:pPr>
+      <w:r>
+        <w:rPr>
+          <w:rFonts w:ascii="Times New Roman" w:eastAsia="Times New Roman" w:hAnsi="Times New Roman" w:cs="Times New Roman"/>
+          <w:b/>
+          <w:bCs/>
+          <w:sz w:val="24"/>
+          <w:szCs w:val="24"/>
+        </w:rPr>
+        <w:t>Scan</w:t>
+      </w:r>
+      <w:r>
+        <w:rPr>
+          <w:rFonts w:ascii="Times New Roman" w:eastAsia="Times New Roman" w:hAnsi="Times New Roman" w:cs="Times New Roman"/>
+          <w:sz w:val="24"/>
+          <w:szCs w:val="24"/>
+        </w:rPr>
+        <w:t xml:space="preserve"> the rest of the unsorted list to find the </w:t>
+      </w:r>
+      <w:r>
+        <w:rPr>
+          <w:rFonts w:ascii="Times New Roman" w:eastAsia="Times New Roman" w:hAnsi="Times New Roman" w:cs="Times New Roman"/>
+          <w:i/>
+          <w:iCs/>
+          <w:sz w:val="24"/>
+          <w:szCs w:val="24"/>
+        </w:rPr>
+        <w:t>actual</w:t>
+      </w:r>
+      <w:r>
+        <w:rPr>
+          <w:rFonts w:ascii="Times New Roman" w:eastAsia="Times New Roman" w:hAnsi="Times New Roman" w:cs="Times New Roman"/>
+          <w:sz w:val="24"/>
+          <w:szCs w:val="24"/>
+        </w:rPr>
+        <w:t xml:space="preserve"> minimum value.</w:t>
+      </w:r>
+    </w:p>
+    <w:p>
+      <w:pPr>
+        <w:numPr>
+          <w:ilvl w:val="0"/>
+          <w:numId w:val="3"/>
+        </w:numPr>
+        <w:spacing w:before="100" w:beforeAutospacing="1" w:after="100" w:afterAutospacing="1" w:line="240" w:lineRule="auto"/>
+        <w:rPr>
+          <w:rFonts w:ascii="Times New Roman" w:eastAsia="Times New Roman" w:hAnsi="Times New Roman" w:cs="Times New Roman"/>
+          <w:sz w:val="24"/>
+          <w:szCs w:val="24"/>
+        </w:rPr>
+      </w:pPr>
+      <w:r>
+        <w:rPr>
+          <w:rFonts w:ascii="Times New Roman" w:eastAsia="Times New Roman" w:hAnsi="Times New Roman" w:cs="Times New Roman"/>
+          <w:b/>
+          <w:bCs/>
+          <w:sz w:val="24"/>
+          <w:szCs w:val="24"/>
+        </w:rPr>
+        <w:t>Swap</w:t>
+      </w:r>
+      <w:r>
+        <w:rPr>
+          <w:rFonts w:ascii="Times New Roman" w:eastAsia="Times New Roman" w:hAnsi="Times New Roman" w:cs="Times New Roman"/>
+          <w:sz w:val="24"/>
+          <w:szCs w:val="24"/>
+        </w:rPr>
+        <w:t xml:space="preserve"> that minimum value with the first element of the unsorted section.</w:t>
+      </w:r>
+    </w:p>
+    <w:p>
+      <w:pPr>
+        <w:numPr>
+          <w:ilvl w:val="0"/>
+          <w:numId w:val="3"/>
+        </w:numPr>
+        <w:spacing w:before="100" w:beforeAutospacing="1" w:after="100" w:afterAutospacing="1" w:line="240" w:lineRule="auto"/>
+        <w:rPr>
+          <w:rFonts w:ascii="Times New Roman" w:eastAsia="Times New Roman" w:hAnsi="Times New Roman" w:cs="Times New Roman"/>
+          <w:sz w:val="24"/>
+          <w:szCs w:val="24"/>
+        </w:rPr>
+      </w:pPr>
+      <w:r>
+        <w:rPr>
+          <w:rFonts w:ascii="Times New Roman" w:eastAsia="Times New Roman" w:hAnsi="Times New Roman" w:cs="Times New Roman"/>
+          <w:sz w:val="24"/>
+          <w:szCs w:val="24"/>
+        </w:rPr>
+        <w:t xml:space="preserve">Move the boundary of the sorted section one step to the right and </w:t>
+      </w:r>
+      <w:r>
+        <w:rPr>
+          <w:rFonts w:ascii="Times New Roman" w:eastAsia="Times New Roman" w:hAnsi="Times New Roman" w:cs="Times New Roman"/>
+          <w:b/>
+          <w:bCs/>
+          <w:sz w:val="24"/>
+          <w:szCs w:val="24"/>
+        </w:rPr>
+        <w:t>repeat</w:t>
+      </w:r>
+      <w:r>
+        <w:rPr>
+          <w:rFonts w:ascii="Times New Roman" w:eastAsia="Times New Roman" w:hAnsi="Times New Roman" w:cs="Times New Roman"/>
+          <w:sz w:val="24"/>
+          <w:szCs w:val="24"/>
+        </w:rPr>
+        <w:t>.</w:t>
+      </w:r>
+    </w:p>
+    <w:p>
+      <w:pPr>
+        <w:spacing w:before="100" w:beforeAutospacing="1" w:after="100" w:afterAutospacing="1" w:line="240" w:lineRule="auto"/>
+        <w:rPr>
+          <w:rFonts w:ascii="Times New Roman" w:eastAsia="Times New Roman" w:hAnsi="Times New Roman" w:cs="Times New Roman"/>
+          <w:sz w:val="24"/>
+          <w:szCs w:val="24"/>
+        </w:rPr>
+      </w:pPr>
+      <w:r>
+        <w:rPr>
+          <w:rFonts w:ascii="Times New Roman" w:eastAsia="Times New Roman" w:hAnsi="Times New Roman" w:cs="Times New Roman"/>
+          <w:b/>
+          <w:bCs/>
+          <w:sz w:val="24"/>
+          <w:szCs w:val="24"/>
+        </w:rPr>
+        <w:t>Example Walkthrough:</w:t>
+      </w:r>
+      <w:r>
+        <w:rPr>
+          <w:rFonts w:ascii="Times New Roman" w:eastAsia="Times New Roman" w:hAnsi="Times New Roman" w:cs="Times New Roman"/>
+          <w:sz w:val="24"/>
+          <w:szCs w:val="24"/>
+        </w:rPr>
+        <w:t xml:space="preserve"> </w:t>
+      </w:r>
+      <w:r>
+        <w:rPr>
+          <w:rFonts w:ascii="Courier New" w:eastAsia="Times New Roman" w:hAnsi="Courier New" w:cs="Courier New"/>
+          <w:sz w:val="20"/>
+        </w:rPr>
+        <w:t>[29, 10, 14]</w:t>
+      </w:r>
+    </w:p>
+    <w:p>
+      <w:pPr>
+        <w:numPr>
+          <w:ilvl w:val="0"/>
+          <w:numId w:val="4"/>
+        </w:numPr>
+        <w:spacing w:before="100" w:beforeAutospacing="1" w:after="100" w:afterAutospacing="1" w:line="240" w:lineRule="auto"/>
+        <w:rPr>
+          <w:rFonts w:ascii="Times New Roman" w:eastAsia="Times New Roman" w:hAnsi="Times New Roman" w:cs="Times New Roman"/>
+          <w:sz w:val="24"/>
+          <w:szCs w:val="24"/>
+        </w:rPr>
+      </w:pPr>
+      <w:r>
+        <w:rPr>
+          <w:rFonts w:ascii="Times New Roman" w:eastAsia="Times New Roman" w:hAnsi="Times New Roman" w:cs="Times New Roman"/>
+          <w:b/>
+          <w:bCs/>
+          <w:sz w:val="24"/>
+          <w:szCs w:val="24"/>
+        </w:rPr>
+        <w:t>Pass 1:</w:t>
+      </w:r>
+    </w:p>
+    <w:p>
+      <w:pPr>
+        <w:numPr>
+          <w:ilvl w:val="1"/>
+          <w:numId w:val="4"/>
+        </w:numPr>
+        <w:spacing w:before="100" w:beforeAutospacing="1" w:after="100" w:afterAutospacing="1" w:line="240" w:lineRule="auto"/>
+        <w:rPr>
+          <w:rFonts w:ascii="Times New Roman" w:eastAsia="Times New Roman" w:hAnsi="Times New Roman" w:cs="Times New Roman"/>
+          <w:sz w:val="24"/>
+          <w:szCs w:val="24"/>
+        </w:rPr>
+      </w:pPr>
+      <w:r>
+        <w:rPr>
+          <w:rFonts w:ascii="Times New Roman" w:eastAsia="Times New Roman" w:hAnsi="Times New Roman" w:cs="Times New Roman"/>
+          <w:sz w:val="24"/>
+          <w:szCs w:val="24"/>
+        </w:rPr>
+        <w:t xml:space="preserve">Assume </w:t>
+      </w:r>
+      <w:r>
+        <w:rPr>
+          <w:rFonts w:ascii="Courier New" w:eastAsia="Times New Roman" w:hAnsi="Courier New" w:cs="Courier New"/>
+          <w:sz w:val="20"/>
+        </w:rPr>
+        <w:t>29</w:t>
+      </w:r>
+      <w:r>
+        <w:rPr>
+          <w:rFonts w:ascii="Times New Roman" w:eastAsia="Times New Roman" w:hAnsi="Times New Roman" w:cs="Times New Roman"/>
+          <w:sz w:val="24"/>
+          <w:szCs w:val="24"/>
+        </w:rPr>
+        <w:t xml:space="preserve"> is the min.</w:t>
+      </w:r>
+    </w:p>
+    <w:p>
+      <w:pPr>
+        <w:numPr>
+          <w:ilvl w:val="1"/>
+          <w:numId w:val="4"/>
+        </w:numPr>
+        <w:spacing w:before="100" w:beforeAutospacing="1" w:after="100" w:afterAutospacing="1" w:line="240" w:lineRule="auto"/>
+        <w:rPr>
+          <w:rFonts w:ascii="Times New Roman" w:eastAsia="Times New Roman" w:hAnsi="Times New Roman" w:cs="Times New Roman"/>
+          <w:sz w:val="24"/>
+          <w:szCs w:val="24"/>
+        </w:rPr>
+      </w:pPr>
+      <w:r>
+        <w:rPr>
+          <w:rFonts w:ascii="Times New Roman" w:eastAsia="Times New Roman" w:hAnsi="Times New Roman" w:cs="Times New Roman"/>
+          <w:sz w:val="24"/>
+          <w:szCs w:val="24"/>
+        </w:rPr>
+        <w:t xml:space="preserve">Scan: Is </w:t>
+      </w:r>
+      <w:r>
+        <w:rPr>
+          <w:rFonts w:ascii="Courier New" w:eastAsia="Times New Roman" w:hAnsi="Courier New" w:cs="Courier New"/>
+          <w:sz w:val="20"/>
+        </w:rPr>
+        <w:t>10</w:t>
+      </w:r>
+      <w:r>
+        <w:rPr>
+          <w:rFonts w:ascii="Times New Roman" w:eastAsia="Times New Roman" w:hAnsi="Times New Roman" w:cs="Times New Roman"/>
+          <w:sz w:val="24"/>
+          <w:szCs w:val="24"/>
+        </w:rPr>
+        <w:t xml:space="preserve"> smaller? Yes. Is </w:t>
+      </w:r>
+      <w:r>
+        <w:rPr>
+          <w:rFonts w:ascii="Courier New" w:eastAsia="Times New Roman" w:hAnsi="Courier New" w:cs="Courier New"/>
+          <w:sz w:val="20"/>
+        </w:rPr>
+        <w:t>14</w:t>
+      </w:r>
+      <w:r>
+        <w:rPr>
+          <w:rFonts w:ascii="Times New Roman" w:eastAsia="Times New Roman" w:hAnsi="Times New Roman" w:cs="Times New Roman"/>
+          <w:sz w:val="24"/>
+          <w:szCs w:val="24"/>
+        </w:rPr>
+        <w:t xml:space="preserve"> smaller than </w:t>
+      </w:r>
+      <w:r>
+        <w:rPr>
+          <w:rFonts w:ascii="Courier New" w:eastAsia="Times New Roman" w:hAnsi="Courier New" w:cs="Courier New"/>
+          <w:sz w:val="20"/>
+        </w:rPr>
+        <w:t>10</w:t>
+      </w:r>
+      <w:r>
+        <w:rPr>
+          <w:rFonts w:ascii="Times New Roman" w:eastAsia="Times New Roman" w:hAnsi="Times New Roman" w:cs="Times New Roman"/>
+          <w:sz w:val="24"/>
+          <w:szCs w:val="24"/>
+        </w:rPr>
+        <w:t>? No.</w:t>
+      </w:r>
+    </w:p>
+    <w:p>
+      <w:pPr>
+        <w:numPr>
+          <w:ilvl w:val="1"/>
+          <w:numId w:val="4"/>
+        </w:numPr>
+        <w:spacing w:before="100" w:beforeAutospacing="1" w:after="100" w:afterAutospacing="1" w:line="240" w:lineRule="auto"/>
+        <w:rPr>
+          <w:rFonts w:ascii="Times New Roman" w:eastAsia="Times New Roman" w:hAnsi="Times New Roman" w:cs="Times New Roman"/>
+          <w:sz w:val="24"/>
+          <w:szCs w:val="24"/>
+        </w:rPr>
+      </w:pPr>
+      <w:r>
+        <w:rPr>
+          <w:rFonts w:ascii="Times New Roman" w:eastAsia="Times New Roman" w:hAnsi="Times New Roman" w:cs="Times New Roman"/>
+          <w:sz w:val="24"/>
+          <w:szCs w:val="24"/>
+        </w:rPr>
+        <w:t xml:space="preserve">Swap </w:t>
+      </w:r>
+      <w:r>
+        <w:rPr>
+          <w:rFonts w:ascii="Courier New" w:eastAsia="Times New Roman" w:hAnsi="Courier New" w:cs="Courier New"/>
+          <w:sz w:val="20"/>
+        </w:rPr>
+        <w:t>10</w:t>
+      </w:r>
+      <w:r>
+        <w:rPr>
+          <w:rFonts w:ascii="Times New Roman" w:eastAsia="Times New Roman" w:hAnsi="Times New Roman" w:cs="Times New Roman"/>
+          <w:sz w:val="24"/>
+          <w:szCs w:val="24"/>
+        </w:rPr>
+        <w:t xml:space="preserve"> with </w:t>
+      </w:r>
+      <w:r>
+        <w:rPr>
+          <w:rFonts w:ascii="Courier New" w:eastAsia="Times New Roman" w:hAnsi="Courier New" w:cs="Courier New"/>
+          <w:sz w:val="20"/>
+        </w:rPr>
+        <w:t>29</w:t>
+      </w:r>
+      <w:r>
+        <w:rPr>
+          <w:rFonts w:ascii="Times New Roman" w:eastAsia="Times New Roman" w:hAnsi="Times New Roman" w:cs="Times New Roman"/>
+          <w:sz w:val="24"/>
+          <w:szCs w:val="24"/>
+        </w:rPr>
+        <w:t xml:space="preserve"> </w:t>
+      </w:r>
+      <w:r>
+        <w:rPr>
+          <w:rFonts w:ascii="Times New Roman" w:eastAsia="Times New Roman" w:hAnsi="Times New Roman" w:cs="Times New Roman"/>
+          <w:sz w:val="24"/>
+          <w:szCs w:val="24"/>
+        </w:rPr>
+        <w:t>--</w:t>
+      </w:r>
+      <w:r>
+        <w:rPr>
+          <w:rFonts w:ascii="Courier New" w:eastAsia="Times New Roman" w:hAnsi="Courier New" w:cs="Courier New"/>
+          <w:sz w:val="20"/>
+        </w:rPr>
+        <w:t>[10, 29, 14]</w:t>
+      </w:r>
+    </w:p>
+    <w:p>
+      <w:pPr>
+        <w:numPr>
+          <w:ilvl w:val="0"/>
+          <w:numId w:val="4"/>
+        </w:numPr>
+        <w:spacing w:before="100" w:beforeAutospacing="1" w:after="100" w:afterAutospacing="1" w:line="240" w:lineRule="auto"/>
+        <w:rPr>
+          <w:rFonts w:ascii="Times New Roman" w:eastAsia="Times New Roman" w:hAnsi="Times New Roman" w:cs="Times New Roman"/>
+          <w:sz w:val="24"/>
+          <w:szCs w:val="24"/>
+        </w:rPr>
+      </w:pPr>
+      <w:r>
+        <w:rPr>
+          <w:rFonts w:ascii="Times New Roman" w:eastAsia="Times New Roman" w:hAnsi="Times New Roman" w:cs="Times New Roman"/>
+          <w:b/>
+          <w:bCs/>
+          <w:sz w:val="24"/>
+          <w:szCs w:val="24"/>
+        </w:rPr>
+        <w:t>Pass 2:</w:t>
+      </w:r>
+    </w:p>
+    <w:p>
+      <w:pPr>
+        <w:numPr>
+          <w:ilvl w:val="1"/>
+          <w:numId w:val="4"/>
+        </w:numPr>
+        <w:spacing w:before="100" w:beforeAutospacing="1" w:after="100" w:afterAutospacing="1" w:line="240" w:lineRule="auto"/>
+        <w:rPr>
+          <w:rFonts w:ascii="Times New Roman" w:eastAsia="Times New Roman" w:hAnsi="Times New Roman" w:cs="Times New Roman"/>
+          <w:sz w:val="24"/>
+          <w:szCs w:val="24"/>
+        </w:rPr>
+      </w:pPr>
+      <w:r>
+        <w:rPr>
+          <w:rFonts w:ascii="Times New Roman" w:eastAsia="Times New Roman" w:hAnsi="Times New Roman" w:cs="Times New Roman"/>
+          <w:sz w:val="24"/>
+          <w:szCs w:val="24"/>
+        </w:rPr>
+        <w:t xml:space="preserve">Assume </w:t>
+      </w:r>
+      <w:r>
+        <w:rPr>
+          <w:rFonts w:ascii="Courier New" w:eastAsia="Times New Roman" w:hAnsi="Courier New" w:cs="Courier New"/>
+          <w:sz w:val="20"/>
+        </w:rPr>
+        <w:t>29</w:t>
+      </w:r>
+      <w:r>
+        <w:rPr>
+          <w:rFonts w:ascii="Times New Roman" w:eastAsia="Times New Roman" w:hAnsi="Times New Roman" w:cs="Times New Roman"/>
+          <w:sz w:val="24"/>
+          <w:szCs w:val="24"/>
+        </w:rPr>
+        <w:t xml:space="preserve"> is the min (the new start of the unsorted part).</w:t>
+      </w:r>
+    </w:p>
+    <w:p>
+      <w:pPr>
+        <w:numPr>
+          <w:ilvl w:val="1"/>
+          <w:numId w:val="4"/>
+        </w:numPr>
+        <w:spacing w:before="100" w:beforeAutospacing="1" w:after="100" w:afterAutospacing="1" w:line="240" w:lineRule="auto"/>
+        <w:rPr>
+          <w:rFonts w:ascii="Times New Roman" w:eastAsia="Times New Roman" w:hAnsi="Times New Roman" w:cs="Times New Roman"/>
+          <w:sz w:val="24"/>
+          <w:szCs w:val="24"/>
+        </w:rPr>
+      </w:pPr>
+      <w:r>
+        <w:rPr>
+          <w:rFonts w:ascii="Times New Roman" w:eastAsia="Times New Roman" w:hAnsi="Times New Roman" w:cs="Times New Roman"/>
+          <w:sz w:val="24"/>
+          <w:szCs w:val="24"/>
+        </w:rPr>
+        <w:t xml:space="preserve">Scan: Is </w:t>
+      </w:r>
+      <w:r>
+        <w:rPr>
+          <w:rFonts w:ascii="Courier New" w:eastAsia="Times New Roman" w:hAnsi="Courier New" w:cs="Courier New"/>
+          <w:sz w:val="20"/>
+        </w:rPr>
+        <w:t>14</w:t>
+      </w:r>
+      <w:r>
+        <w:rPr>
+          <w:rFonts w:ascii="Times New Roman" w:eastAsia="Times New Roman" w:hAnsi="Times New Roman" w:cs="Times New Roman"/>
+          <w:sz w:val="24"/>
+          <w:szCs w:val="24"/>
+        </w:rPr>
+        <w:t xml:space="preserve"> smaller? Yes.</w:t>
+      </w:r>
+    </w:p>
+    <w:p>
+      <w:pPr>
+        <w:numPr>
+          <w:ilvl w:val="1"/>
+          <w:numId w:val="4"/>
+        </w:numPr>
+        <w:spacing w:before="100" w:beforeAutospacing="1" w:after="100" w:afterAutospacing="1" w:line="240" w:lineRule="auto"/>
+        <w:rPr>
+          <w:rFonts w:ascii="Times New Roman" w:eastAsia="Times New Roman" w:hAnsi="Times New Roman" w:cs="Times New Roman"/>
+          <w:sz w:val="24"/>
+          <w:szCs w:val="24"/>
+        </w:rPr>
+      </w:pPr>
+      <w:r>
+        <w:rPr>
+          <w:rFonts w:ascii="Times New Roman" w:eastAsia="Times New Roman" w:hAnsi="Times New Roman" w:cs="Times New Roman"/>
+          <w:sz w:val="24"/>
+          <w:szCs w:val="24"/>
+        </w:rPr>
+        <w:t xml:space="preserve">Swap </w:t>
+      </w:r>
+      <w:r>
+        <w:rPr>
+          <w:rFonts w:ascii="Courier New" w:eastAsia="Times New Roman" w:hAnsi="Courier New" w:cs="Courier New"/>
+          <w:sz w:val="20"/>
+        </w:rPr>
+        <w:t>14</w:t>
+      </w:r>
+      <w:r>
+        <w:rPr>
+          <w:rFonts w:ascii="Times New Roman" w:eastAsia="Times New Roman" w:hAnsi="Times New Roman" w:cs="Times New Roman"/>
+          <w:sz w:val="24"/>
+          <w:szCs w:val="24"/>
+        </w:rPr>
+        <w:t xml:space="preserve"> with </w:t>
+      </w:r>
+      <w:r>
+        <w:rPr>
+          <w:rFonts w:ascii="Courier New" w:eastAsia="Times New Roman" w:hAnsi="Courier New" w:cs="Courier New"/>
+          <w:sz w:val="20"/>
+        </w:rPr>
+        <w:t>29</w:t>
+      </w:r>
+      <w:r>
+        <w:rPr>
+          <w:rFonts w:ascii="Times New Roman" w:eastAsia="Times New Roman" w:hAnsi="Times New Roman" w:cs="Times New Roman"/>
+          <w:sz w:val="24"/>
+          <w:szCs w:val="24"/>
+        </w:rPr>
+        <w:t xml:space="preserve"> </w:t>
+      </w:r>
+      <w:r>
+        <w:rPr>
+          <w:rFonts w:ascii="Times New Roman" w:eastAsia="Times New Roman" w:hAnsi="Times New Roman" w:cs="Times New Roman"/>
+          <w:sz w:val="24"/>
+          <w:szCs w:val="24"/>
+        </w:rPr>
+        <w:t>--</w:t>
+      </w:r>
+      <w:r>
+        <w:rPr>
+          <w:rFonts w:ascii="Courier New" w:eastAsia="Times New Roman" w:hAnsi="Courier New" w:cs="Courier New"/>
+          <w:sz w:val="20"/>
+        </w:rPr>
+        <w:t>[10, 14, 29]</w:t>
+      </w:r>
+    </w:p>
+    <w:p>
+      <w:pPr>
+        <w:numPr>
+          <w:ilvl w:val="0"/>
+          <w:numId w:val="4"/>
+        </w:numPr>
+        <w:spacing w:before="100" w:beforeAutospacing="1" w:after="100" w:afterAutospacing="1" w:line="240" w:lineRule="auto"/>
+        <w:rPr>
+          <w:rFonts w:ascii="Times New Roman" w:eastAsia="Times New Roman" w:hAnsi="Times New Roman" w:cs="Times New Roman"/>
+          <w:sz w:val="24"/>
+          <w:szCs w:val="24"/>
+        </w:rPr>
+      </w:pPr>
+      <w:r>
+        <w:rPr>
+          <w:rFonts w:ascii="Times New Roman" w:eastAsia="Times New Roman" w:hAnsi="Times New Roman" w:cs="Times New Roman"/>
+          <w:b/>
+          <w:bCs/>
+          <w:sz w:val="24"/>
+          <w:szCs w:val="24"/>
+        </w:rPr>
+        <w:t>Result:</w:t>
+      </w:r>
+      <w:r>
+        <w:rPr>
+          <w:rFonts w:ascii="Times New Roman" w:eastAsia="Times New Roman" w:hAnsi="Times New Roman" w:cs="Times New Roman"/>
+          <w:sz w:val="24"/>
+          <w:szCs w:val="24"/>
+        </w:rPr>
+        <w:t xml:space="preserve"> </w:t>
+      </w:r>
+      <w:r>
+        <w:rPr>
+          <w:rFonts w:ascii="Courier New" w:eastAsia="Times New Roman" w:hAnsi="Courier New" w:cs="Courier New"/>
+          <w:sz w:val="20"/>
+        </w:rPr>
+        <w:t>[10, 14, 29]</w:t>
+      </w:r>
+      <w:r>
+        <w:rPr>
+          <w:rFonts w:ascii="Times New Roman" w:eastAsia="Times New Roman" w:hAnsi="Times New Roman" w:cs="Times New Roman"/>
+          <w:sz w:val="24"/>
+          <w:szCs w:val="24"/>
+        </w:rPr>
+        <w:t xml:space="preserve"> (Sorted!)</w:t>
+      </w:r>
+    </w:p>
+    <w:p>
+      <w:pPr>
+        <w:spacing w:before="100" w:beforeAutospacing="1" w:after="100" w:afterAutospacing="1" w:line="240" w:lineRule="auto"/>
+        <w:outlineLvl w:val="2"/>
+        <w:rPr>
+          <w:rFonts w:ascii="Times New Roman" w:eastAsia="Times New Roman" w:hAnsi="Times New Roman" w:cs="Times New Roman"/>
+          <w:b/>
+          <w:bCs/>
+          <w:sz w:val="27"/>
+          <w:szCs w:val="27"/>
+        </w:rPr>
+      </w:pPr>
+      <w:r>
+        <w:rPr>
+          <w:rFonts w:ascii="Times New Roman" w:eastAsia="Times New Roman" w:hAnsi="Times New Roman" w:cs="Times New Roman"/>
+          <w:b/>
+          <w:bCs/>
+          <w:sz w:val="27"/>
+          <w:szCs w:val="27"/>
+        </w:rPr>
+        <w:t>Complexity &amp; Efficiency</w:t>
+      </w:r>
+    </w:p>
+    <w:p>
+      <w:pPr>
+        <w:spacing w:before="100" w:beforeAutospacing="1" w:after="100" w:afterAutospacing="1" w:line="240" w:lineRule="auto"/>
+        <w:rPr>
+          <w:rFonts w:ascii="Times New Roman" w:eastAsia="Times New Roman" w:hAnsi="Times New Roman" w:cs="Times New Roman"/>
+          <w:sz w:val="24"/>
+          <w:szCs w:val="24"/>
+        </w:rPr>
+      </w:pPr>
+      <w:r>
+        <w:rPr>
+          <w:rFonts w:ascii="Times New Roman" w:eastAsia="Times New Roman" w:hAnsi="Times New Roman" w:cs="Times New Roman"/>
+          <w:sz w:val="24"/>
+          <w:szCs w:val="24"/>
+        </w:rPr>
+        <w:t>Selection Sort is consistent—maybe too consistent. It performs the same number of comparisons regardless of whether the list is already sorted.</w:t>
+      </w:r>
+    </w:p>
+    <w:tbl>
+      <w:tblPr>
+        <w:tblW w:w="0" w:type="auto"/>
+        <w:tblCellSpacing w:w="15" w:type="dxa"/>
+        <w:tblCellMar>
+          <w:top w:w="15" w:type="dxa"/>
+          <w:left w:w="15" w:type="dxa"/>
+          <w:bottom w:w="15" w:type="dxa"/>
+          <w:right w:w="15" w:type="dxa"/>
+        </w:tblCellMar>
+        <w:tblLook w:val="04A0"/>
+      </w:tblPr>
+      <w:tblGrid>
+        <w:gridCol w:w="2048"/>
+        <w:gridCol w:w="6720"/>
+      </w:tblGrid>
+      <w:tr>
+        <w:trPr>
+          <w:tblHeader/>
+          <w:tblCellSpacing w:w="15" w:type="dxa"/>
+        </w:trPr>
+        <w:tc>
+          <w:tcPr>
+            <w:tcW w:w="0" w:type="auto"/>
+            <w:tcBorders>
+              <w:top w:val="single" w:sz="4" w:space="0" w:color="auto"/>
+              <w:left w:val="single" w:sz="4" w:space="0" w:color="auto"/>
+              <w:bottom w:val="single" w:sz="4" w:space="0" w:color="auto"/>
+              <w:right w:val="single" w:sz="4" w:space="0" w:color="auto"/>
+            </w:tcBorders>
+            <w:vAlign w:val="center"/>
+            <w:hideMark/>
+          </w:tcPr>
+          <w:p>
+            <w:pPr>
+              <w:spacing w:after="320" w:line="240" w:lineRule="auto"/>
+              <w:rPr>
+                <w:rFonts w:ascii="Times New Roman" w:eastAsia="Times New Roman" w:hAnsi="Times New Roman" w:cs="Times New Roman"/>
+                <w:sz w:val="24"/>
+                <w:szCs w:val="24"/>
+              </w:rPr>
+            </w:pPr>
+            <w:r>
+              <w:rPr>
+                <w:rFonts w:ascii="Times New Roman" w:eastAsia="Times New Roman" w:hAnsi="Times New Roman" w:cs="Times New Roman"/>
+                <w:b/>
+                <w:bCs/>
+                <w:sz w:val="24"/>
+                <w:szCs w:val="24"/>
+              </w:rPr>
+              <w:t>Metric</w:t>
+            </w:r>
+          </w:p>
+        </w:tc>
+        <w:tc>
+          <w:tcPr>
+            <w:tcW w:w="0" w:type="auto"/>
+            <w:tcBorders>
+              <w:top w:val="single" w:sz="4" w:space="0" w:color="auto"/>
+              <w:left w:val="single" w:sz="4" w:space="0" w:color="auto"/>
+              <w:bottom w:val="single" w:sz="4" w:space="0" w:color="auto"/>
+              <w:right w:val="single" w:sz="4" w:space="0" w:color="auto"/>
+            </w:tcBorders>
+            <w:vAlign w:val="center"/>
+            <w:hideMark/>
+          </w:tcPr>
+          <w:p>
+            <w:pPr>
+              <w:spacing w:after="320" w:line="240" w:lineRule="auto"/>
+              <w:rPr>
+                <w:rFonts w:ascii="Times New Roman" w:eastAsia="Times New Roman" w:hAnsi="Times New Roman" w:cs="Times New Roman"/>
+                <w:sz w:val="24"/>
+                <w:szCs w:val="24"/>
+              </w:rPr>
+            </w:pPr>
+            <w:r>
+              <w:rPr>
+                <w:rFonts w:ascii="Times New Roman" w:eastAsia="Times New Roman" w:hAnsi="Times New Roman" w:cs="Times New Roman"/>
+                <w:b/>
+                <w:bCs/>
+                <w:sz w:val="24"/>
+                <w:szCs w:val="24"/>
+              </w:rPr>
+              <w:t>Complexity</w:t>
+            </w:r>
+          </w:p>
+        </w:tc>
+      </w:tr>
+      <w:tr>
+        <w:trPr>
+          <w:tblCellSpacing w:w="15" w:type="dxa"/>
+        </w:trPr>
+        <w:tc>
+          <w:tcPr>
+            <w:tcW w:w="0" w:type="auto"/>
+            <w:tcBorders>
+              <w:top w:val="single" w:sz="4" w:space="0" w:color="auto"/>
+              <w:left w:val="single" w:sz="4" w:space="0" w:color="auto"/>
+              <w:bottom w:val="single" w:sz="4" w:space="0" w:color="auto"/>
+              <w:right w:val="single" w:sz="4" w:space="0" w:color="auto"/>
+            </w:tcBorders>
+            <w:vAlign w:val="center"/>
+            <w:hideMark/>
+          </w:tcPr>
+          <w:p>
+            <w:pPr>
+              <w:spacing w:after="320" w:line="240" w:lineRule="auto"/>
+              <w:rPr>
+                <w:rFonts w:ascii="Times New Roman" w:eastAsia="Times New Roman" w:hAnsi="Times New Roman" w:cs="Times New Roman"/>
+                <w:sz w:val="24"/>
+                <w:szCs w:val="24"/>
+              </w:rPr>
+            </w:pPr>
+            <w:r>
+              <w:rPr>
+                <w:rFonts w:ascii="Times New Roman" w:eastAsia="Times New Roman" w:hAnsi="Times New Roman" w:cs="Times New Roman"/>
+                <w:b/>
+                <w:bCs/>
+                <w:sz w:val="24"/>
+                <w:szCs w:val="24"/>
+              </w:rPr>
+              <w:t>Worst-case Time</w:t>
+            </w:r>
+          </w:p>
+        </w:tc>
+        <w:tc>
+          <w:tcPr>
+            <w:tcW w:w="0" w:type="auto"/>
+            <w:tcBorders>
+              <w:top w:val="single" w:sz="4" w:space="0" w:color="auto"/>
+              <w:left w:val="single" w:sz="4" w:space="0" w:color="auto"/>
+              <w:bottom w:val="single" w:sz="4" w:space="0" w:color="auto"/>
+              <w:right w:val="single" w:sz="4" w:space="0" w:color="auto"/>
+            </w:tcBorders>
+            <w:vAlign w:val="center"/>
+            <w:hideMark/>
+          </w:tcPr>
+          <w:p>
+            <w:pPr>
+              <w:spacing w:after="320" w:line="240" w:lineRule="auto"/>
+              <w:rPr>
+                <w:rFonts w:ascii="Times New Roman" w:eastAsia="Times New Roman" w:hAnsi="Times New Roman" w:cs="Times New Roman"/>
+                <w:sz w:val="24"/>
+                <w:szCs w:val="24"/>
+              </w:rPr>
+            </w:pPr>
+            <w:r>
+              <w:rPr>
+                <w:rFonts w:ascii="Times New Roman" w:eastAsia="Times New Roman" w:hAnsi="Times New Roman" w:cs="Times New Roman"/>
+                <w:sz w:val="24"/>
+                <w:szCs w:val="24"/>
+              </w:rPr>
+              <w:t>$O(n^2)$</w:t>
+            </w:r>
+          </w:p>
+        </w:tc>
+      </w:tr>
+      <w:tr>
+        <w:trPr>
+          <w:tblCellSpacing w:w="15" w:type="dxa"/>
+        </w:trPr>
+        <w:tc>
+          <w:tcPr>
+            <w:tcW w:w="0" w:type="auto"/>
+            <w:tcBorders>
+              <w:top w:val="single" w:sz="4" w:space="0" w:color="auto"/>
+              <w:left w:val="single" w:sz="4" w:space="0" w:color="auto"/>
+              <w:bottom w:val="single" w:sz="4" w:space="0" w:color="auto"/>
+              <w:right w:val="single" w:sz="4" w:space="0" w:color="auto"/>
+            </w:tcBorders>
+            <w:vAlign w:val="center"/>
+            <w:hideMark/>
+          </w:tcPr>
+          <w:p>
+            <w:pPr>
+              <w:spacing w:after="320" w:line="240" w:lineRule="auto"/>
+              <w:rPr>
+                <w:rFonts w:ascii="Times New Roman" w:eastAsia="Times New Roman" w:hAnsi="Times New Roman" w:cs="Times New Roman"/>
+                <w:sz w:val="24"/>
+                <w:szCs w:val="24"/>
+              </w:rPr>
+            </w:pPr>
+            <w:r>
+              <w:rPr>
+                <w:rFonts w:ascii="Times New Roman" w:eastAsia="Times New Roman" w:hAnsi="Times New Roman" w:cs="Times New Roman"/>
+                <w:b/>
+                <w:bCs/>
+                <w:sz w:val="24"/>
+                <w:szCs w:val="24"/>
+              </w:rPr>
+              <w:t>Average-case Time</w:t>
+            </w:r>
+          </w:p>
+        </w:tc>
+        <w:tc>
+          <w:tcPr>
+            <w:tcW w:w="0" w:type="auto"/>
+            <w:tcBorders>
+              <w:top w:val="single" w:sz="4" w:space="0" w:color="auto"/>
+              <w:left w:val="single" w:sz="4" w:space="0" w:color="auto"/>
+              <w:bottom w:val="single" w:sz="4" w:space="0" w:color="auto"/>
+              <w:right w:val="single" w:sz="4" w:space="0" w:color="auto"/>
+            </w:tcBorders>
+            <w:vAlign w:val="center"/>
+            <w:hideMark/>
+          </w:tcPr>
+          <w:p>
+            <w:pPr>
+              <w:spacing w:after="320" w:line="240" w:lineRule="auto"/>
+              <w:rPr>
+                <w:rFonts w:ascii="Times New Roman" w:eastAsia="Times New Roman" w:hAnsi="Times New Roman" w:cs="Times New Roman"/>
+                <w:sz w:val="24"/>
+                <w:szCs w:val="24"/>
+              </w:rPr>
+            </w:pPr>
+            <w:r>
+              <w:rPr>
+                <w:rFonts w:ascii="Times New Roman" w:eastAsia="Times New Roman" w:hAnsi="Times New Roman" w:cs="Times New Roman"/>
+                <w:sz w:val="24"/>
+                <w:szCs w:val="24"/>
+              </w:rPr>
+              <w:t>$O(n^2)$</w:t>
+            </w:r>
+          </w:p>
+        </w:tc>
+      </w:tr>
+      <w:tr>
+        <w:trPr>
+          <w:tblCellSpacing w:w="15" w:type="dxa"/>
+        </w:trPr>
+        <w:tc>
+          <w:tcPr>
+            <w:tcW w:w="0" w:type="auto"/>
+            <w:tcBorders>
+              <w:top w:val="single" w:sz="4" w:space="0" w:color="auto"/>
+              <w:left w:val="single" w:sz="4" w:space="0" w:color="auto"/>
+              <w:bottom w:val="single" w:sz="4" w:space="0" w:color="auto"/>
+              <w:right w:val="single" w:sz="4" w:space="0" w:color="auto"/>
+            </w:tcBorders>
+            <w:vAlign w:val="center"/>
+            <w:hideMark/>
+          </w:tcPr>
+          <w:p>
+            <w:pPr>
+              <w:spacing w:after="320" w:line="240" w:lineRule="auto"/>
+              <w:rPr>
+                <w:rFonts w:ascii="Times New Roman" w:eastAsia="Times New Roman" w:hAnsi="Times New Roman" w:cs="Times New Roman"/>
+                <w:sz w:val="24"/>
+                <w:szCs w:val="24"/>
+              </w:rPr>
+            </w:pPr>
+            <w:r>
+              <w:rPr>
+                <w:rFonts w:ascii="Times New Roman" w:eastAsia="Times New Roman" w:hAnsi="Times New Roman" w:cs="Times New Roman"/>
+                <w:b/>
+                <w:bCs/>
+                <w:sz w:val="24"/>
+                <w:szCs w:val="24"/>
+              </w:rPr>
+              <w:t>Best-case Time</w:t>
+            </w:r>
+          </w:p>
+        </w:tc>
+        <w:tc>
+          <w:tcPr>
+            <w:tcW w:w="0" w:type="auto"/>
+            <w:tcBorders>
+              <w:top w:val="single" w:sz="4" w:space="0" w:color="auto"/>
+              <w:left w:val="single" w:sz="4" w:space="0" w:color="auto"/>
+              <w:bottom w:val="single" w:sz="4" w:space="0" w:color="auto"/>
+              <w:right w:val="single" w:sz="4" w:space="0" w:color="auto"/>
+            </w:tcBorders>
+            <w:vAlign w:val="center"/>
+            <w:hideMark/>
+          </w:tcPr>
+          <w:p>
+            <w:pPr>
+              <w:spacing w:after="320" w:line="240" w:lineRule="auto"/>
+              <w:rPr>
+                <w:rFonts w:ascii="Times New Roman" w:eastAsia="Times New Roman" w:hAnsi="Times New Roman" w:cs="Times New Roman"/>
+                <w:sz w:val="24"/>
+                <w:szCs w:val="24"/>
+              </w:rPr>
+            </w:pPr>
+            <w:r>
+              <w:rPr>
+                <w:rFonts w:ascii="Times New Roman" w:eastAsia="Times New Roman" w:hAnsi="Times New Roman" w:cs="Times New Roman"/>
+                <w:sz w:val="24"/>
+                <w:szCs w:val="24"/>
+              </w:rPr>
+              <w:t>$O(n^2)$</w:t>
+            </w:r>
+          </w:p>
+        </w:tc>
+      </w:tr>
+      <w:tr>
+        <w:trPr>
+          <w:tblCellSpacing w:w="15" w:type="dxa"/>
+        </w:trPr>
+        <w:tc>
+          <w:tcPr>
+            <w:tcW w:w="0" w:type="auto"/>
+            <w:tcBorders>
+              <w:top w:val="single" w:sz="4" w:space="0" w:color="auto"/>
+              <w:left w:val="single" w:sz="4" w:space="0" w:color="auto"/>
+              <w:bottom w:val="single" w:sz="4" w:space="0" w:color="auto"/>
+              <w:right w:val="single" w:sz="4" w:space="0" w:color="auto"/>
+            </w:tcBorders>
+            <w:vAlign w:val="center"/>
+            <w:hideMark/>
+          </w:tcPr>
+          <w:p>
+            <w:pPr>
+              <w:spacing w:after="320" w:line="240" w:lineRule="auto"/>
+              <w:rPr>
+                <w:rFonts w:ascii="Times New Roman" w:eastAsia="Times New Roman" w:hAnsi="Times New Roman" w:cs="Times New Roman"/>
+                <w:sz w:val="24"/>
+                <w:szCs w:val="24"/>
+              </w:rPr>
+            </w:pPr>
+            <w:r>
+              <w:rPr>
+                <w:rFonts w:ascii="Times New Roman" w:eastAsia="Times New Roman" w:hAnsi="Times New Roman" w:cs="Times New Roman"/>
+                <w:b/>
+                <w:bCs/>
+                <w:sz w:val="24"/>
+                <w:szCs w:val="24"/>
+              </w:rPr>
+              <w:t>Space Complexity</w:t>
+            </w:r>
+          </w:p>
+        </w:tc>
+        <w:tc>
+          <w:tcPr>
+            <w:tcW w:w="0" w:type="auto"/>
+            <w:tcBorders>
+              <w:top w:val="single" w:sz="4" w:space="0" w:color="auto"/>
+              <w:left w:val="single" w:sz="4" w:space="0" w:color="auto"/>
+              <w:bottom w:val="single" w:sz="4" w:space="0" w:color="auto"/>
+              <w:right w:val="single" w:sz="4" w:space="0" w:color="auto"/>
+            </w:tcBorders>
+            <w:vAlign w:val="center"/>
+            <w:hideMark/>
+          </w:tcPr>
+          <w:p>
+            <w:pPr>
+              <w:spacing w:after="320" w:line="240" w:lineRule="auto"/>
+              <w:rPr>
+                <w:rFonts w:ascii="Times New Roman" w:eastAsia="Times New Roman" w:hAnsi="Times New Roman" w:cs="Times New Roman"/>
+                <w:sz w:val="24"/>
+                <w:szCs w:val="24"/>
+              </w:rPr>
+            </w:pPr>
+            <w:r>
+              <w:rPr>
+                <w:rFonts w:ascii="Times New Roman" w:eastAsia="Times New Roman" w:hAnsi="Times New Roman" w:cs="Times New Roman"/>
+                <w:sz w:val="24"/>
+                <w:szCs w:val="24"/>
+              </w:rPr>
+              <w:t>$O(1)$ (In-place)</w:t>
+            </w:r>
+          </w:p>
+        </w:tc>
+      </w:tr>
+      <w:tr>
+        <w:trPr>
+          <w:tblCellSpacing w:w="15" w:type="dxa"/>
+        </w:trPr>
+        <w:tc>
+          <w:tcPr>
+            <w:tcW w:w="0" w:type="auto"/>
+            <w:tcBorders>
+              <w:top w:val="single" w:sz="4" w:space="0" w:color="auto"/>
+              <w:left w:val="single" w:sz="4" w:space="0" w:color="auto"/>
+              <w:bottom w:val="single" w:sz="4" w:space="0" w:color="auto"/>
+              <w:right w:val="single" w:sz="4" w:space="0" w:color="auto"/>
+            </w:tcBorders>
+            <w:vAlign w:val="center"/>
+            <w:hideMark/>
+          </w:tcPr>
+          <w:p>
+            <w:pPr>
+              <w:spacing w:after="320" w:line="240" w:lineRule="auto"/>
+              <w:rPr>
+                <w:rFonts w:ascii="Times New Roman" w:eastAsia="Times New Roman" w:hAnsi="Times New Roman" w:cs="Times New Roman"/>
+                <w:sz w:val="24"/>
+                <w:szCs w:val="24"/>
+              </w:rPr>
+            </w:pPr>
+            <w:r>
+              <w:rPr>
+                <w:rFonts w:ascii="Times New Roman" w:eastAsia="Times New Roman" w:hAnsi="Times New Roman" w:cs="Times New Roman"/>
+                <w:b/>
+                <w:bCs/>
+                <w:sz w:val="24"/>
+                <w:szCs w:val="24"/>
+              </w:rPr>
+              <w:lastRenderedPageBreak/>
+              <w:t>Stability</w:t>
+            </w:r>
+          </w:p>
+        </w:tc>
+        <w:tc>
+          <w:tcPr>
+            <w:tcW w:w="0" w:type="auto"/>
+            <w:tcBorders>
+              <w:top w:val="single" w:sz="4" w:space="0" w:color="auto"/>
+              <w:left w:val="single" w:sz="4" w:space="0" w:color="auto"/>
+              <w:bottom w:val="single" w:sz="4" w:space="0" w:color="auto"/>
+              <w:right w:val="single" w:sz="4" w:space="0" w:color="auto"/>
+            </w:tcBorders>
+            <w:vAlign w:val="center"/>
+            <w:hideMark/>
+          </w:tcPr>
+          <w:p>
+            <w:pPr>
+              <w:spacing w:after="320" w:line="240" w:lineRule="auto"/>
+              <w:rPr>
+                <w:rFonts w:ascii="Times New Roman" w:eastAsia="Times New Roman" w:hAnsi="Times New Roman" w:cs="Times New Roman"/>
+                <w:sz w:val="24"/>
+                <w:szCs w:val="24"/>
+              </w:rPr>
+            </w:pPr>
+            <w:r>
+              <w:rPr>
+                <w:rFonts w:ascii="Times New Roman" w:eastAsia="Times New Roman" w:hAnsi="Times New Roman" w:cs="Times New Roman"/>
+                <w:sz w:val="24"/>
+                <w:szCs w:val="24"/>
+              </w:rPr>
+              <w:t xml:space="preserve">Generally </w:t>
+            </w:r>
+            <w:r>
+              <w:rPr>
+                <w:rFonts w:ascii="Times New Roman" w:eastAsia="Times New Roman" w:hAnsi="Times New Roman" w:cs="Times New Roman"/>
+                <w:b/>
+                <w:bCs/>
+                <w:sz w:val="24"/>
+                <w:szCs w:val="24"/>
+              </w:rPr>
+              <w:t>Unstable</w:t>
+            </w:r>
+            <w:r>
+              <w:rPr>
+                <w:rFonts w:ascii="Times New Roman" w:eastAsia="Times New Roman" w:hAnsi="Times New Roman" w:cs="Times New Roman"/>
+                <w:sz w:val="24"/>
+                <w:szCs w:val="24"/>
+              </w:rPr>
+              <w:t xml:space="preserve"> (swaps can flip the relative order of equal items)</w:t>
+            </w:r>
+          </w:p>
+        </w:tc>
+      </w:tr>
+    </w:tbl>
+    <w:p>
+      <w:pPr>
+        <w:jc w:val="center"/>
+        <w:rPr>
+          <w:b/>
           <w:sz w:val="36"/>
           <w:szCs w:val="36"/>
         </w:rPr>
@@ -1272,11 +2496,279 @@
       </w:rPr>
     </w:lvl>
   </w:abstractNum>
+  <w:abstractNum w:abstractNumId="2">
+    <w:nsid w:val="3C973128"/>
+    <w:multiLevelType w:val="multilevel"/>
+    <w:tmpl w:val="277C0526"/>
+    <w:lvl w:ilvl="0">
+      <w:start w:val="1"/>
+      <w:numFmt w:val="decimal"/>
+      <w:lvlText w:val="%1."/>
+      <w:lvlJc w:val="left"/>
+      <w:pPr>
+        <w:tabs>
+          <w:tab w:val="num" w:pos="720"/>
+        </w:tabs>
+        <w:ind w:left="720" w:hanging="360"/>
+      </w:pPr>
+    </w:lvl>
+    <w:lvl w:ilvl="1" w:tentative="1">
+      <w:start w:val="1"/>
+      <w:numFmt w:val="decimal"/>
+      <w:lvlText w:val="%2."/>
+      <w:lvlJc w:val="left"/>
+      <w:pPr>
+        <w:tabs>
+          <w:tab w:val="num" w:pos="1440"/>
+        </w:tabs>
+        <w:ind w:left="1440" w:hanging="360"/>
+      </w:pPr>
+    </w:lvl>
+    <w:lvl w:ilvl="2" w:tentative="1">
+      <w:start w:val="1"/>
+      <w:numFmt w:val="decimal"/>
+      <w:lvlText w:val="%3."/>
+      <w:lvlJc w:val="left"/>
+      <w:pPr>
+        <w:tabs>
+          <w:tab w:val="num" w:pos="2160"/>
+        </w:tabs>
+        <w:ind w:left="2160" w:hanging="360"/>
+      </w:pPr>
+    </w:lvl>
+    <w:lvl w:ilvl="3" w:tentative="1">
+      <w:start w:val="1"/>
+      <w:numFmt w:val="decimal"/>
+      <w:lvlText w:val="%4."/>
+      <w:lvlJc w:val="left"/>
+      <w:pPr>
+        <w:tabs>
+          <w:tab w:val="num" w:pos="2880"/>
+        </w:tabs>
+        <w:ind w:left="2880" w:hanging="360"/>
+      </w:pPr>
+    </w:lvl>
+    <w:lvl w:ilvl="4" w:tentative="1">
+      <w:start w:val="1"/>
+      <w:numFmt w:val="decimal"/>
+      <w:lvlText w:val="%5."/>
+      <w:lvlJc w:val="left"/>
+      <w:pPr>
+        <w:tabs>
+          <w:tab w:val="num" w:pos="3600"/>
+        </w:tabs>
+        <w:ind w:left="3600" w:hanging="360"/>
+      </w:pPr>
+    </w:lvl>
+    <w:lvl w:ilvl="5" w:tentative="1">
+      <w:start w:val="1"/>
+      <w:numFmt w:val="decimal"/>
+      <w:lvlText w:val="%6."/>
+      <w:lvlJc w:val="left"/>
+      <w:pPr>
+        <w:tabs>
+          <w:tab w:val="num" w:pos="4320"/>
+        </w:tabs>
+        <w:ind w:left="4320" w:hanging="360"/>
+      </w:pPr>
+    </w:lvl>
+    <w:lvl w:ilvl="6" w:tentative="1">
+      <w:start w:val="1"/>
+      <w:numFmt w:val="decimal"/>
+      <w:lvlText w:val="%7."/>
+      <w:lvlJc w:val="left"/>
+      <w:pPr>
+        <w:tabs>
+          <w:tab w:val="num" w:pos="5040"/>
+        </w:tabs>
+        <w:ind w:left="5040" w:hanging="360"/>
+      </w:pPr>
+    </w:lvl>
+    <w:lvl w:ilvl="7" w:tentative="1">
+      <w:start w:val="1"/>
+      <w:numFmt w:val="decimal"/>
+      <w:lvlText w:val="%8."/>
+      <w:lvlJc w:val="left"/>
+      <w:pPr>
+        <w:tabs>
+          <w:tab w:val="num" w:pos="5760"/>
+        </w:tabs>
+        <w:ind w:left="5760" w:hanging="360"/>
+      </w:pPr>
+    </w:lvl>
+    <w:lvl w:ilvl="8" w:tentative="1">
+      <w:start w:val="1"/>
+      <w:numFmt w:val="decimal"/>
+      <w:lvlText w:val="%9."/>
+      <w:lvlJc w:val="left"/>
+      <w:pPr>
+        <w:tabs>
+          <w:tab w:val="num" w:pos="6480"/>
+        </w:tabs>
+        <w:ind w:left="6480" w:hanging="360"/>
+      </w:pPr>
+    </w:lvl>
+  </w:abstractNum>
+  <w:abstractNum w:abstractNumId="3">
+    <w:nsid w:val="67B67538"/>
+    <w:multiLevelType w:val="multilevel"/>
+    <w:tmpl w:val="6FD26896"/>
+    <w:lvl w:ilvl="0">
+      <w:start w:val="1"/>
+      <w:numFmt w:val="bullet"/>
+      <w:lvlText w:val=""/>
+      <w:lvlJc w:val="left"/>
+      <w:pPr>
+        <w:tabs>
+          <w:tab w:val="num" w:pos="720"/>
+        </w:tabs>
+        <w:ind w:left="720" w:hanging="360"/>
+      </w:pPr>
+      <w:rPr>
+        <w:rFonts w:ascii="Symbol" w:hAnsi="Symbol" w:hint="default"/>
+        <w:sz w:val="20"/>
+      </w:rPr>
+    </w:lvl>
+    <w:lvl w:ilvl="1">
+      <w:start w:val="1"/>
+      <w:numFmt w:val="bullet"/>
+      <w:lvlText w:val="o"/>
+      <w:lvlJc w:val="left"/>
+      <w:pPr>
+        <w:tabs>
+          <w:tab w:val="num" w:pos="1440"/>
+        </w:tabs>
+        <w:ind w:left="1440" w:hanging="360"/>
+      </w:pPr>
+      <w:rPr>
+        <w:rFonts w:ascii="Courier New" w:hAnsi="Courier New" w:hint="default"/>
+        <w:sz w:val="20"/>
+      </w:rPr>
+    </w:lvl>
+    <w:lvl w:ilvl="2" w:tentative="1">
+      <w:start w:val="1"/>
+      <w:numFmt w:val="bullet"/>
+      <w:lvlText w:val=""/>
+      <w:lvlJc w:val="left"/>
+      <w:pPr>
+        <w:tabs>
+          <w:tab w:val="num" w:pos="2160"/>
+        </w:tabs>
+        <w:ind w:left="2160" w:hanging="360"/>
+      </w:pPr>
+      <w:rPr>
+        <w:rFonts w:ascii="Wingdings" w:hAnsi="Wingdings" w:hint="default"/>
+        <w:sz w:val="20"/>
+      </w:rPr>
+    </w:lvl>
+    <w:lvl w:ilvl="3" w:tentative="1">
+      <w:start w:val="1"/>
+      <w:numFmt w:val="bullet"/>
+      <w:lvlText w:val=""/>
+      <w:lvlJc w:val="left"/>
+      <w:pPr>
+        <w:tabs>
+          <w:tab w:val="num" w:pos="2880"/>
+        </w:tabs>
+        <w:ind w:left="2880" w:hanging="360"/>
+      </w:pPr>
+      <w:rPr>
+        <w:rFonts w:ascii="Wingdings" w:hAnsi="Wingdings" w:hint="default"/>
+        <w:sz w:val="20"/>
+      </w:rPr>
+    </w:lvl>
+    <w:lvl w:ilvl="4" w:tentative="1">
+      <w:start w:val="1"/>
+      <w:numFmt w:val="bullet"/>
+      <w:lvlText w:val=""/>
+      <w:lvlJc w:val="left"/>
+      <w:pPr>
+        <w:tabs>
+          <w:tab w:val="num" w:pos="3600"/>
+        </w:tabs>
+        <w:ind w:left="3600" w:hanging="360"/>
+      </w:pPr>
+      <w:rPr>
+        <w:rFonts w:ascii="Wingdings" w:hAnsi="Wingdings" w:hint="default"/>
+        <w:sz w:val="20"/>
+      </w:rPr>
+    </w:lvl>
+    <w:lvl w:ilvl="5" w:tentative="1">
+      <w:start w:val="1"/>
+      <w:numFmt w:val="bullet"/>
+      <w:lvlText w:val=""/>
+      <w:lvlJc w:val="left"/>
+      <w:pPr>
+        <w:tabs>
+          <w:tab w:val="num" w:pos="4320"/>
+        </w:tabs>
+        <w:ind w:left="4320" w:hanging="360"/>
+      </w:pPr>
+      <w:rPr>
+        <w:rFonts w:ascii="Wingdings" w:hAnsi="Wingdings" w:hint="default"/>
+        <w:sz w:val="20"/>
+      </w:rPr>
+    </w:lvl>
+    <w:lvl w:ilvl="6" w:tentative="1">
+      <w:start w:val="1"/>
+      <w:numFmt w:val="bullet"/>
+      <w:lvlText w:val=""/>
+      <w:lvlJc w:val="left"/>
+      <w:pPr>
+        <w:tabs>
+          <w:tab w:val="num" w:pos="5040"/>
+        </w:tabs>
+        <w:ind w:left="5040" w:hanging="360"/>
+      </w:pPr>
+      <w:rPr>
+        <w:rFonts w:ascii="Wingdings" w:hAnsi="Wingdings" w:hint="default"/>
+        <w:sz w:val="20"/>
+      </w:rPr>
+    </w:lvl>
+    <w:lvl w:ilvl="7" w:tentative="1">
+      <w:start w:val="1"/>
+      <w:numFmt w:val="bullet"/>
+      <w:lvlText w:val=""/>
+      <w:lvlJc w:val="left"/>
+      <w:pPr>
+        <w:tabs>
+          <w:tab w:val="num" w:pos="5760"/>
+        </w:tabs>
+        <w:ind w:left="5760" w:hanging="360"/>
+      </w:pPr>
+      <w:rPr>
+        <w:rFonts w:ascii="Wingdings" w:hAnsi="Wingdings" w:hint="default"/>
+        <w:sz w:val="20"/>
+      </w:rPr>
+    </w:lvl>
+    <w:lvl w:ilvl="8" w:tentative="1">
+      <w:start w:val="1"/>
+      <w:numFmt w:val="bullet"/>
+      <w:lvlText w:val=""/>
+      <w:lvlJc w:val="left"/>
+      <w:pPr>
+        <w:tabs>
+          <w:tab w:val="num" w:pos="6480"/>
+        </w:tabs>
+        <w:ind w:left="6480" w:hanging="360"/>
+      </w:pPr>
+      <w:rPr>
+        <w:rFonts w:ascii="Wingdings" w:hAnsi="Wingdings" w:hint="default"/>
+        <w:sz w:val="20"/>
+      </w:rPr>
+    </w:lvl>
+  </w:abstractNum>
   <w:num w:numId="1">
     <w:abstractNumId w:val="0"/>
   </w:num>
   <w:num w:numId="2">
     <w:abstractNumId w:val="1"/>
+  </w:num>
+  <w:num w:numId="3">
+    <w:abstractNumId w:val="2"/>
+  </w:num>
+  <w:num w:numId="4">
+    <w:abstractNumId w:val="3"/>
   </w:num>
 </w:numbering>
 </file>
@@ -1440,6 +2932,7 @@
   <w:style w:type="paragraph" w:default="1" w:styleId="Normal">
     <w:name w:val="Normal"/>
     <w:qFormat/>
+    <w:rsid w:val="00637954"/>
   </w:style>
   <w:style w:type="paragraph" w:styleId="Heading3">
     <w:name w:val="heading 3"/>

</xml_diff>

<commit_message>
Adding Insertion sort Algo
</commit_message>
<xml_diff>
--- a/Sorting Algorithms/Sortings.docx
+++ b/Sorting Algorithms/Sortings.docx
@@ -2222,6 +2222,1184 @@
         </w:rPr>
       </w:pPr>
     </w:p>
+    <w:p>
+      <w:pPr>
+        <w:jc w:val="center"/>
+        <w:rPr>
+          <w:b/>
+          <w:sz w:val="36"/>
+          <w:szCs w:val="36"/>
+        </w:rPr>
+      </w:pPr>
+      <w:r>
+        <w:rPr>
+          <w:b/>
+          <w:sz w:val="36"/>
+          <w:szCs w:val="36"/>
+        </w:rPr>
+        <w:t>Insertion Sort</w:t>
+      </w:r>
+    </w:p>
+    <w:p>
+      <w:pPr>
+        <w:spacing w:before="100" w:beforeAutospacing="1" w:after="100" w:afterAutospacing="1" w:line="240" w:lineRule="auto"/>
+        <w:rPr>
+          <w:rFonts w:ascii="Times New Roman" w:eastAsia="Times New Roman" w:hAnsi="Times New Roman" w:cs="Times New Roman"/>
+          <w:sz w:val="24"/>
+          <w:szCs w:val="24"/>
+        </w:rPr>
+      </w:pPr>
+      <w:r>
+        <w:rPr>
+          <w:rFonts w:ascii="Times New Roman" w:eastAsia="Times New Roman" w:hAnsi="Times New Roman" w:cs="Times New Roman"/>
+          <w:b/>
+          <w:bCs/>
+          <w:sz w:val="24"/>
+          <w:szCs w:val="24"/>
+        </w:rPr>
+        <w:t>Insertion Sort</w:t>
+      </w:r>
+      <w:r>
+        <w:rPr>
+          <w:rFonts w:ascii="Times New Roman" w:eastAsia="Times New Roman" w:hAnsi="Times New Roman" w:cs="Times New Roman"/>
+          <w:sz w:val="24"/>
+          <w:szCs w:val="24"/>
+        </w:rPr>
+        <w:t xml:space="preserve"> is</w:t>
+      </w:r>
+      <w:r>
+        <w:rPr>
+          <w:rFonts w:ascii="Times New Roman" w:eastAsia="Times New Roman" w:hAnsi="Times New Roman" w:cs="Times New Roman"/>
+          <w:sz w:val="24"/>
+          <w:szCs w:val="24"/>
+        </w:rPr>
+        <w:t xml:space="preserve"> like </w:t>
+      </w:r>
+      <w:r>
+        <w:rPr>
+          <w:rFonts w:ascii="Times New Roman" w:eastAsia="Times New Roman" w:hAnsi="Times New Roman" w:cs="Times New Roman"/>
+          <w:sz w:val="24"/>
+          <w:szCs w:val="24"/>
+        </w:rPr>
+        <w:t xml:space="preserve"> the </w:t>
+      </w:r>
+      <w:r>
+        <w:rPr>
+          <w:rFonts w:ascii="Times New Roman" w:eastAsia="Times New Roman" w:hAnsi="Times New Roman" w:cs="Times New Roman"/>
+          <w:b/>
+          <w:bCs/>
+          <w:sz w:val="24"/>
+          <w:szCs w:val="24"/>
+        </w:rPr>
+        <w:t>"card player."</w:t>
+      </w:r>
+    </w:p>
+    <w:p>
+      <w:pPr>
+        <w:spacing w:before="100" w:beforeAutospacing="1" w:after="100" w:afterAutospacing="1" w:line="240" w:lineRule="auto"/>
+        <w:rPr>
+          <w:rFonts w:ascii="Times New Roman" w:eastAsia="Times New Roman" w:hAnsi="Times New Roman" w:cs="Times New Roman"/>
+          <w:sz w:val="24"/>
+          <w:szCs w:val="24"/>
+        </w:rPr>
+      </w:pPr>
+      <w:r>
+        <w:rPr>
+          <w:rFonts w:ascii="Times New Roman" w:eastAsia="Times New Roman" w:hAnsi="Times New Roman" w:cs="Times New Roman"/>
+          <w:sz w:val="24"/>
+          <w:szCs w:val="24"/>
+        </w:rPr>
+        <w:t>Imagine you are playing a card game. You pick up cards one by one from a pile and slide them into the correct position in your hand, shifting the other cards over to make room. That is exactly how Insertion Sort works.</w:t>
+      </w:r>
+    </w:p>
+    <w:p>
+      <w:pPr>
+        <w:spacing w:before="100" w:beforeAutospacing="1" w:after="100" w:afterAutospacing="1" w:line="240" w:lineRule="auto"/>
+        <w:outlineLvl w:val="2"/>
+        <w:rPr>
+          <w:rFonts w:ascii="Times New Roman" w:eastAsia="Times New Roman" w:hAnsi="Times New Roman" w:cs="Times New Roman"/>
+          <w:b/>
+          <w:bCs/>
+          <w:sz w:val="27"/>
+          <w:szCs w:val="27"/>
+        </w:rPr>
+      </w:pPr>
+      <w:r>
+        <w:rPr>
+          <w:rFonts w:ascii="Times New Roman" w:eastAsia="Times New Roman" w:hAnsi="Times New Roman" w:cs="Times New Roman"/>
+          <w:b/>
+          <w:bCs/>
+          <w:sz w:val="27"/>
+          <w:szCs w:val="27"/>
+        </w:rPr>
+        <w:t>How It Works (The Logic)</w:t>
+      </w:r>
+    </w:p>
+    <w:p>
+      <w:pPr>
+        <w:spacing w:before="100" w:beforeAutospacing="1" w:after="100" w:afterAutospacing="1" w:line="240" w:lineRule="auto"/>
+        <w:rPr>
+          <w:rFonts w:ascii="Times New Roman" w:eastAsia="Times New Roman" w:hAnsi="Times New Roman" w:cs="Times New Roman"/>
+          <w:sz w:val="24"/>
+          <w:szCs w:val="24"/>
+        </w:rPr>
+      </w:pPr>
+      <w:r>
+        <w:rPr>
+          <w:rFonts w:ascii="Times New Roman" w:eastAsia="Times New Roman" w:hAnsi="Times New Roman" w:cs="Times New Roman"/>
+          <w:sz w:val="24"/>
+          <w:szCs w:val="24"/>
+        </w:rPr>
+        <w:t>Insertion Sort builds the final sorted array one item at a time. It is much more efficient than Bubble or Selection sort for small datasets or lists that are already "mostly sorted."</w:t>
+      </w:r>
+    </w:p>
+    <w:p>
+      <w:pPr>
+        <w:numPr>
+          <w:ilvl w:val="0"/>
+          <w:numId w:val="5"/>
+        </w:numPr>
+        <w:spacing w:before="100" w:beforeAutospacing="1" w:after="100" w:afterAutospacing="1" w:line="240" w:lineRule="auto"/>
+        <w:rPr>
+          <w:rFonts w:ascii="Times New Roman" w:eastAsia="Times New Roman" w:hAnsi="Times New Roman" w:cs="Times New Roman"/>
+          <w:sz w:val="24"/>
+          <w:szCs w:val="24"/>
+        </w:rPr>
+      </w:pPr>
+      <w:r>
+        <w:rPr>
+          <w:rFonts w:ascii="Times New Roman" w:eastAsia="Times New Roman" w:hAnsi="Times New Roman" w:cs="Times New Roman"/>
+          <w:sz w:val="24"/>
+          <w:szCs w:val="24"/>
+        </w:rPr>
+        <w:t>Assume the first element is already sorted.</w:t>
+      </w:r>
+    </w:p>
+    <w:p>
+      <w:pPr>
+        <w:numPr>
+          <w:ilvl w:val="0"/>
+          <w:numId w:val="5"/>
+        </w:numPr>
+        <w:spacing w:before="100" w:beforeAutospacing="1" w:after="100" w:afterAutospacing="1" w:line="240" w:lineRule="auto"/>
+        <w:rPr>
+          <w:rFonts w:ascii="Times New Roman" w:eastAsia="Times New Roman" w:hAnsi="Times New Roman" w:cs="Times New Roman"/>
+          <w:sz w:val="24"/>
+          <w:szCs w:val="24"/>
+        </w:rPr>
+      </w:pPr>
+      <w:r>
+        <w:rPr>
+          <w:rFonts w:ascii="Times New Roman" w:eastAsia="Times New Roman" w:hAnsi="Times New Roman" w:cs="Times New Roman"/>
+          <w:sz w:val="24"/>
+          <w:szCs w:val="24"/>
+        </w:rPr>
+        <w:t xml:space="preserve">Pick the next element (the </w:t>
+      </w:r>
+      <w:r>
+        <w:rPr>
+          <w:rFonts w:ascii="Times New Roman" w:eastAsia="Times New Roman" w:hAnsi="Times New Roman" w:cs="Times New Roman"/>
+          <w:b/>
+          <w:bCs/>
+          <w:sz w:val="24"/>
+          <w:szCs w:val="24"/>
+        </w:rPr>
+        <w:t>key</w:t>
+      </w:r>
+      <w:r>
+        <w:rPr>
+          <w:rFonts w:ascii="Times New Roman" w:eastAsia="Times New Roman" w:hAnsi="Times New Roman" w:cs="Times New Roman"/>
+          <w:sz w:val="24"/>
+          <w:szCs w:val="24"/>
+        </w:rPr>
+        <w:t>).</w:t>
+      </w:r>
+    </w:p>
+    <w:p>
+      <w:pPr>
+        <w:numPr>
+          <w:ilvl w:val="0"/>
+          <w:numId w:val="5"/>
+        </w:numPr>
+        <w:spacing w:before="100" w:beforeAutospacing="1" w:after="100" w:afterAutospacing="1" w:line="240" w:lineRule="auto"/>
+        <w:rPr>
+          <w:rFonts w:ascii="Times New Roman" w:eastAsia="Times New Roman" w:hAnsi="Times New Roman" w:cs="Times New Roman"/>
+          <w:sz w:val="24"/>
+          <w:szCs w:val="24"/>
+        </w:rPr>
+      </w:pPr>
+      <w:r>
+        <w:rPr>
+          <w:rFonts w:ascii="Times New Roman" w:eastAsia="Times New Roman" w:hAnsi="Times New Roman" w:cs="Times New Roman"/>
+          <w:sz w:val="24"/>
+          <w:szCs w:val="24"/>
+        </w:rPr>
+        <w:t>Compare the key with the elements to its left (the sorted part).</w:t>
+      </w:r>
+    </w:p>
+    <w:p>
+      <w:pPr>
+        <w:numPr>
+          <w:ilvl w:val="0"/>
+          <w:numId w:val="5"/>
+        </w:numPr>
+        <w:spacing w:before="100" w:beforeAutospacing="1" w:after="100" w:afterAutospacing="1" w:line="240" w:lineRule="auto"/>
+        <w:rPr>
+          <w:rFonts w:ascii="Times New Roman" w:eastAsia="Times New Roman" w:hAnsi="Times New Roman" w:cs="Times New Roman"/>
+          <w:sz w:val="24"/>
+          <w:szCs w:val="24"/>
+        </w:rPr>
+      </w:pPr>
+      <w:r>
+        <w:rPr>
+          <w:rFonts w:ascii="Times New Roman" w:eastAsia="Times New Roman" w:hAnsi="Times New Roman" w:cs="Times New Roman"/>
+          <w:b/>
+          <w:bCs/>
+          <w:sz w:val="24"/>
+          <w:szCs w:val="24"/>
+        </w:rPr>
+        <w:t>Shift</w:t>
+      </w:r>
+      <w:r>
+        <w:rPr>
+          <w:rFonts w:ascii="Times New Roman" w:eastAsia="Times New Roman" w:hAnsi="Times New Roman" w:cs="Times New Roman"/>
+          <w:sz w:val="24"/>
+          <w:szCs w:val="24"/>
+        </w:rPr>
+        <w:t xml:space="preserve"> the sorted elements to the right if they are greater than the key.</w:t>
+      </w:r>
+    </w:p>
+    <w:p>
+      <w:pPr>
+        <w:numPr>
+          <w:ilvl w:val="0"/>
+          <w:numId w:val="5"/>
+        </w:numPr>
+        <w:spacing w:before="100" w:beforeAutospacing="1" w:after="100" w:afterAutospacing="1" w:line="240" w:lineRule="auto"/>
+        <w:rPr>
+          <w:rFonts w:ascii="Times New Roman" w:eastAsia="Times New Roman" w:hAnsi="Times New Roman" w:cs="Times New Roman"/>
+          <w:sz w:val="24"/>
+          <w:szCs w:val="24"/>
+        </w:rPr>
+      </w:pPr>
+      <w:r>
+        <w:rPr>
+          <w:rFonts w:ascii="Times New Roman" w:eastAsia="Times New Roman" w:hAnsi="Times New Roman" w:cs="Times New Roman"/>
+          <w:b/>
+          <w:bCs/>
+          <w:sz w:val="24"/>
+          <w:szCs w:val="24"/>
+        </w:rPr>
+        <w:t>Insert</w:t>
+      </w:r>
+      <w:r>
+        <w:rPr>
+          <w:rFonts w:ascii="Times New Roman" w:eastAsia="Times New Roman" w:hAnsi="Times New Roman" w:cs="Times New Roman"/>
+          <w:sz w:val="24"/>
+          <w:szCs w:val="24"/>
+        </w:rPr>
+        <w:t xml:space="preserve"> the key into its correct position.</w:t>
+      </w:r>
+    </w:p>
+    <w:p>
+      <w:pPr>
+        <w:numPr>
+          <w:ilvl w:val="0"/>
+          <w:numId w:val="5"/>
+        </w:numPr>
+        <w:spacing w:before="100" w:beforeAutospacing="1" w:after="100" w:afterAutospacing="1" w:line="240" w:lineRule="auto"/>
+        <w:rPr>
+          <w:rFonts w:ascii="Times New Roman" w:eastAsia="Times New Roman" w:hAnsi="Times New Roman" w:cs="Times New Roman"/>
+          <w:sz w:val="24"/>
+          <w:szCs w:val="24"/>
+        </w:rPr>
+      </w:pPr>
+      <w:r>
+        <w:rPr>
+          <w:rFonts w:ascii="Times New Roman" w:eastAsia="Times New Roman" w:hAnsi="Times New Roman" w:cs="Times New Roman"/>
+          <w:sz w:val="24"/>
+          <w:szCs w:val="24"/>
+        </w:rPr>
+        <w:t>Repeat for all elements.</w:t>
+      </w:r>
+    </w:p>
+    <w:p>
+      <w:pPr>
+        <w:spacing w:before="100" w:beforeAutospacing="1" w:after="100" w:afterAutospacing="1" w:line="240" w:lineRule="auto"/>
+        <w:rPr>
+          <w:rFonts w:ascii="Times New Roman" w:eastAsia="Times New Roman" w:hAnsi="Times New Roman" w:cs="Times New Roman"/>
+          <w:sz w:val="24"/>
+          <w:szCs w:val="24"/>
+        </w:rPr>
+      </w:pPr>
+      <w:r>
+        <w:rPr>
+          <w:rFonts w:ascii="Times New Roman" w:eastAsia="Times New Roman" w:hAnsi="Times New Roman" w:cs="Times New Roman"/>
+          <w:b/>
+          <w:bCs/>
+          <w:sz w:val="24"/>
+          <w:szCs w:val="24"/>
+        </w:rPr>
+        <w:t>Example Walkthrough:</w:t>
+      </w:r>
+      <w:r>
+        <w:rPr>
+          <w:rFonts w:ascii="Times New Roman" w:eastAsia="Times New Roman" w:hAnsi="Times New Roman" w:cs="Times New Roman"/>
+          <w:sz w:val="24"/>
+          <w:szCs w:val="24"/>
+        </w:rPr>
+        <w:t xml:space="preserve"> </w:t>
+      </w:r>
+      <w:r>
+        <w:rPr>
+          <w:rFonts w:ascii="Courier New" w:eastAsia="Times New Roman" w:hAnsi="Courier New" w:cs="Courier New"/>
+          <w:sz w:val="20"/>
+        </w:rPr>
+        <w:t>[12, 11, 13, 5]</w:t>
+      </w:r>
+    </w:p>
+    <w:p>
+      <w:pPr>
+        <w:numPr>
+          <w:ilvl w:val="0"/>
+          <w:numId w:val="6"/>
+        </w:numPr>
+        <w:spacing w:before="100" w:beforeAutospacing="1" w:after="100" w:afterAutospacing="1" w:line="240" w:lineRule="auto"/>
+        <w:rPr>
+          <w:rFonts w:ascii="Times New Roman" w:eastAsia="Times New Roman" w:hAnsi="Times New Roman" w:cs="Times New Roman"/>
+          <w:sz w:val="24"/>
+          <w:szCs w:val="24"/>
+        </w:rPr>
+      </w:pPr>
+      <w:r>
+        <w:rPr>
+          <w:rFonts w:ascii="Times New Roman" w:eastAsia="Times New Roman" w:hAnsi="Times New Roman" w:cs="Times New Roman"/>
+          <w:b/>
+          <w:bCs/>
+          <w:sz w:val="24"/>
+          <w:szCs w:val="24"/>
+        </w:rPr>
+        <w:t>Step 1:</w:t>
+      </w:r>
+      <w:r>
+        <w:rPr>
+          <w:rFonts w:ascii="Times New Roman" w:eastAsia="Times New Roman" w:hAnsi="Times New Roman" w:cs="Times New Roman"/>
+          <w:sz w:val="24"/>
+          <w:szCs w:val="24"/>
+        </w:rPr>
+        <w:t xml:space="preserve"> </w:t>
+      </w:r>
+      <w:r>
+        <w:rPr>
+          <w:rFonts w:ascii="Courier New" w:eastAsia="Times New Roman" w:hAnsi="Courier New" w:cs="Courier New"/>
+          <w:sz w:val="20"/>
+        </w:rPr>
+        <w:t>11</w:t>
+      </w:r>
+      <w:r>
+        <w:rPr>
+          <w:rFonts w:ascii="Times New Roman" w:eastAsia="Times New Roman" w:hAnsi="Times New Roman" w:cs="Times New Roman"/>
+          <w:sz w:val="24"/>
+          <w:szCs w:val="24"/>
+        </w:rPr>
+        <w:t xml:space="preserve"> is our key. Is $11 &lt; 12$? Yes. Move 12 right $\</w:t>
+      </w:r>
+      <w:proofErr w:type="spellStart"/>
+      <w:r>
+        <w:rPr>
+          <w:rFonts w:ascii="Times New Roman" w:eastAsia="Times New Roman" w:hAnsi="Times New Roman" w:cs="Times New Roman"/>
+          <w:sz w:val="24"/>
+          <w:szCs w:val="24"/>
+        </w:rPr>
+        <w:t>rightarrow</w:t>
+      </w:r>
+      <w:proofErr w:type="spellEnd"/>
+      <w:r>
+        <w:rPr>
+          <w:rFonts w:ascii="Times New Roman" w:eastAsia="Times New Roman" w:hAnsi="Times New Roman" w:cs="Times New Roman"/>
+          <w:sz w:val="24"/>
+          <w:szCs w:val="24"/>
+        </w:rPr>
+        <w:t xml:space="preserve">$ </w:t>
+      </w:r>
+      <w:r>
+        <w:rPr>
+          <w:rFonts w:ascii="Courier New" w:eastAsia="Times New Roman" w:hAnsi="Courier New" w:cs="Courier New"/>
+          <w:sz w:val="20"/>
+        </w:rPr>
+        <w:t>[11, 12, 13, 5]</w:t>
+      </w:r>
+      <w:r>
+        <w:rPr>
+          <w:rFonts w:ascii="Times New Roman" w:eastAsia="Times New Roman" w:hAnsi="Times New Roman" w:cs="Times New Roman"/>
+          <w:sz w:val="24"/>
+          <w:szCs w:val="24"/>
+        </w:rPr>
+        <w:t>.</w:t>
+      </w:r>
+    </w:p>
+    <w:p>
+      <w:pPr>
+        <w:numPr>
+          <w:ilvl w:val="0"/>
+          <w:numId w:val="6"/>
+        </w:numPr>
+        <w:spacing w:before="100" w:beforeAutospacing="1" w:after="100" w:afterAutospacing="1" w:line="240" w:lineRule="auto"/>
+        <w:rPr>
+          <w:rFonts w:ascii="Times New Roman" w:eastAsia="Times New Roman" w:hAnsi="Times New Roman" w:cs="Times New Roman"/>
+          <w:sz w:val="24"/>
+          <w:szCs w:val="24"/>
+        </w:rPr>
+      </w:pPr>
+      <w:r>
+        <w:rPr>
+          <w:rFonts w:ascii="Times New Roman" w:eastAsia="Times New Roman" w:hAnsi="Times New Roman" w:cs="Times New Roman"/>
+          <w:b/>
+          <w:bCs/>
+          <w:sz w:val="24"/>
+          <w:szCs w:val="24"/>
+        </w:rPr>
+        <w:t>Step 2:</w:t>
+      </w:r>
+      <w:r>
+        <w:rPr>
+          <w:rFonts w:ascii="Times New Roman" w:eastAsia="Times New Roman" w:hAnsi="Times New Roman" w:cs="Times New Roman"/>
+          <w:sz w:val="24"/>
+          <w:szCs w:val="24"/>
+        </w:rPr>
+        <w:t xml:space="preserve"> </w:t>
+      </w:r>
+      <w:r>
+        <w:rPr>
+          <w:rFonts w:ascii="Courier New" w:eastAsia="Times New Roman" w:hAnsi="Courier New" w:cs="Courier New"/>
+          <w:sz w:val="20"/>
+        </w:rPr>
+        <w:t>13</w:t>
+      </w:r>
+      <w:r>
+        <w:rPr>
+          <w:rFonts w:ascii="Times New Roman" w:eastAsia="Times New Roman" w:hAnsi="Times New Roman" w:cs="Times New Roman"/>
+          <w:sz w:val="24"/>
+          <w:szCs w:val="24"/>
+        </w:rPr>
+        <w:t xml:space="preserve"> is our key. Is $13 &lt; 12$? No. Stay put $\</w:t>
+      </w:r>
+      <w:proofErr w:type="spellStart"/>
+      <w:r>
+        <w:rPr>
+          <w:rFonts w:ascii="Times New Roman" w:eastAsia="Times New Roman" w:hAnsi="Times New Roman" w:cs="Times New Roman"/>
+          <w:sz w:val="24"/>
+          <w:szCs w:val="24"/>
+        </w:rPr>
+        <w:t>rightarrow</w:t>
+      </w:r>
+      <w:proofErr w:type="spellEnd"/>
+      <w:r>
+        <w:rPr>
+          <w:rFonts w:ascii="Times New Roman" w:eastAsia="Times New Roman" w:hAnsi="Times New Roman" w:cs="Times New Roman"/>
+          <w:sz w:val="24"/>
+          <w:szCs w:val="24"/>
+        </w:rPr>
+        <w:t xml:space="preserve">$ </w:t>
+      </w:r>
+      <w:r>
+        <w:rPr>
+          <w:rFonts w:ascii="Courier New" w:eastAsia="Times New Roman" w:hAnsi="Courier New" w:cs="Courier New"/>
+          <w:sz w:val="20"/>
+        </w:rPr>
+        <w:t>[11, 12, 13, 5]</w:t>
+      </w:r>
+      <w:r>
+        <w:rPr>
+          <w:rFonts w:ascii="Times New Roman" w:eastAsia="Times New Roman" w:hAnsi="Times New Roman" w:cs="Times New Roman"/>
+          <w:sz w:val="24"/>
+          <w:szCs w:val="24"/>
+        </w:rPr>
+        <w:t>.</w:t>
+      </w:r>
+    </w:p>
+    <w:p>
+      <w:pPr>
+        <w:numPr>
+          <w:ilvl w:val="0"/>
+          <w:numId w:val="6"/>
+        </w:numPr>
+        <w:spacing w:before="100" w:beforeAutospacing="1" w:after="100" w:afterAutospacing="1" w:line="240" w:lineRule="auto"/>
+        <w:rPr>
+          <w:rFonts w:ascii="Times New Roman" w:eastAsia="Times New Roman" w:hAnsi="Times New Roman" w:cs="Times New Roman"/>
+          <w:sz w:val="24"/>
+          <w:szCs w:val="24"/>
+        </w:rPr>
+      </w:pPr>
+      <w:r>
+        <w:rPr>
+          <w:rFonts w:ascii="Times New Roman" w:eastAsia="Times New Roman" w:hAnsi="Times New Roman" w:cs="Times New Roman"/>
+          <w:b/>
+          <w:bCs/>
+          <w:sz w:val="24"/>
+          <w:szCs w:val="24"/>
+        </w:rPr>
+        <w:t>Step 3:</w:t>
+      </w:r>
+      <w:r>
+        <w:rPr>
+          <w:rFonts w:ascii="Times New Roman" w:eastAsia="Times New Roman" w:hAnsi="Times New Roman" w:cs="Times New Roman"/>
+          <w:sz w:val="24"/>
+          <w:szCs w:val="24"/>
+        </w:rPr>
+        <w:t xml:space="preserve"> </w:t>
+      </w:r>
+      <w:r>
+        <w:rPr>
+          <w:rFonts w:ascii="Courier New" w:eastAsia="Times New Roman" w:hAnsi="Courier New" w:cs="Courier New"/>
+          <w:sz w:val="20"/>
+        </w:rPr>
+        <w:t>5</w:t>
+      </w:r>
+      <w:r>
+        <w:rPr>
+          <w:rFonts w:ascii="Times New Roman" w:eastAsia="Times New Roman" w:hAnsi="Times New Roman" w:cs="Times New Roman"/>
+          <w:sz w:val="24"/>
+          <w:szCs w:val="24"/>
+        </w:rPr>
+        <w:t xml:space="preserve"> is our key.</w:t>
+      </w:r>
+    </w:p>
+    <w:p>
+      <w:pPr>
+        <w:numPr>
+          <w:ilvl w:val="1"/>
+          <w:numId w:val="6"/>
+        </w:numPr>
+        <w:spacing w:before="100" w:beforeAutospacing="1" w:after="100" w:afterAutospacing="1" w:line="240" w:lineRule="auto"/>
+        <w:rPr>
+          <w:rFonts w:ascii="Times New Roman" w:eastAsia="Times New Roman" w:hAnsi="Times New Roman" w:cs="Times New Roman"/>
+          <w:sz w:val="24"/>
+          <w:szCs w:val="24"/>
+        </w:rPr>
+      </w:pPr>
+      <w:r>
+        <w:rPr>
+          <w:rFonts w:ascii="Times New Roman" w:eastAsia="Times New Roman" w:hAnsi="Times New Roman" w:cs="Times New Roman"/>
+          <w:sz w:val="24"/>
+          <w:szCs w:val="24"/>
+        </w:rPr>
+        <w:t>Is $5 &lt; 13$? Yes. Shift 13.</w:t>
+      </w:r>
+    </w:p>
+    <w:p>
+      <w:pPr>
+        <w:numPr>
+          <w:ilvl w:val="1"/>
+          <w:numId w:val="6"/>
+        </w:numPr>
+        <w:spacing w:before="100" w:beforeAutospacing="1" w:after="100" w:afterAutospacing="1" w:line="240" w:lineRule="auto"/>
+        <w:rPr>
+          <w:rFonts w:ascii="Times New Roman" w:eastAsia="Times New Roman" w:hAnsi="Times New Roman" w:cs="Times New Roman"/>
+          <w:sz w:val="24"/>
+          <w:szCs w:val="24"/>
+        </w:rPr>
+      </w:pPr>
+      <w:r>
+        <w:rPr>
+          <w:rFonts w:ascii="Times New Roman" w:eastAsia="Times New Roman" w:hAnsi="Times New Roman" w:cs="Times New Roman"/>
+          <w:sz w:val="24"/>
+          <w:szCs w:val="24"/>
+        </w:rPr>
+        <w:t>Is $5 &lt; 12$? Yes. Shift 12.</w:t>
+      </w:r>
+    </w:p>
+    <w:p>
+      <w:pPr>
+        <w:numPr>
+          <w:ilvl w:val="1"/>
+          <w:numId w:val="6"/>
+        </w:numPr>
+        <w:spacing w:before="100" w:beforeAutospacing="1" w:after="100" w:afterAutospacing="1" w:line="240" w:lineRule="auto"/>
+        <w:rPr>
+          <w:rFonts w:ascii="Times New Roman" w:eastAsia="Times New Roman" w:hAnsi="Times New Roman" w:cs="Times New Roman"/>
+          <w:sz w:val="24"/>
+          <w:szCs w:val="24"/>
+        </w:rPr>
+      </w:pPr>
+      <w:r>
+        <w:rPr>
+          <w:rFonts w:ascii="Times New Roman" w:eastAsia="Times New Roman" w:hAnsi="Times New Roman" w:cs="Times New Roman"/>
+          <w:sz w:val="24"/>
+          <w:szCs w:val="24"/>
+        </w:rPr>
+        <w:t>Is $5 &lt; 11$? Yes. Shift 11.</w:t>
+      </w:r>
+    </w:p>
+    <w:p>
+      <w:pPr>
+        <w:numPr>
+          <w:ilvl w:val="1"/>
+          <w:numId w:val="6"/>
+        </w:numPr>
+        <w:spacing w:before="100" w:beforeAutospacing="1" w:after="100" w:afterAutospacing="1" w:line="240" w:lineRule="auto"/>
+        <w:rPr>
+          <w:rFonts w:ascii="Times New Roman" w:eastAsia="Times New Roman" w:hAnsi="Times New Roman" w:cs="Times New Roman"/>
+          <w:sz w:val="24"/>
+          <w:szCs w:val="24"/>
+        </w:rPr>
+      </w:pPr>
+      <w:r>
+        <w:rPr>
+          <w:rFonts w:ascii="Times New Roman" w:eastAsia="Times New Roman" w:hAnsi="Times New Roman" w:cs="Times New Roman"/>
+          <w:sz w:val="24"/>
+          <w:szCs w:val="24"/>
+        </w:rPr>
+        <w:t>Insert 5 at the front $\</w:t>
+      </w:r>
+      <w:proofErr w:type="spellStart"/>
+      <w:r>
+        <w:rPr>
+          <w:rFonts w:ascii="Times New Roman" w:eastAsia="Times New Roman" w:hAnsi="Times New Roman" w:cs="Times New Roman"/>
+          <w:sz w:val="24"/>
+          <w:szCs w:val="24"/>
+        </w:rPr>
+        <w:t>rightarrow</w:t>
+      </w:r>
+      <w:proofErr w:type="spellEnd"/>
+      <w:r>
+        <w:rPr>
+          <w:rFonts w:ascii="Times New Roman" w:eastAsia="Times New Roman" w:hAnsi="Times New Roman" w:cs="Times New Roman"/>
+          <w:sz w:val="24"/>
+          <w:szCs w:val="24"/>
+        </w:rPr>
+        <w:t xml:space="preserve">$ </w:t>
+      </w:r>
+      <w:r>
+        <w:rPr>
+          <w:rFonts w:ascii="Courier New" w:eastAsia="Times New Roman" w:hAnsi="Courier New" w:cs="Courier New"/>
+          <w:sz w:val="20"/>
+        </w:rPr>
+        <w:t>[5, 11, 12, 13]</w:t>
+      </w:r>
+      <w:r>
+        <w:rPr>
+          <w:rFonts w:ascii="Times New Roman" w:eastAsia="Times New Roman" w:hAnsi="Times New Roman" w:cs="Times New Roman"/>
+          <w:sz w:val="24"/>
+          <w:szCs w:val="24"/>
+        </w:rPr>
+        <w:t>.</w:t>
+      </w:r>
+    </w:p>
+    <w:p>
+      <w:pPr>
+        <w:spacing w:before="100" w:beforeAutospacing="1" w:after="100" w:afterAutospacing="1" w:line="240" w:lineRule="auto"/>
+        <w:outlineLvl w:val="2"/>
+        <w:rPr>
+          <w:rFonts w:ascii="Times New Roman" w:eastAsia="Times New Roman" w:hAnsi="Times New Roman" w:cs="Times New Roman"/>
+          <w:b/>
+          <w:bCs/>
+          <w:sz w:val="27"/>
+          <w:szCs w:val="27"/>
+        </w:rPr>
+      </w:pPr>
+      <w:r>
+        <w:rPr>
+          <w:rFonts w:ascii="Times New Roman" w:eastAsia="Times New Roman" w:hAnsi="Times New Roman" w:cs="Times New Roman"/>
+          <w:b/>
+          <w:bCs/>
+          <w:sz w:val="27"/>
+          <w:szCs w:val="27"/>
+        </w:rPr>
+        <w:t>Complexity &amp; Efficiency</w:t>
+      </w:r>
+    </w:p>
+    <w:p>
+      <w:pPr>
+        <w:spacing w:before="100" w:beforeAutospacing="1" w:after="100" w:afterAutospacing="1" w:line="240" w:lineRule="auto"/>
+        <w:rPr>
+          <w:rFonts w:ascii="Times New Roman" w:eastAsia="Times New Roman" w:hAnsi="Times New Roman" w:cs="Times New Roman"/>
+          <w:sz w:val="24"/>
+          <w:szCs w:val="24"/>
+        </w:rPr>
+      </w:pPr>
+      <w:r>
+        <w:rPr>
+          <w:rFonts w:ascii="Times New Roman" w:eastAsia="Times New Roman" w:hAnsi="Times New Roman" w:cs="Times New Roman"/>
+          <w:sz w:val="24"/>
+          <w:szCs w:val="24"/>
+        </w:rPr>
+        <w:t xml:space="preserve">Insertion Sort is surprisingly powerful for specific scenarios. Because it only moves what it </w:t>
+      </w:r>
+      <w:r>
+        <w:rPr>
+          <w:rFonts w:ascii="Times New Roman" w:eastAsia="Times New Roman" w:hAnsi="Times New Roman" w:cs="Times New Roman"/>
+          <w:i/>
+          <w:iCs/>
+          <w:sz w:val="24"/>
+          <w:szCs w:val="24"/>
+        </w:rPr>
+        <w:t>has</w:t>
+      </w:r>
+      <w:r>
+        <w:rPr>
+          <w:rFonts w:ascii="Times New Roman" w:eastAsia="Times New Roman" w:hAnsi="Times New Roman" w:cs="Times New Roman"/>
+          <w:sz w:val="24"/>
+          <w:szCs w:val="24"/>
+        </w:rPr>
+        <w:t xml:space="preserve"> to, it’s the fastest of the "simple" sorting algorithms.</w:t>
+      </w:r>
+    </w:p>
+    <w:tbl>
+      <w:tblPr>
+        <w:tblW w:w="0" w:type="auto"/>
+        <w:tblCellSpacing w:w="15" w:type="dxa"/>
+        <w:tblCellMar>
+          <w:top w:w="15" w:type="dxa"/>
+          <w:left w:w="15" w:type="dxa"/>
+          <w:bottom w:w="15" w:type="dxa"/>
+          <w:right w:w="15" w:type="dxa"/>
+        </w:tblCellMar>
+        <w:tblLook w:val="04A0"/>
+      </w:tblPr>
+      <w:tblGrid>
+        <w:gridCol w:w="2048"/>
+        <w:gridCol w:w="5870"/>
+      </w:tblGrid>
+      <w:tr>
+        <w:trPr>
+          <w:tblHeader/>
+          <w:tblCellSpacing w:w="15" w:type="dxa"/>
+        </w:trPr>
+        <w:tc>
+          <w:tcPr>
+            <w:tcW w:w="0" w:type="auto"/>
+            <w:tcBorders>
+              <w:top w:val="single" w:sz="4" w:space="0" w:color="auto"/>
+              <w:left w:val="single" w:sz="4" w:space="0" w:color="auto"/>
+              <w:bottom w:val="single" w:sz="4" w:space="0" w:color="auto"/>
+              <w:right w:val="single" w:sz="4" w:space="0" w:color="auto"/>
+            </w:tcBorders>
+            <w:vAlign w:val="center"/>
+            <w:hideMark/>
+          </w:tcPr>
+          <w:p>
+            <w:pPr>
+              <w:spacing w:after="320" w:line="240" w:lineRule="auto"/>
+              <w:rPr>
+                <w:rFonts w:ascii="Times New Roman" w:eastAsia="Times New Roman" w:hAnsi="Times New Roman" w:cs="Times New Roman"/>
+                <w:sz w:val="24"/>
+                <w:szCs w:val="24"/>
+              </w:rPr>
+            </w:pPr>
+            <w:r>
+              <w:rPr>
+                <w:rFonts w:ascii="Times New Roman" w:eastAsia="Times New Roman" w:hAnsi="Times New Roman" w:cs="Times New Roman"/>
+                <w:b/>
+                <w:bCs/>
+                <w:sz w:val="24"/>
+                <w:szCs w:val="24"/>
+              </w:rPr>
+              <w:lastRenderedPageBreak/>
+              <w:t>Metric</w:t>
+            </w:r>
+          </w:p>
+        </w:tc>
+        <w:tc>
+          <w:tcPr>
+            <w:tcW w:w="0" w:type="auto"/>
+            <w:tcBorders>
+              <w:top w:val="single" w:sz="4" w:space="0" w:color="auto"/>
+              <w:left w:val="single" w:sz="4" w:space="0" w:color="auto"/>
+              <w:bottom w:val="single" w:sz="4" w:space="0" w:color="auto"/>
+              <w:right w:val="single" w:sz="4" w:space="0" w:color="auto"/>
+            </w:tcBorders>
+            <w:vAlign w:val="center"/>
+            <w:hideMark/>
+          </w:tcPr>
+          <w:p>
+            <w:pPr>
+              <w:spacing w:after="320" w:line="240" w:lineRule="auto"/>
+              <w:rPr>
+                <w:rFonts w:ascii="Times New Roman" w:eastAsia="Times New Roman" w:hAnsi="Times New Roman" w:cs="Times New Roman"/>
+                <w:sz w:val="24"/>
+                <w:szCs w:val="24"/>
+              </w:rPr>
+            </w:pPr>
+            <w:r>
+              <w:rPr>
+                <w:rFonts w:ascii="Times New Roman" w:eastAsia="Times New Roman" w:hAnsi="Times New Roman" w:cs="Times New Roman"/>
+                <w:b/>
+                <w:bCs/>
+                <w:sz w:val="24"/>
+                <w:szCs w:val="24"/>
+              </w:rPr>
+              <w:t>Complexity</w:t>
+            </w:r>
+          </w:p>
+        </w:tc>
+      </w:tr>
+      <w:tr>
+        <w:trPr>
+          <w:tblCellSpacing w:w="15" w:type="dxa"/>
+        </w:trPr>
+        <w:tc>
+          <w:tcPr>
+            <w:tcW w:w="0" w:type="auto"/>
+            <w:tcBorders>
+              <w:top w:val="single" w:sz="4" w:space="0" w:color="auto"/>
+              <w:left w:val="single" w:sz="4" w:space="0" w:color="auto"/>
+              <w:bottom w:val="single" w:sz="4" w:space="0" w:color="auto"/>
+              <w:right w:val="single" w:sz="4" w:space="0" w:color="auto"/>
+            </w:tcBorders>
+            <w:vAlign w:val="center"/>
+            <w:hideMark/>
+          </w:tcPr>
+          <w:p>
+            <w:pPr>
+              <w:spacing w:after="320" w:line="240" w:lineRule="auto"/>
+              <w:rPr>
+                <w:rFonts w:ascii="Times New Roman" w:eastAsia="Times New Roman" w:hAnsi="Times New Roman" w:cs="Times New Roman"/>
+                <w:sz w:val="24"/>
+                <w:szCs w:val="24"/>
+              </w:rPr>
+            </w:pPr>
+            <w:r>
+              <w:rPr>
+                <w:rFonts w:ascii="Times New Roman" w:eastAsia="Times New Roman" w:hAnsi="Times New Roman" w:cs="Times New Roman"/>
+                <w:b/>
+                <w:bCs/>
+                <w:sz w:val="24"/>
+                <w:szCs w:val="24"/>
+              </w:rPr>
+              <w:t>Worst-case Time</w:t>
+            </w:r>
+          </w:p>
+        </w:tc>
+        <w:tc>
+          <w:tcPr>
+            <w:tcW w:w="0" w:type="auto"/>
+            <w:tcBorders>
+              <w:top w:val="single" w:sz="4" w:space="0" w:color="auto"/>
+              <w:left w:val="single" w:sz="4" w:space="0" w:color="auto"/>
+              <w:bottom w:val="single" w:sz="4" w:space="0" w:color="auto"/>
+              <w:right w:val="single" w:sz="4" w:space="0" w:color="auto"/>
+            </w:tcBorders>
+            <w:vAlign w:val="center"/>
+            <w:hideMark/>
+          </w:tcPr>
+          <w:p>
+            <w:pPr>
+              <w:spacing w:after="320" w:line="240" w:lineRule="auto"/>
+              <w:rPr>
+                <w:rFonts w:ascii="Times New Roman" w:eastAsia="Times New Roman" w:hAnsi="Times New Roman" w:cs="Times New Roman"/>
+                <w:sz w:val="24"/>
+                <w:szCs w:val="24"/>
+              </w:rPr>
+            </w:pPr>
+            <w:r>
+              <w:rPr>
+                <w:rFonts w:ascii="Times New Roman" w:eastAsia="Times New Roman" w:hAnsi="Times New Roman" w:cs="Times New Roman"/>
+                <w:sz w:val="24"/>
+                <w:szCs w:val="24"/>
+              </w:rPr>
+              <w:t>$O(n^2)$</w:t>
+            </w:r>
+          </w:p>
+        </w:tc>
+      </w:tr>
+      <w:tr>
+        <w:trPr>
+          <w:tblCellSpacing w:w="15" w:type="dxa"/>
+        </w:trPr>
+        <w:tc>
+          <w:tcPr>
+            <w:tcW w:w="0" w:type="auto"/>
+            <w:tcBorders>
+              <w:top w:val="single" w:sz="4" w:space="0" w:color="auto"/>
+              <w:left w:val="single" w:sz="4" w:space="0" w:color="auto"/>
+              <w:bottom w:val="single" w:sz="4" w:space="0" w:color="auto"/>
+              <w:right w:val="single" w:sz="4" w:space="0" w:color="auto"/>
+            </w:tcBorders>
+            <w:vAlign w:val="center"/>
+            <w:hideMark/>
+          </w:tcPr>
+          <w:p>
+            <w:pPr>
+              <w:spacing w:after="320" w:line="240" w:lineRule="auto"/>
+              <w:rPr>
+                <w:rFonts w:ascii="Times New Roman" w:eastAsia="Times New Roman" w:hAnsi="Times New Roman" w:cs="Times New Roman"/>
+                <w:sz w:val="24"/>
+                <w:szCs w:val="24"/>
+              </w:rPr>
+            </w:pPr>
+            <w:r>
+              <w:rPr>
+                <w:rFonts w:ascii="Times New Roman" w:eastAsia="Times New Roman" w:hAnsi="Times New Roman" w:cs="Times New Roman"/>
+                <w:b/>
+                <w:bCs/>
+                <w:sz w:val="24"/>
+                <w:szCs w:val="24"/>
+              </w:rPr>
+              <w:t>Average-case Time</w:t>
+            </w:r>
+          </w:p>
+        </w:tc>
+        <w:tc>
+          <w:tcPr>
+            <w:tcW w:w="0" w:type="auto"/>
+            <w:tcBorders>
+              <w:top w:val="single" w:sz="4" w:space="0" w:color="auto"/>
+              <w:left w:val="single" w:sz="4" w:space="0" w:color="auto"/>
+              <w:bottom w:val="single" w:sz="4" w:space="0" w:color="auto"/>
+              <w:right w:val="single" w:sz="4" w:space="0" w:color="auto"/>
+            </w:tcBorders>
+            <w:vAlign w:val="center"/>
+            <w:hideMark/>
+          </w:tcPr>
+          <w:p>
+            <w:pPr>
+              <w:spacing w:after="320" w:line="240" w:lineRule="auto"/>
+              <w:rPr>
+                <w:rFonts w:ascii="Times New Roman" w:eastAsia="Times New Roman" w:hAnsi="Times New Roman" w:cs="Times New Roman"/>
+                <w:sz w:val="24"/>
+                <w:szCs w:val="24"/>
+              </w:rPr>
+            </w:pPr>
+            <w:r>
+              <w:rPr>
+                <w:rFonts w:ascii="Times New Roman" w:eastAsia="Times New Roman" w:hAnsi="Times New Roman" w:cs="Times New Roman"/>
+                <w:sz w:val="24"/>
+                <w:szCs w:val="24"/>
+              </w:rPr>
+              <w:t>$O(n^2)$</w:t>
+            </w:r>
+          </w:p>
+        </w:tc>
+      </w:tr>
+      <w:tr>
+        <w:trPr>
+          <w:tblCellSpacing w:w="15" w:type="dxa"/>
+        </w:trPr>
+        <w:tc>
+          <w:tcPr>
+            <w:tcW w:w="0" w:type="auto"/>
+            <w:tcBorders>
+              <w:top w:val="single" w:sz="4" w:space="0" w:color="auto"/>
+              <w:left w:val="single" w:sz="4" w:space="0" w:color="auto"/>
+              <w:bottom w:val="single" w:sz="4" w:space="0" w:color="auto"/>
+              <w:right w:val="single" w:sz="4" w:space="0" w:color="auto"/>
+            </w:tcBorders>
+            <w:vAlign w:val="center"/>
+            <w:hideMark/>
+          </w:tcPr>
+          <w:p>
+            <w:pPr>
+              <w:spacing w:after="320" w:line="240" w:lineRule="auto"/>
+              <w:rPr>
+                <w:rFonts w:ascii="Times New Roman" w:eastAsia="Times New Roman" w:hAnsi="Times New Roman" w:cs="Times New Roman"/>
+                <w:sz w:val="24"/>
+                <w:szCs w:val="24"/>
+              </w:rPr>
+            </w:pPr>
+            <w:r>
+              <w:rPr>
+                <w:rFonts w:ascii="Times New Roman" w:eastAsia="Times New Roman" w:hAnsi="Times New Roman" w:cs="Times New Roman"/>
+                <w:b/>
+                <w:bCs/>
+                <w:sz w:val="24"/>
+                <w:szCs w:val="24"/>
+              </w:rPr>
+              <w:t>Best-case Time</w:t>
+            </w:r>
+          </w:p>
+        </w:tc>
+        <w:tc>
+          <w:tcPr>
+            <w:tcW w:w="0" w:type="auto"/>
+            <w:tcBorders>
+              <w:top w:val="single" w:sz="4" w:space="0" w:color="auto"/>
+              <w:left w:val="single" w:sz="4" w:space="0" w:color="auto"/>
+              <w:bottom w:val="single" w:sz="4" w:space="0" w:color="auto"/>
+              <w:right w:val="single" w:sz="4" w:space="0" w:color="auto"/>
+            </w:tcBorders>
+            <w:vAlign w:val="center"/>
+            <w:hideMark/>
+          </w:tcPr>
+          <w:p>
+            <w:pPr>
+              <w:spacing w:after="320" w:line="240" w:lineRule="auto"/>
+              <w:rPr>
+                <w:rFonts w:ascii="Times New Roman" w:eastAsia="Times New Roman" w:hAnsi="Times New Roman" w:cs="Times New Roman"/>
+                <w:sz w:val="24"/>
+                <w:szCs w:val="24"/>
+              </w:rPr>
+            </w:pPr>
+            <w:r>
+              <w:rPr>
+                <w:rFonts w:ascii="Times New Roman" w:eastAsia="Times New Roman" w:hAnsi="Times New Roman" w:cs="Times New Roman"/>
+                <w:sz w:val="24"/>
+                <w:szCs w:val="24"/>
+              </w:rPr>
+              <w:t>$O(n)$ (If list is already sorted)</w:t>
+            </w:r>
+          </w:p>
+        </w:tc>
+      </w:tr>
+      <w:tr>
+        <w:trPr>
+          <w:tblCellSpacing w:w="15" w:type="dxa"/>
+        </w:trPr>
+        <w:tc>
+          <w:tcPr>
+            <w:tcW w:w="0" w:type="auto"/>
+            <w:tcBorders>
+              <w:top w:val="single" w:sz="4" w:space="0" w:color="auto"/>
+              <w:left w:val="single" w:sz="4" w:space="0" w:color="auto"/>
+              <w:bottom w:val="single" w:sz="4" w:space="0" w:color="auto"/>
+              <w:right w:val="single" w:sz="4" w:space="0" w:color="auto"/>
+            </w:tcBorders>
+            <w:vAlign w:val="center"/>
+            <w:hideMark/>
+          </w:tcPr>
+          <w:p>
+            <w:pPr>
+              <w:spacing w:after="320" w:line="240" w:lineRule="auto"/>
+              <w:rPr>
+                <w:rFonts w:ascii="Times New Roman" w:eastAsia="Times New Roman" w:hAnsi="Times New Roman" w:cs="Times New Roman"/>
+                <w:sz w:val="24"/>
+                <w:szCs w:val="24"/>
+              </w:rPr>
+            </w:pPr>
+            <w:r>
+              <w:rPr>
+                <w:rFonts w:ascii="Times New Roman" w:eastAsia="Times New Roman" w:hAnsi="Times New Roman" w:cs="Times New Roman"/>
+                <w:b/>
+                <w:bCs/>
+                <w:sz w:val="24"/>
+                <w:szCs w:val="24"/>
+              </w:rPr>
+              <w:t>Space Complexity</w:t>
+            </w:r>
+          </w:p>
+        </w:tc>
+        <w:tc>
+          <w:tcPr>
+            <w:tcW w:w="0" w:type="auto"/>
+            <w:tcBorders>
+              <w:top w:val="single" w:sz="4" w:space="0" w:color="auto"/>
+              <w:left w:val="single" w:sz="4" w:space="0" w:color="auto"/>
+              <w:bottom w:val="single" w:sz="4" w:space="0" w:color="auto"/>
+              <w:right w:val="single" w:sz="4" w:space="0" w:color="auto"/>
+            </w:tcBorders>
+            <w:vAlign w:val="center"/>
+            <w:hideMark/>
+          </w:tcPr>
+          <w:p>
+            <w:pPr>
+              <w:spacing w:after="320" w:line="240" w:lineRule="auto"/>
+              <w:rPr>
+                <w:rFonts w:ascii="Times New Roman" w:eastAsia="Times New Roman" w:hAnsi="Times New Roman" w:cs="Times New Roman"/>
+                <w:sz w:val="24"/>
+                <w:szCs w:val="24"/>
+              </w:rPr>
+            </w:pPr>
+            <w:r>
+              <w:rPr>
+                <w:rFonts w:ascii="Times New Roman" w:eastAsia="Times New Roman" w:hAnsi="Times New Roman" w:cs="Times New Roman"/>
+                <w:sz w:val="24"/>
+                <w:szCs w:val="24"/>
+              </w:rPr>
+              <w:t>$O(1)$ (In-place)</w:t>
+            </w:r>
+          </w:p>
+        </w:tc>
+      </w:tr>
+      <w:tr>
+        <w:trPr>
+          <w:tblCellSpacing w:w="15" w:type="dxa"/>
+        </w:trPr>
+        <w:tc>
+          <w:tcPr>
+            <w:tcW w:w="0" w:type="auto"/>
+            <w:tcBorders>
+              <w:top w:val="single" w:sz="4" w:space="0" w:color="auto"/>
+              <w:left w:val="single" w:sz="4" w:space="0" w:color="auto"/>
+              <w:bottom w:val="single" w:sz="4" w:space="0" w:color="auto"/>
+              <w:right w:val="single" w:sz="4" w:space="0" w:color="auto"/>
+            </w:tcBorders>
+            <w:vAlign w:val="center"/>
+            <w:hideMark/>
+          </w:tcPr>
+          <w:p>
+            <w:pPr>
+              <w:spacing w:after="320" w:line="240" w:lineRule="auto"/>
+              <w:rPr>
+                <w:rFonts w:ascii="Times New Roman" w:eastAsia="Times New Roman" w:hAnsi="Times New Roman" w:cs="Times New Roman"/>
+                <w:sz w:val="24"/>
+                <w:szCs w:val="24"/>
+              </w:rPr>
+            </w:pPr>
+            <w:r>
+              <w:rPr>
+                <w:rFonts w:ascii="Times New Roman" w:eastAsia="Times New Roman" w:hAnsi="Times New Roman" w:cs="Times New Roman"/>
+                <w:b/>
+                <w:bCs/>
+                <w:sz w:val="24"/>
+                <w:szCs w:val="24"/>
+              </w:rPr>
+              <w:t>Stability</w:t>
+            </w:r>
+          </w:p>
+        </w:tc>
+        <w:tc>
+          <w:tcPr>
+            <w:tcW w:w="0" w:type="auto"/>
+            <w:tcBorders>
+              <w:top w:val="single" w:sz="4" w:space="0" w:color="auto"/>
+              <w:left w:val="single" w:sz="4" w:space="0" w:color="auto"/>
+              <w:bottom w:val="single" w:sz="4" w:space="0" w:color="auto"/>
+              <w:right w:val="single" w:sz="4" w:space="0" w:color="auto"/>
+            </w:tcBorders>
+            <w:vAlign w:val="center"/>
+            <w:hideMark/>
+          </w:tcPr>
+          <w:p>
+            <w:pPr>
+              <w:spacing w:after="320" w:line="240" w:lineRule="auto"/>
+              <w:rPr>
+                <w:rFonts w:ascii="Times New Roman" w:eastAsia="Times New Roman" w:hAnsi="Times New Roman" w:cs="Times New Roman"/>
+                <w:sz w:val="24"/>
+                <w:szCs w:val="24"/>
+              </w:rPr>
+            </w:pPr>
+            <w:r>
+              <w:rPr>
+                <w:rFonts w:ascii="Times New Roman" w:eastAsia="Times New Roman" w:hAnsi="Times New Roman" w:cs="Times New Roman"/>
+                <w:b/>
+                <w:bCs/>
+                <w:sz w:val="24"/>
+                <w:szCs w:val="24"/>
+              </w:rPr>
+              <w:t>Stable</w:t>
+            </w:r>
+            <w:r>
+              <w:rPr>
+                <w:rFonts w:ascii="Times New Roman" w:eastAsia="Times New Roman" w:hAnsi="Times New Roman" w:cs="Times New Roman"/>
+                <w:sz w:val="24"/>
+                <w:szCs w:val="24"/>
+              </w:rPr>
+              <w:t xml:space="preserve"> (Doesn't change the relative order of equal elements)</w:t>
+            </w:r>
+          </w:p>
+        </w:tc>
+      </w:tr>
+    </w:tbl>
+    <w:p>
+      <w:pPr>
+        <w:jc w:val="center"/>
+        <w:rPr>
+          <w:b/>
+          <w:sz w:val="36"/>
+          <w:szCs w:val="36"/>
+        </w:rPr>
+      </w:pPr>
+    </w:p>
     <w:sectPr>
       <w:pgSz w:w="12240" w:h="15840"/>
       <w:pgMar w:top="1440" w:right="1440" w:bottom="1440" w:left="1440" w:header="720" w:footer="720" w:gutter="0"/>
@@ -2497,6 +3675,268 @@
     </w:lvl>
   </w:abstractNum>
   <w:abstractNum w:abstractNumId="2">
+    <w:nsid w:val="354C54D5"/>
+    <w:multiLevelType w:val="multilevel"/>
+    <w:tmpl w:val="613A4A8C"/>
+    <w:lvl w:ilvl="0">
+      <w:start w:val="1"/>
+      <w:numFmt w:val="decimal"/>
+      <w:lvlText w:val="%1."/>
+      <w:lvlJc w:val="left"/>
+      <w:pPr>
+        <w:tabs>
+          <w:tab w:val="num" w:pos="720"/>
+        </w:tabs>
+        <w:ind w:left="720" w:hanging="360"/>
+      </w:pPr>
+    </w:lvl>
+    <w:lvl w:ilvl="1" w:tentative="1">
+      <w:start w:val="1"/>
+      <w:numFmt w:val="decimal"/>
+      <w:lvlText w:val="%2."/>
+      <w:lvlJc w:val="left"/>
+      <w:pPr>
+        <w:tabs>
+          <w:tab w:val="num" w:pos="1440"/>
+        </w:tabs>
+        <w:ind w:left="1440" w:hanging="360"/>
+      </w:pPr>
+    </w:lvl>
+    <w:lvl w:ilvl="2" w:tentative="1">
+      <w:start w:val="1"/>
+      <w:numFmt w:val="decimal"/>
+      <w:lvlText w:val="%3."/>
+      <w:lvlJc w:val="left"/>
+      <w:pPr>
+        <w:tabs>
+          <w:tab w:val="num" w:pos="2160"/>
+        </w:tabs>
+        <w:ind w:left="2160" w:hanging="360"/>
+      </w:pPr>
+    </w:lvl>
+    <w:lvl w:ilvl="3" w:tentative="1">
+      <w:start w:val="1"/>
+      <w:numFmt w:val="decimal"/>
+      <w:lvlText w:val="%4."/>
+      <w:lvlJc w:val="left"/>
+      <w:pPr>
+        <w:tabs>
+          <w:tab w:val="num" w:pos="2880"/>
+        </w:tabs>
+        <w:ind w:left="2880" w:hanging="360"/>
+      </w:pPr>
+    </w:lvl>
+    <w:lvl w:ilvl="4" w:tentative="1">
+      <w:start w:val="1"/>
+      <w:numFmt w:val="decimal"/>
+      <w:lvlText w:val="%5."/>
+      <w:lvlJc w:val="left"/>
+      <w:pPr>
+        <w:tabs>
+          <w:tab w:val="num" w:pos="3600"/>
+        </w:tabs>
+        <w:ind w:left="3600" w:hanging="360"/>
+      </w:pPr>
+    </w:lvl>
+    <w:lvl w:ilvl="5" w:tentative="1">
+      <w:start w:val="1"/>
+      <w:numFmt w:val="decimal"/>
+      <w:lvlText w:val="%6."/>
+      <w:lvlJc w:val="left"/>
+      <w:pPr>
+        <w:tabs>
+          <w:tab w:val="num" w:pos="4320"/>
+        </w:tabs>
+        <w:ind w:left="4320" w:hanging="360"/>
+      </w:pPr>
+    </w:lvl>
+    <w:lvl w:ilvl="6" w:tentative="1">
+      <w:start w:val="1"/>
+      <w:numFmt w:val="decimal"/>
+      <w:lvlText w:val="%7."/>
+      <w:lvlJc w:val="left"/>
+      <w:pPr>
+        <w:tabs>
+          <w:tab w:val="num" w:pos="5040"/>
+        </w:tabs>
+        <w:ind w:left="5040" w:hanging="360"/>
+      </w:pPr>
+    </w:lvl>
+    <w:lvl w:ilvl="7" w:tentative="1">
+      <w:start w:val="1"/>
+      <w:numFmt w:val="decimal"/>
+      <w:lvlText w:val="%8."/>
+      <w:lvlJc w:val="left"/>
+      <w:pPr>
+        <w:tabs>
+          <w:tab w:val="num" w:pos="5760"/>
+        </w:tabs>
+        <w:ind w:left="5760" w:hanging="360"/>
+      </w:pPr>
+    </w:lvl>
+    <w:lvl w:ilvl="8" w:tentative="1">
+      <w:start w:val="1"/>
+      <w:numFmt w:val="decimal"/>
+      <w:lvlText w:val="%9."/>
+      <w:lvlJc w:val="left"/>
+      <w:pPr>
+        <w:tabs>
+          <w:tab w:val="num" w:pos="6480"/>
+        </w:tabs>
+        <w:ind w:left="6480" w:hanging="360"/>
+      </w:pPr>
+    </w:lvl>
+  </w:abstractNum>
+  <w:abstractNum w:abstractNumId="3">
+    <w:nsid w:val="3A35349D"/>
+    <w:multiLevelType w:val="multilevel"/>
+    <w:tmpl w:val="2C48345A"/>
+    <w:lvl w:ilvl="0">
+      <w:start w:val="1"/>
+      <w:numFmt w:val="bullet"/>
+      <w:lvlText w:val=""/>
+      <w:lvlJc w:val="left"/>
+      <w:pPr>
+        <w:tabs>
+          <w:tab w:val="num" w:pos="720"/>
+        </w:tabs>
+        <w:ind w:left="720" w:hanging="360"/>
+      </w:pPr>
+      <w:rPr>
+        <w:rFonts w:ascii="Symbol" w:hAnsi="Symbol" w:hint="default"/>
+        <w:sz w:val="20"/>
+      </w:rPr>
+    </w:lvl>
+    <w:lvl w:ilvl="1">
+      <w:start w:val="1"/>
+      <w:numFmt w:val="bullet"/>
+      <w:lvlText w:val="o"/>
+      <w:lvlJc w:val="left"/>
+      <w:pPr>
+        <w:tabs>
+          <w:tab w:val="num" w:pos="1440"/>
+        </w:tabs>
+        <w:ind w:left="1440" w:hanging="360"/>
+      </w:pPr>
+      <w:rPr>
+        <w:rFonts w:ascii="Courier New" w:hAnsi="Courier New" w:hint="default"/>
+        <w:sz w:val="20"/>
+      </w:rPr>
+    </w:lvl>
+    <w:lvl w:ilvl="2" w:tentative="1">
+      <w:start w:val="1"/>
+      <w:numFmt w:val="bullet"/>
+      <w:lvlText w:val=""/>
+      <w:lvlJc w:val="left"/>
+      <w:pPr>
+        <w:tabs>
+          <w:tab w:val="num" w:pos="2160"/>
+        </w:tabs>
+        <w:ind w:left="2160" w:hanging="360"/>
+      </w:pPr>
+      <w:rPr>
+        <w:rFonts w:ascii="Wingdings" w:hAnsi="Wingdings" w:hint="default"/>
+        <w:sz w:val="20"/>
+      </w:rPr>
+    </w:lvl>
+    <w:lvl w:ilvl="3" w:tentative="1">
+      <w:start w:val="1"/>
+      <w:numFmt w:val="bullet"/>
+      <w:lvlText w:val=""/>
+      <w:lvlJc w:val="left"/>
+      <w:pPr>
+        <w:tabs>
+          <w:tab w:val="num" w:pos="2880"/>
+        </w:tabs>
+        <w:ind w:left="2880" w:hanging="360"/>
+      </w:pPr>
+      <w:rPr>
+        <w:rFonts w:ascii="Wingdings" w:hAnsi="Wingdings" w:hint="default"/>
+        <w:sz w:val="20"/>
+      </w:rPr>
+    </w:lvl>
+    <w:lvl w:ilvl="4" w:tentative="1">
+      <w:start w:val="1"/>
+      <w:numFmt w:val="bullet"/>
+      <w:lvlText w:val=""/>
+      <w:lvlJc w:val="left"/>
+      <w:pPr>
+        <w:tabs>
+          <w:tab w:val="num" w:pos="3600"/>
+        </w:tabs>
+        <w:ind w:left="3600" w:hanging="360"/>
+      </w:pPr>
+      <w:rPr>
+        <w:rFonts w:ascii="Wingdings" w:hAnsi="Wingdings" w:hint="default"/>
+        <w:sz w:val="20"/>
+      </w:rPr>
+    </w:lvl>
+    <w:lvl w:ilvl="5" w:tentative="1">
+      <w:start w:val="1"/>
+      <w:numFmt w:val="bullet"/>
+      <w:lvlText w:val=""/>
+      <w:lvlJc w:val="left"/>
+      <w:pPr>
+        <w:tabs>
+          <w:tab w:val="num" w:pos="4320"/>
+        </w:tabs>
+        <w:ind w:left="4320" w:hanging="360"/>
+      </w:pPr>
+      <w:rPr>
+        <w:rFonts w:ascii="Wingdings" w:hAnsi="Wingdings" w:hint="default"/>
+        <w:sz w:val="20"/>
+      </w:rPr>
+    </w:lvl>
+    <w:lvl w:ilvl="6" w:tentative="1">
+      <w:start w:val="1"/>
+      <w:numFmt w:val="bullet"/>
+      <w:lvlText w:val=""/>
+      <w:lvlJc w:val="left"/>
+      <w:pPr>
+        <w:tabs>
+          <w:tab w:val="num" w:pos="5040"/>
+        </w:tabs>
+        <w:ind w:left="5040" w:hanging="360"/>
+      </w:pPr>
+      <w:rPr>
+        <w:rFonts w:ascii="Wingdings" w:hAnsi="Wingdings" w:hint="default"/>
+        <w:sz w:val="20"/>
+      </w:rPr>
+    </w:lvl>
+    <w:lvl w:ilvl="7" w:tentative="1">
+      <w:start w:val="1"/>
+      <w:numFmt w:val="bullet"/>
+      <w:lvlText w:val=""/>
+      <w:lvlJc w:val="left"/>
+      <w:pPr>
+        <w:tabs>
+          <w:tab w:val="num" w:pos="5760"/>
+        </w:tabs>
+        <w:ind w:left="5760" w:hanging="360"/>
+      </w:pPr>
+      <w:rPr>
+        <w:rFonts w:ascii="Wingdings" w:hAnsi="Wingdings" w:hint="default"/>
+        <w:sz w:val="20"/>
+      </w:rPr>
+    </w:lvl>
+    <w:lvl w:ilvl="8" w:tentative="1">
+      <w:start w:val="1"/>
+      <w:numFmt w:val="bullet"/>
+      <w:lvlText w:val=""/>
+      <w:lvlJc w:val="left"/>
+      <w:pPr>
+        <w:tabs>
+          <w:tab w:val="num" w:pos="6480"/>
+        </w:tabs>
+        <w:ind w:left="6480" w:hanging="360"/>
+      </w:pPr>
+      <w:rPr>
+        <w:rFonts w:ascii="Wingdings" w:hAnsi="Wingdings" w:hint="default"/>
+        <w:sz w:val="20"/>
+      </w:rPr>
+    </w:lvl>
+  </w:abstractNum>
+  <w:abstractNum w:abstractNumId="4">
     <w:nsid w:val="3C973128"/>
     <w:multiLevelType w:val="multilevel"/>
     <w:tmpl w:val="277C0526"/>
@@ -2609,7 +4049,7 @@
       </w:pPr>
     </w:lvl>
   </w:abstractNum>
-  <w:abstractNum w:abstractNumId="3">
+  <w:abstractNum w:abstractNumId="5">
     <w:nsid w:val="67B67538"/>
     <w:multiLevelType w:val="multilevel"/>
     <w:tmpl w:val="6FD26896"/>
@@ -2765,9 +4205,15 @@
     <w:abstractNumId w:val="1"/>
   </w:num>
   <w:num w:numId="3">
+    <w:abstractNumId w:val="4"/>
+  </w:num>
+  <w:num w:numId="4">
+    <w:abstractNumId w:val="5"/>
+  </w:num>
+  <w:num w:numId="5">
     <w:abstractNumId w:val="2"/>
   </w:num>
-  <w:num w:numId="4">
+  <w:num w:numId="6">
     <w:abstractNumId w:val="3"/>
   </w:num>
 </w:numbering>

</xml_diff>

<commit_message>
Adding Merge sort Algo
</commit_message>
<xml_diff>
--- a/Sorting Algorithms/Sortings.docx
+++ b/Sorting Algorithms/Sortings.docx
@@ -3400,6 +3400,1241 @@
         </w:rPr>
       </w:pPr>
     </w:p>
+    <w:p>
+      <w:pPr>
+        <w:jc w:val="center"/>
+        <w:rPr>
+          <w:b/>
+          <w:sz w:val="36"/>
+          <w:szCs w:val="36"/>
+        </w:rPr>
+      </w:pPr>
+    </w:p>
+    <w:p>
+      <w:pPr>
+        <w:jc w:val="center"/>
+        <w:rPr>
+          <w:b/>
+          <w:sz w:val="36"/>
+          <w:szCs w:val="36"/>
+        </w:rPr>
+      </w:pPr>
+      <w:r>
+        <w:rPr>
+          <w:b/>
+          <w:sz w:val="36"/>
+          <w:szCs w:val="36"/>
+        </w:rPr>
+        <w:t>Merge Sort</w:t>
+      </w:r>
+    </w:p>
+    <w:p>
+      <w:pPr>
+        <w:spacing w:before="100" w:beforeAutospacing="1" w:after="100" w:afterAutospacing="1" w:line="240" w:lineRule="auto"/>
+        <w:rPr>
+          <w:rFonts w:ascii="Times New Roman" w:eastAsia="Times New Roman" w:hAnsi="Times New Roman" w:cs="Times New Roman"/>
+          <w:sz w:val="24"/>
+          <w:szCs w:val="24"/>
+        </w:rPr>
+      </w:pPr>
+      <w:r>
+        <w:rPr>
+          <w:rFonts w:ascii="Times New Roman" w:eastAsia="Times New Roman" w:hAnsi="Times New Roman" w:cs="Times New Roman"/>
+          <w:b/>
+          <w:bCs/>
+          <w:sz w:val="24"/>
+          <w:szCs w:val="24"/>
+        </w:rPr>
+        <w:t>Merge Sort</w:t>
+      </w:r>
+      <w:r>
+        <w:rPr>
+          <w:rFonts w:ascii="Times New Roman" w:eastAsia="Times New Roman" w:hAnsi="Times New Roman" w:cs="Times New Roman"/>
+          <w:sz w:val="24"/>
+          <w:szCs w:val="24"/>
+        </w:rPr>
+        <w:t xml:space="preserve"> is an industrial assembly line. It is </w:t>
+      </w:r>
+      <w:r>
+        <w:rPr>
+          <w:rFonts w:ascii="Times New Roman" w:eastAsia="Times New Roman" w:hAnsi="Times New Roman" w:cs="Times New Roman"/>
+          <w:b/>
+          <w:bCs/>
+          <w:sz w:val="24"/>
+          <w:szCs w:val="24"/>
+        </w:rPr>
+        <w:t>"The Divide-and-Conquer General."</w:t>
+      </w:r>
+    </w:p>
+    <w:p>
+      <w:pPr>
+        <w:spacing w:before="100" w:beforeAutospacing="1" w:after="100" w:afterAutospacing="1" w:line="240" w:lineRule="auto"/>
+        <w:rPr>
+          <w:rFonts w:ascii="Times New Roman" w:eastAsia="Times New Roman" w:hAnsi="Times New Roman" w:cs="Times New Roman"/>
+          <w:sz w:val="24"/>
+          <w:szCs w:val="24"/>
+        </w:rPr>
+      </w:pPr>
+      <w:r>
+        <w:rPr>
+          <w:rFonts w:ascii="Times New Roman" w:eastAsia="Times New Roman" w:hAnsi="Times New Roman" w:cs="Times New Roman"/>
+          <w:sz w:val="24"/>
+          <w:szCs w:val="24"/>
+        </w:rPr>
+        <w:t>Instead of messing around with swapping individual elements side-by-side, Merge Sort takes a giant problem, chops it up into tiny, manageable pieces, solves those pieces, and glues them back together perfectly.</w:t>
+      </w:r>
+    </w:p>
+    <w:p>
+      <w:pPr>
+        <w:spacing w:before="100" w:beforeAutospacing="1" w:after="100" w:afterAutospacing="1" w:line="240" w:lineRule="auto"/>
+        <w:outlineLvl w:val="2"/>
+        <w:rPr>
+          <w:rFonts w:ascii="Times New Roman" w:eastAsia="Times New Roman" w:hAnsi="Times New Roman" w:cs="Times New Roman"/>
+          <w:b/>
+          <w:bCs/>
+          <w:sz w:val="27"/>
+          <w:szCs w:val="27"/>
+        </w:rPr>
+      </w:pPr>
+      <w:r>
+        <w:rPr>
+          <w:rFonts w:ascii="Times New Roman" w:eastAsia="Times New Roman" w:hAnsi="Times New Roman" w:cs="Times New Roman"/>
+          <w:b/>
+          <w:bCs/>
+          <w:sz w:val="27"/>
+          <w:szCs w:val="27"/>
+        </w:rPr>
+        <w:t>How It Works (Divide and Conquer)</w:t>
+      </w:r>
+    </w:p>
+    <w:p>
+      <w:pPr>
+        <w:spacing w:before="100" w:beforeAutospacing="1" w:after="100" w:afterAutospacing="1" w:line="240" w:lineRule="auto"/>
+        <w:rPr>
+          <w:rFonts w:ascii="Times New Roman" w:eastAsia="Times New Roman" w:hAnsi="Times New Roman" w:cs="Times New Roman"/>
+          <w:sz w:val="24"/>
+          <w:szCs w:val="24"/>
+        </w:rPr>
+      </w:pPr>
+      <w:r>
+        <w:rPr>
+          <w:rFonts w:ascii="Times New Roman" w:eastAsia="Times New Roman" w:hAnsi="Times New Roman" w:cs="Times New Roman"/>
+          <w:sz w:val="24"/>
+          <w:szCs w:val="24"/>
+        </w:rPr>
+        <w:t xml:space="preserve">Merge Sort relies heavily on a computer science concept called </w:t>
+      </w:r>
+      <w:r>
+        <w:rPr>
+          <w:rFonts w:ascii="Times New Roman" w:eastAsia="Times New Roman" w:hAnsi="Times New Roman" w:cs="Times New Roman"/>
+          <w:b/>
+          <w:bCs/>
+          <w:sz w:val="24"/>
+          <w:szCs w:val="24"/>
+        </w:rPr>
+        <w:t>recursion</w:t>
+      </w:r>
+      <w:r>
+        <w:rPr>
+          <w:rFonts w:ascii="Times New Roman" w:eastAsia="Times New Roman" w:hAnsi="Times New Roman" w:cs="Times New Roman"/>
+          <w:sz w:val="24"/>
+          <w:szCs w:val="24"/>
+        </w:rPr>
+        <w:t xml:space="preserve"> (a function calling itself). It works in two distinct phases:</w:t>
+      </w:r>
+    </w:p>
+    <w:p>
+      <w:pPr>
+        <w:numPr>
+          <w:ilvl w:val="0"/>
+          <w:numId w:val="7"/>
+        </w:numPr>
+        <w:spacing w:before="100" w:beforeAutospacing="1" w:after="100" w:afterAutospacing="1" w:line="240" w:lineRule="auto"/>
+        <w:rPr>
+          <w:rFonts w:ascii="Times New Roman" w:eastAsia="Times New Roman" w:hAnsi="Times New Roman" w:cs="Times New Roman"/>
+          <w:sz w:val="24"/>
+          <w:szCs w:val="24"/>
+        </w:rPr>
+      </w:pPr>
+      <w:r>
+        <w:rPr>
+          <w:rFonts w:ascii="Times New Roman" w:eastAsia="Times New Roman" w:hAnsi="Times New Roman" w:cs="Times New Roman"/>
+          <w:b/>
+          <w:bCs/>
+          <w:sz w:val="24"/>
+          <w:szCs w:val="24"/>
+        </w:rPr>
+        <w:t>Divide:</w:t>
+      </w:r>
+      <w:r>
+        <w:rPr>
+          <w:rFonts w:ascii="Times New Roman" w:eastAsia="Times New Roman" w:hAnsi="Times New Roman" w:cs="Times New Roman"/>
+          <w:sz w:val="24"/>
+          <w:szCs w:val="24"/>
+        </w:rPr>
+        <w:t xml:space="preserve"> Split the unsorted list in half. Then split those halves in half. Keep splitting until you are left with lists that contain only </w:t>
+      </w:r>
+      <w:r>
+        <w:rPr>
+          <w:rFonts w:ascii="Times New Roman" w:eastAsia="Times New Roman" w:hAnsi="Times New Roman" w:cs="Times New Roman"/>
+          <w:b/>
+          <w:bCs/>
+          <w:sz w:val="24"/>
+          <w:szCs w:val="24"/>
+        </w:rPr>
+        <w:t>one element</w:t>
+      </w:r>
+      <w:r>
+        <w:rPr>
+          <w:rFonts w:ascii="Times New Roman" w:eastAsia="Times New Roman" w:hAnsi="Times New Roman" w:cs="Times New Roman"/>
+          <w:sz w:val="24"/>
+          <w:szCs w:val="24"/>
+        </w:rPr>
+        <w:t xml:space="preserve"> each. (A list with one element is, by definition, already sorted!)</w:t>
+      </w:r>
+    </w:p>
+    <w:p>
+      <w:pPr>
+        <w:numPr>
+          <w:ilvl w:val="0"/>
+          <w:numId w:val="7"/>
+        </w:numPr>
+        <w:spacing w:before="100" w:beforeAutospacing="1" w:after="100" w:afterAutospacing="1" w:line="240" w:lineRule="auto"/>
+        <w:rPr>
+          <w:rFonts w:ascii="Times New Roman" w:eastAsia="Times New Roman" w:hAnsi="Times New Roman" w:cs="Times New Roman"/>
+          <w:sz w:val="24"/>
+          <w:szCs w:val="24"/>
+        </w:rPr>
+      </w:pPr>
+      <w:r>
+        <w:rPr>
+          <w:rFonts w:ascii="Times New Roman" w:eastAsia="Times New Roman" w:hAnsi="Times New Roman" w:cs="Times New Roman"/>
+          <w:b/>
+          <w:bCs/>
+          <w:sz w:val="24"/>
+          <w:szCs w:val="24"/>
+        </w:rPr>
+        <w:t>Conquer (Merge):</w:t>
+      </w:r>
+      <w:r>
+        <w:rPr>
+          <w:rFonts w:ascii="Times New Roman" w:eastAsia="Times New Roman" w:hAnsi="Times New Roman" w:cs="Times New Roman"/>
+          <w:sz w:val="24"/>
+          <w:szCs w:val="24"/>
+        </w:rPr>
+        <w:t xml:space="preserve"> Take those single elements and merge them back together into pairs, sorting them as you go. Then merge the pairs into groups of four, and so on, until the entire list is rebuilt.</w:t>
+      </w:r>
+    </w:p>
+    <w:p>
+      <w:pPr>
+        <w:spacing w:before="100" w:beforeAutospacing="1" w:after="100" w:afterAutospacing="1" w:line="240" w:lineRule="auto"/>
+        <w:rPr>
+          <w:rFonts w:ascii="Times New Roman" w:eastAsia="Times New Roman" w:hAnsi="Times New Roman" w:cs="Times New Roman"/>
+          <w:sz w:val="24"/>
+          <w:szCs w:val="24"/>
+        </w:rPr>
+      </w:pPr>
+      <w:r>
+        <w:rPr>
+          <w:rFonts w:ascii="Times New Roman" w:eastAsia="Times New Roman" w:hAnsi="Times New Roman" w:cs="Times New Roman"/>
+          <w:b/>
+          <w:bCs/>
+          <w:sz w:val="24"/>
+          <w:szCs w:val="24"/>
+        </w:rPr>
+        <w:t>Example Walkthrough:</w:t>
+      </w:r>
+      <w:r>
+        <w:rPr>
+          <w:rFonts w:ascii="Times New Roman" w:eastAsia="Times New Roman" w:hAnsi="Times New Roman" w:cs="Times New Roman"/>
+          <w:sz w:val="24"/>
+          <w:szCs w:val="24"/>
+        </w:rPr>
+        <w:t xml:space="preserve"> </w:t>
+      </w:r>
+      <w:r>
+        <w:rPr>
+          <w:rFonts w:ascii="Courier New" w:eastAsia="Times New Roman" w:hAnsi="Courier New" w:cs="Courier New"/>
+          <w:sz w:val="20"/>
+        </w:rPr>
+        <w:t>[38, 27, 43, 3]</w:t>
+      </w:r>
+    </w:p>
+    <w:p>
+      <w:pPr>
+        <w:numPr>
+          <w:ilvl w:val="0"/>
+          <w:numId w:val="8"/>
+        </w:numPr>
+        <w:spacing w:before="100" w:beforeAutospacing="1" w:after="100" w:afterAutospacing="1" w:line="240" w:lineRule="auto"/>
+        <w:rPr>
+          <w:rFonts w:ascii="Times New Roman" w:eastAsia="Times New Roman" w:hAnsi="Times New Roman" w:cs="Times New Roman"/>
+          <w:sz w:val="24"/>
+          <w:szCs w:val="24"/>
+        </w:rPr>
+      </w:pPr>
+      <w:r>
+        <w:rPr>
+          <w:rFonts w:ascii="Times New Roman" w:eastAsia="Times New Roman" w:hAnsi="Times New Roman" w:cs="Times New Roman"/>
+          <w:b/>
+          <w:bCs/>
+          <w:sz w:val="24"/>
+          <w:szCs w:val="24"/>
+        </w:rPr>
+        <w:t>Divide:</w:t>
+      </w:r>
+    </w:p>
+    <w:p>
+      <w:pPr>
+        <w:numPr>
+          <w:ilvl w:val="1"/>
+          <w:numId w:val="8"/>
+        </w:numPr>
+        <w:spacing w:before="100" w:beforeAutospacing="1" w:after="100" w:afterAutospacing="1" w:line="240" w:lineRule="auto"/>
+        <w:rPr>
+          <w:rFonts w:ascii="Times New Roman" w:eastAsia="Times New Roman" w:hAnsi="Times New Roman" w:cs="Times New Roman"/>
+          <w:sz w:val="24"/>
+          <w:szCs w:val="24"/>
+        </w:rPr>
+      </w:pPr>
+      <w:r>
+        <w:rPr>
+          <w:rFonts w:ascii="Courier New" w:eastAsia="Times New Roman" w:hAnsi="Courier New" w:cs="Courier New"/>
+          <w:sz w:val="20"/>
+        </w:rPr>
+        <w:t>[38, 27]</w:t>
+      </w:r>
+      <w:r>
+        <w:rPr>
+          <w:rFonts w:ascii="Times New Roman" w:eastAsia="Times New Roman" w:hAnsi="Times New Roman" w:cs="Times New Roman"/>
+          <w:sz w:val="24"/>
+          <w:szCs w:val="24"/>
+        </w:rPr>
+        <w:t xml:space="preserve"> and </w:t>
+      </w:r>
+      <w:r>
+        <w:rPr>
+          <w:rFonts w:ascii="Courier New" w:eastAsia="Times New Roman" w:hAnsi="Courier New" w:cs="Courier New"/>
+          <w:sz w:val="20"/>
+        </w:rPr>
+        <w:t>[43, 3]</w:t>
+      </w:r>
+    </w:p>
+    <w:p>
+      <w:pPr>
+        <w:numPr>
+          <w:ilvl w:val="1"/>
+          <w:numId w:val="8"/>
+        </w:numPr>
+        <w:spacing w:before="100" w:beforeAutospacing="1" w:after="100" w:afterAutospacing="1" w:line="240" w:lineRule="auto"/>
+        <w:rPr>
+          <w:rFonts w:ascii="Times New Roman" w:eastAsia="Times New Roman" w:hAnsi="Times New Roman" w:cs="Times New Roman"/>
+          <w:sz w:val="24"/>
+          <w:szCs w:val="24"/>
+        </w:rPr>
+      </w:pPr>
+      <w:r>
+        <w:rPr>
+          <w:rFonts w:ascii="Courier New" w:eastAsia="Times New Roman" w:hAnsi="Courier New" w:cs="Courier New"/>
+          <w:sz w:val="20"/>
+        </w:rPr>
+        <w:t>[38]</w:t>
+      </w:r>
+      <w:r>
+        <w:rPr>
+          <w:rFonts w:ascii="Times New Roman" w:eastAsia="Times New Roman" w:hAnsi="Times New Roman" w:cs="Times New Roman"/>
+          <w:sz w:val="24"/>
+          <w:szCs w:val="24"/>
+        </w:rPr>
+        <w:t xml:space="preserve">, </w:t>
+      </w:r>
+      <w:r>
+        <w:rPr>
+          <w:rFonts w:ascii="Courier New" w:eastAsia="Times New Roman" w:hAnsi="Courier New" w:cs="Courier New"/>
+          <w:sz w:val="20"/>
+        </w:rPr>
+        <w:t>[27]</w:t>
+      </w:r>
+      <w:r>
+        <w:rPr>
+          <w:rFonts w:ascii="Times New Roman" w:eastAsia="Times New Roman" w:hAnsi="Times New Roman" w:cs="Times New Roman"/>
+          <w:sz w:val="24"/>
+          <w:szCs w:val="24"/>
+        </w:rPr>
+        <w:t xml:space="preserve">, </w:t>
+      </w:r>
+      <w:r>
+        <w:rPr>
+          <w:rFonts w:ascii="Courier New" w:eastAsia="Times New Roman" w:hAnsi="Courier New" w:cs="Courier New"/>
+          <w:sz w:val="20"/>
+        </w:rPr>
+        <w:t>[43]</w:t>
+      </w:r>
+      <w:r>
+        <w:rPr>
+          <w:rFonts w:ascii="Times New Roman" w:eastAsia="Times New Roman" w:hAnsi="Times New Roman" w:cs="Times New Roman"/>
+          <w:sz w:val="24"/>
+          <w:szCs w:val="24"/>
+        </w:rPr>
+        <w:t xml:space="preserve">, </w:t>
+      </w:r>
+      <w:r>
+        <w:rPr>
+          <w:rFonts w:ascii="Courier New" w:eastAsia="Times New Roman" w:hAnsi="Courier New" w:cs="Courier New"/>
+          <w:sz w:val="20"/>
+        </w:rPr>
+        <w:t>[3]</w:t>
+      </w:r>
+      <w:r>
+        <w:rPr>
+          <w:rFonts w:ascii="Times New Roman" w:eastAsia="Times New Roman" w:hAnsi="Times New Roman" w:cs="Times New Roman"/>
+          <w:sz w:val="24"/>
+          <w:szCs w:val="24"/>
+        </w:rPr>
+        <w:t xml:space="preserve"> (All split up!)</w:t>
+      </w:r>
+    </w:p>
+    <w:p>
+      <w:pPr>
+        <w:numPr>
+          <w:ilvl w:val="0"/>
+          <w:numId w:val="8"/>
+        </w:numPr>
+        <w:spacing w:before="100" w:beforeAutospacing="1" w:after="100" w:afterAutospacing="1" w:line="240" w:lineRule="auto"/>
+        <w:rPr>
+          <w:rFonts w:ascii="Times New Roman" w:eastAsia="Times New Roman" w:hAnsi="Times New Roman" w:cs="Times New Roman"/>
+          <w:sz w:val="24"/>
+          <w:szCs w:val="24"/>
+        </w:rPr>
+      </w:pPr>
+      <w:r>
+        <w:rPr>
+          <w:rFonts w:ascii="Times New Roman" w:eastAsia="Times New Roman" w:hAnsi="Times New Roman" w:cs="Times New Roman"/>
+          <w:b/>
+          <w:bCs/>
+          <w:sz w:val="24"/>
+          <w:szCs w:val="24"/>
+        </w:rPr>
+        <w:lastRenderedPageBreak/>
+        <w:t>Conquer (Merge backwards):</w:t>
+      </w:r>
+    </w:p>
+    <w:p>
+      <w:pPr>
+        <w:numPr>
+          <w:ilvl w:val="1"/>
+          <w:numId w:val="8"/>
+        </w:numPr>
+        <w:spacing w:before="100" w:beforeAutospacing="1" w:after="100" w:afterAutospacing="1" w:line="240" w:lineRule="auto"/>
+        <w:rPr>
+          <w:rFonts w:ascii="Times New Roman" w:eastAsia="Times New Roman" w:hAnsi="Times New Roman" w:cs="Times New Roman"/>
+          <w:sz w:val="24"/>
+          <w:szCs w:val="24"/>
+        </w:rPr>
+      </w:pPr>
+      <w:r>
+        <w:rPr>
+          <w:rFonts w:ascii="Times New Roman" w:eastAsia="Times New Roman" w:hAnsi="Times New Roman" w:cs="Times New Roman"/>
+          <w:sz w:val="24"/>
+          <w:szCs w:val="24"/>
+        </w:rPr>
+        <w:t xml:space="preserve">Merge </w:t>
+      </w:r>
+      <w:r>
+        <w:rPr>
+          <w:rFonts w:ascii="Courier New" w:eastAsia="Times New Roman" w:hAnsi="Courier New" w:cs="Courier New"/>
+          <w:sz w:val="20"/>
+        </w:rPr>
+        <w:t>[38]</w:t>
+      </w:r>
+      <w:r>
+        <w:rPr>
+          <w:rFonts w:ascii="Times New Roman" w:eastAsia="Times New Roman" w:hAnsi="Times New Roman" w:cs="Times New Roman"/>
+          <w:sz w:val="24"/>
+          <w:szCs w:val="24"/>
+        </w:rPr>
+        <w:t xml:space="preserve"> and </w:t>
+      </w:r>
+      <w:r>
+        <w:rPr>
+          <w:rFonts w:ascii="Courier New" w:eastAsia="Times New Roman" w:hAnsi="Courier New" w:cs="Courier New"/>
+          <w:sz w:val="20"/>
+        </w:rPr>
+        <w:t>[27]</w:t>
+      </w:r>
+      <w:r>
+        <w:rPr>
+          <w:rFonts w:ascii="Times New Roman" w:eastAsia="Times New Roman" w:hAnsi="Times New Roman" w:cs="Times New Roman"/>
+          <w:sz w:val="24"/>
+          <w:szCs w:val="24"/>
+        </w:rPr>
+        <w:t xml:space="preserve"> $\</w:t>
+      </w:r>
+      <w:proofErr w:type="spellStart"/>
+      <w:r>
+        <w:rPr>
+          <w:rFonts w:ascii="Times New Roman" w:eastAsia="Times New Roman" w:hAnsi="Times New Roman" w:cs="Times New Roman"/>
+          <w:sz w:val="24"/>
+          <w:szCs w:val="24"/>
+        </w:rPr>
+        <w:t>rightarrow</w:t>
+      </w:r>
+      <w:proofErr w:type="spellEnd"/>
+      <w:r>
+        <w:rPr>
+          <w:rFonts w:ascii="Times New Roman" w:eastAsia="Times New Roman" w:hAnsi="Times New Roman" w:cs="Times New Roman"/>
+          <w:sz w:val="24"/>
+          <w:szCs w:val="24"/>
+        </w:rPr>
+        <w:t xml:space="preserve">$ </w:t>
+      </w:r>
+      <w:r>
+        <w:rPr>
+          <w:rFonts w:ascii="Courier New" w:eastAsia="Times New Roman" w:hAnsi="Courier New" w:cs="Courier New"/>
+          <w:sz w:val="20"/>
+        </w:rPr>
+        <w:t>[27, 38]</w:t>
+      </w:r>
+    </w:p>
+    <w:p>
+      <w:pPr>
+        <w:numPr>
+          <w:ilvl w:val="1"/>
+          <w:numId w:val="8"/>
+        </w:numPr>
+        <w:spacing w:before="100" w:beforeAutospacing="1" w:after="100" w:afterAutospacing="1" w:line="240" w:lineRule="auto"/>
+        <w:rPr>
+          <w:rFonts w:ascii="Times New Roman" w:eastAsia="Times New Roman" w:hAnsi="Times New Roman" w:cs="Times New Roman"/>
+          <w:sz w:val="24"/>
+          <w:szCs w:val="24"/>
+        </w:rPr>
+      </w:pPr>
+      <w:r>
+        <w:rPr>
+          <w:rFonts w:ascii="Times New Roman" w:eastAsia="Times New Roman" w:hAnsi="Times New Roman" w:cs="Times New Roman"/>
+          <w:sz w:val="24"/>
+          <w:szCs w:val="24"/>
+        </w:rPr>
+        <w:t xml:space="preserve">Merge </w:t>
+      </w:r>
+      <w:r>
+        <w:rPr>
+          <w:rFonts w:ascii="Courier New" w:eastAsia="Times New Roman" w:hAnsi="Courier New" w:cs="Courier New"/>
+          <w:sz w:val="20"/>
+        </w:rPr>
+        <w:t>[43]</w:t>
+      </w:r>
+      <w:r>
+        <w:rPr>
+          <w:rFonts w:ascii="Times New Roman" w:eastAsia="Times New Roman" w:hAnsi="Times New Roman" w:cs="Times New Roman"/>
+          <w:sz w:val="24"/>
+          <w:szCs w:val="24"/>
+        </w:rPr>
+        <w:t xml:space="preserve"> and </w:t>
+      </w:r>
+      <w:r>
+        <w:rPr>
+          <w:rFonts w:ascii="Courier New" w:eastAsia="Times New Roman" w:hAnsi="Courier New" w:cs="Courier New"/>
+          <w:sz w:val="20"/>
+        </w:rPr>
+        <w:t>[3]</w:t>
+      </w:r>
+      <w:r>
+        <w:rPr>
+          <w:rFonts w:ascii="Times New Roman" w:eastAsia="Times New Roman" w:hAnsi="Times New Roman" w:cs="Times New Roman"/>
+          <w:sz w:val="24"/>
+          <w:szCs w:val="24"/>
+        </w:rPr>
+        <w:t xml:space="preserve"> $\</w:t>
+      </w:r>
+      <w:proofErr w:type="spellStart"/>
+      <w:r>
+        <w:rPr>
+          <w:rFonts w:ascii="Times New Roman" w:eastAsia="Times New Roman" w:hAnsi="Times New Roman" w:cs="Times New Roman"/>
+          <w:sz w:val="24"/>
+          <w:szCs w:val="24"/>
+        </w:rPr>
+        <w:t>rightarrow</w:t>
+      </w:r>
+      <w:proofErr w:type="spellEnd"/>
+      <w:r>
+        <w:rPr>
+          <w:rFonts w:ascii="Times New Roman" w:eastAsia="Times New Roman" w:hAnsi="Times New Roman" w:cs="Times New Roman"/>
+          <w:sz w:val="24"/>
+          <w:szCs w:val="24"/>
+        </w:rPr>
+        <w:t xml:space="preserve">$ </w:t>
+      </w:r>
+      <w:r>
+        <w:rPr>
+          <w:rFonts w:ascii="Courier New" w:eastAsia="Times New Roman" w:hAnsi="Courier New" w:cs="Courier New"/>
+          <w:sz w:val="20"/>
+        </w:rPr>
+        <w:t>[3, 43]</w:t>
+      </w:r>
+    </w:p>
+    <w:p>
+      <w:pPr>
+        <w:numPr>
+          <w:ilvl w:val="1"/>
+          <w:numId w:val="8"/>
+        </w:numPr>
+        <w:spacing w:before="100" w:beforeAutospacing="1" w:after="100" w:afterAutospacing="1" w:line="240" w:lineRule="auto"/>
+        <w:rPr>
+          <w:rFonts w:ascii="Times New Roman" w:eastAsia="Times New Roman" w:hAnsi="Times New Roman" w:cs="Times New Roman"/>
+          <w:sz w:val="24"/>
+          <w:szCs w:val="24"/>
+        </w:rPr>
+      </w:pPr>
+      <w:r>
+        <w:rPr>
+          <w:rFonts w:ascii="Times New Roman" w:eastAsia="Times New Roman" w:hAnsi="Times New Roman" w:cs="Times New Roman"/>
+          <w:sz w:val="24"/>
+          <w:szCs w:val="24"/>
+        </w:rPr>
+        <w:t xml:space="preserve">Merge </w:t>
+      </w:r>
+      <w:r>
+        <w:rPr>
+          <w:rFonts w:ascii="Courier New" w:eastAsia="Times New Roman" w:hAnsi="Courier New" w:cs="Courier New"/>
+          <w:sz w:val="20"/>
+        </w:rPr>
+        <w:t>[27, 38]</w:t>
+      </w:r>
+      <w:r>
+        <w:rPr>
+          <w:rFonts w:ascii="Times New Roman" w:eastAsia="Times New Roman" w:hAnsi="Times New Roman" w:cs="Times New Roman"/>
+          <w:sz w:val="24"/>
+          <w:szCs w:val="24"/>
+        </w:rPr>
+        <w:t xml:space="preserve"> and </w:t>
+      </w:r>
+      <w:r>
+        <w:rPr>
+          <w:rFonts w:ascii="Courier New" w:eastAsia="Times New Roman" w:hAnsi="Courier New" w:cs="Courier New"/>
+          <w:sz w:val="20"/>
+        </w:rPr>
+        <w:t>[3, 43]</w:t>
+      </w:r>
+      <w:r>
+        <w:rPr>
+          <w:rFonts w:ascii="Times New Roman" w:eastAsia="Times New Roman" w:hAnsi="Times New Roman" w:cs="Times New Roman"/>
+          <w:sz w:val="24"/>
+          <w:szCs w:val="24"/>
+        </w:rPr>
+        <w:t xml:space="preserve"> $\</w:t>
+      </w:r>
+      <w:proofErr w:type="spellStart"/>
+      <w:r>
+        <w:rPr>
+          <w:rFonts w:ascii="Times New Roman" w:eastAsia="Times New Roman" w:hAnsi="Times New Roman" w:cs="Times New Roman"/>
+          <w:sz w:val="24"/>
+          <w:szCs w:val="24"/>
+        </w:rPr>
+        <w:t>rightarrow</w:t>
+      </w:r>
+      <w:proofErr w:type="spellEnd"/>
+      <w:r>
+        <w:rPr>
+          <w:rFonts w:ascii="Times New Roman" w:eastAsia="Times New Roman" w:hAnsi="Times New Roman" w:cs="Times New Roman"/>
+          <w:sz w:val="24"/>
+          <w:szCs w:val="24"/>
+        </w:rPr>
+        <w:t xml:space="preserve">$ </w:t>
+      </w:r>
+      <w:r>
+        <w:rPr>
+          <w:rFonts w:ascii="Courier New" w:eastAsia="Times New Roman" w:hAnsi="Courier New" w:cs="Courier New"/>
+          <w:sz w:val="20"/>
+        </w:rPr>
+        <w:t>[3, 27, 43, 38]</w:t>
+      </w:r>
+      <w:r>
+        <w:rPr>
+          <w:rFonts w:ascii="Times New Roman" w:eastAsia="Times New Roman" w:hAnsi="Times New Roman" w:cs="Times New Roman"/>
+          <w:sz w:val="24"/>
+          <w:szCs w:val="24"/>
+        </w:rPr>
+        <w:t xml:space="preserve"> $\</w:t>
+      </w:r>
+      <w:proofErr w:type="spellStart"/>
+      <w:r>
+        <w:rPr>
+          <w:rFonts w:ascii="Times New Roman" w:eastAsia="Times New Roman" w:hAnsi="Times New Roman" w:cs="Times New Roman"/>
+          <w:sz w:val="24"/>
+          <w:szCs w:val="24"/>
+        </w:rPr>
+        <w:t>rightarrow</w:t>
+      </w:r>
+      <w:proofErr w:type="spellEnd"/>
+      <w:r>
+        <w:rPr>
+          <w:rFonts w:ascii="Times New Roman" w:eastAsia="Times New Roman" w:hAnsi="Times New Roman" w:cs="Times New Roman"/>
+          <w:sz w:val="24"/>
+          <w:szCs w:val="24"/>
+        </w:rPr>
+        <w:t xml:space="preserve">$ </w:t>
+      </w:r>
+      <w:r>
+        <w:rPr>
+          <w:rFonts w:ascii="Courier New" w:eastAsia="Times New Roman" w:hAnsi="Courier New" w:cs="Courier New"/>
+          <w:sz w:val="20"/>
+        </w:rPr>
+        <w:t>[3, 27, 38, 43]</w:t>
+      </w:r>
+    </w:p>
+    <w:p>
+      <w:pPr>
+        <w:numPr>
+          <w:ilvl w:val="0"/>
+          <w:numId w:val="8"/>
+        </w:numPr>
+        <w:spacing w:before="100" w:beforeAutospacing="1" w:after="100" w:afterAutospacing="1" w:line="240" w:lineRule="auto"/>
+        <w:rPr>
+          <w:rFonts w:ascii="Times New Roman" w:eastAsia="Times New Roman" w:hAnsi="Times New Roman" w:cs="Times New Roman"/>
+          <w:sz w:val="24"/>
+          <w:szCs w:val="24"/>
+        </w:rPr>
+      </w:pPr>
+      <w:r>
+        <w:rPr>
+          <w:rFonts w:ascii="Times New Roman" w:eastAsia="Times New Roman" w:hAnsi="Times New Roman" w:cs="Times New Roman"/>
+          <w:b/>
+          <w:bCs/>
+          <w:sz w:val="24"/>
+          <w:szCs w:val="24"/>
+        </w:rPr>
+        <w:t>Result:</w:t>
+      </w:r>
+      <w:r>
+        <w:rPr>
+          <w:rFonts w:ascii="Times New Roman" w:eastAsia="Times New Roman" w:hAnsi="Times New Roman" w:cs="Times New Roman"/>
+          <w:sz w:val="24"/>
+          <w:szCs w:val="24"/>
+        </w:rPr>
+        <w:t xml:space="preserve"> </w:t>
+      </w:r>
+      <w:r>
+        <w:rPr>
+          <w:rFonts w:ascii="Courier New" w:eastAsia="Times New Roman" w:hAnsi="Courier New" w:cs="Courier New"/>
+          <w:sz w:val="20"/>
+        </w:rPr>
+        <w:t>[3, 27, 38, 43]</w:t>
+      </w:r>
+    </w:p>
+    <w:p>
+      <w:pPr>
+        <w:spacing w:before="100" w:beforeAutospacing="1" w:after="100" w:afterAutospacing="1" w:line="240" w:lineRule="auto"/>
+        <w:outlineLvl w:val="2"/>
+        <w:rPr>
+          <w:rFonts w:ascii="Times New Roman" w:eastAsia="Times New Roman" w:hAnsi="Times New Roman" w:cs="Times New Roman"/>
+          <w:b/>
+          <w:bCs/>
+          <w:sz w:val="27"/>
+          <w:szCs w:val="27"/>
+        </w:rPr>
+      </w:pPr>
+      <w:r>
+        <w:rPr>
+          <w:rFonts w:ascii="Times New Roman" w:eastAsia="Times New Roman" w:hAnsi="Times New Roman" w:cs="Times New Roman"/>
+          <w:b/>
+          <w:bCs/>
+          <w:sz w:val="27"/>
+          <w:szCs w:val="27"/>
+        </w:rPr>
+        <w:t>Complexity &amp; Efficiency</w:t>
+      </w:r>
+    </w:p>
+    <w:p>
+      <w:pPr>
+        <w:spacing w:before="100" w:beforeAutospacing="1" w:after="100" w:afterAutospacing="1" w:line="240" w:lineRule="auto"/>
+        <w:rPr>
+          <w:rFonts w:ascii="Times New Roman" w:eastAsia="Times New Roman" w:hAnsi="Times New Roman" w:cs="Times New Roman"/>
+          <w:sz w:val="24"/>
+          <w:szCs w:val="24"/>
+        </w:rPr>
+      </w:pPr>
+      <w:r>
+        <w:rPr>
+          <w:rFonts w:ascii="Times New Roman" w:eastAsia="Times New Roman" w:hAnsi="Times New Roman" w:cs="Times New Roman"/>
+          <w:sz w:val="24"/>
+          <w:szCs w:val="24"/>
+        </w:rPr>
+        <w:t>Merge Sort is incredibly reliable. It doesn't care if your data is perfectly sorted, completely backwards, or totally random—it takes the exact same amount of time.</w:t>
+      </w:r>
+    </w:p>
+    <w:tbl>
+      <w:tblPr>
+        <w:tblW w:w="0" w:type="auto"/>
+        <w:tblCellSpacing w:w="15" w:type="dxa"/>
+        <w:tblCellMar>
+          <w:top w:w="15" w:type="dxa"/>
+          <w:left w:w="15" w:type="dxa"/>
+          <w:bottom w:w="15" w:type="dxa"/>
+          <w:right w:w="15" w:type="dxa"/>
+        </w:tblCellMar>
+        <w:tblLook w:val="04A0"/>
+      </w:tblPr>
+      <w:tblGrid>
+        <w:gridCol w:w="2048"/>
+        <w:gridCol w:w="6767"/>
+      </w:tblGrid>
+      <w:tr>
+        <w:trPr>
+          <w:tblHeader/>
+          <w:tblCellSpacing w:w="15" w:type="dxa"/>
+        </w:trPr>
+        <w:tc>
+          <w:tcPr>
+            <w:tcW w:w="0" w:type="auto"/>
+            <w:tcBorders>
+              <w:top w:val="single" w:sz="4" w:space="0" w:color="auto"/>
+              <w:left w:val="single" w:sz="4" w:space="0" w:color="auto"/>
+              <w:bottom w:val="single" w:sz="4" w:space="0" w:color="auto"/>
+              <w:right w:val="single" w:sz="4" w:space="0" w:color="auto"/>
+            </w:tcBorders>
+            <w:vAlign w:val="center"/>
+            <w:hideMark/>
+          </w:tcPr>
+          <w:p>
+            <w:pPr>
+              <w:spacing w:after="320" w:line="240" w:lineRule="auto"/>
+              <w:rPr>
+                <w:rFonts w:ascii="Times New Roman" w:eastAsia="Times New Roman" w:hAnsi="Times New Roman" w:cs="Times New Roman"/>
+                <w:sz w:val="24"/>
+                <w:szCs w:val="24"/>
+              </w:rPr>
+            </w:pPr>
+            <w:r>
+              <w:rPr>
+                <w:rFonts w:ascii="Times New Roman" w:eastAsia="Times New Roman" w:hAnsi="Times New Roman" w:cs="Times New Roman"/>
+                <w:b/>
+                <w:bCs/>
+                <w:sz w:val="24"/>
+                <w:szCs w:val="24"/>
+              </w:rPr>
+              <w:t>Metric</w:t>
+            </w:r>
+          </w:p>
+        </w:tc>
+        <w:tc>
+          <w:tcPr>
+            <w:tcW w:w="0" w:type="auto"/>
+            <w:tcBorders>
+              <w:top w:val="single" w:sz="4" w:space="0" w:color="auto"/>
+              <w:left w:val="single" w:sz="4" w:space="0" w:color="auto"/>
+              <w:bottom w:val="single" w:sz="4" w:space="0" w:color="auto"/>
+              <w:right w:val="single" w:sz="4" w:space="0" w:color="auto"/>
+            </w:tcBorders>
+            <w:vAlign w:val="center"/>
+            <w:hideMark/>
+          </w:tcPr>
+          <w:p>
+            <w:pPr>
+              <w:spacing w:after="320" w:line="240" w:lineRule="auto"/>
+              <w:rPr>
+                <w:rFonts w:ascii="Times New Roman" w:eastAsia="Times New Roman" w:hAnsi="Times New Roman" w:cs="Times New Roman"/>
+                <w:sz w:val="24"/>
+                <w:szCs w:val="24"/>
+              </w:rPr>
+            </w:pPr>
+            <w:r>
+              <w:rPr>
+                <w:rFonts w:ascii="Times New Roman" w:eastAsia="Times New Roman" w:hAnsi="Times New Roman" w:cs="Times New Roman"/>
+                <w:b/>
+                <w:bCs/>
+                <w:sz w:val="24"/>
+                <w:szCs w:val="24"/>
+              </w:rPr>
+              <w:t>Complexity</w:t>
+            </w:r>
+          </w:p>
+        </w:tc>
+      </w:tr>
+      <w:tr>
+        <w:trPr>
+          <w:tblCellSpacing w:w="15" w:type="dxa"/>
+        </w:trPr>
+        <w:tc>
+          <w:tcPr>
+            <w:tcW w:w="0" w:type="auto"/>
+            <w:tcBorders>
+              <w:top w:val="single" w:sz="4" w:space="0" w:color="auto"/>
+              <w:left w:val="single" w:sz="4" w:space="0" w:color="auto"/>
+              <w:bottom w:val="single" w:sz="4" w:space="0" w:color="auto"/>
+              <w:right w:val="single" w:sz="4" w:space="0" w:color="auto"/>
+            </w:tcBorders>
+            <w:vAlign w:val="center"/>
+            <w:hideMark/>
+          </w:tcPr>
+          <w:p>
+            <w:pPr>
+              <w:spacing w:after="320" w:line="240" w:lineRule="auto"/>
+              <w:rPr>
+                <w:rFonts w:ascii="Times New Roman" w:eastAsia="Times New Roman" w:hAnsi="Times New Roman" w:cs="Times New Roman"/>
+                <w:sz w:val="24"/>
+                <w:szCs w:val="24"/>
+              </w:rPr>
+            </w:pPr>
+            <w:r>
+              <w:rPr>
+                <w:rFonts w:ascii="Times New Roman" w:eastAsia="Times New Roman" w:hAnsi="Times New Roman" w:cs="Times New Roman"/>
+                <w:b/>
+                <w:bCs/>
+                <w:sz w:val="24"/>
+                <w:szCs w:val="24"/>
+              </w:rPr>
+              <w:t>Worst-case Time</w:t>
+            </w:r>
+          </w:p>
+        </w:tc>
+        <w:tc>
+          <w:tcPr>
+            <w:tcW w:w="0" w:type="auto"/>
+            <w:tcBorders>
+              <w:top w:val="single" w:sz="4" w:space="0" w:color="auto"/>
+              <w:left w:val="single" w:sz="4" w:space="0" w:color="auto"/>
+              <w:bottom w:val="single" w:sz="4" w:space="0" w:color="auto"/>
+              <w:right w:val="single" w:sz="4" w:space="0" w:color="auto"/>
+            </w:tcBorders>
+            <w:vAlign w:val="center"/>
+            <w:hideMark/>
+          </w:tcPr>
+          <w:p>
+            <w:pPr>
+              <w:spacing w:after="320" w:line="240" w:lineRule="auto"/>
+              <w:rPr>
+                <w:rFonts w:ascii="Times New Roman" w:eastAsia="Times New Roman" w:hAnsi="Times New Roman" w:cs="Times New Roman"/>
+                <w:sz w:val="24"/>
+                <w:szCs w:val="24"/>
+              </w:rPr>
+            </w:pPr>
+            <w:r>
+              <w:rPr>
+                <w:rFonts w:ascii="Times New Roman" w:eastAsia="Times New Roman" w:hAnsi="Times New Roman" w:cs="Times New Roman"/>
+                <w:sz w:val="24"/>
+                <w:szCs w:val="24"/>
+              </w:rPr>
+              <w:t>$O(n \log n)$</w:t>
+            </w:r>
+          </w:p>
+        </w:tc>
+      </w:tr>
+      <w:tr>
+        <w:trPr>
+          <w:tblCellSpacing w:w="15" w:type="dxa"/>
+        </w:trPr>
+        <w:tc>
+          <w:tcPr>
+            <w:tcW w:w="0" w:type="auto"/>
+            <w:tcBorders>
+              <w:top w:val="single" w:sz="4" w:space="0" w:color="auto"/>
+              <w:left w:val="single" w:sz="4" w:space="0" w:color="auto"/>
+              <w:bottom w:val="single" w:sz="4" w:space="0" w:color="auto"/>
+              <w:right w:val="single" w:sz="4" w:space="0" w:color="auto"/>
+            </w:tcBorders>
+            <w:vAlign w:val="center"/>
+            <w:hideMark/>
+          </w:tcPr>
+          <w:p>
+            <w:pPr>
+              <w:spacing w:after="320" w:line="240" w:lineRule="auto"/>
+              <w:rPr>
+                <w:rFonts w:ascii="Times New Roman" w:eastAsia="Times New Roman" w:hAnsi="Times New Roman" w:cs="Times New Roman"/>
+                <w:sz w:val="24"/>
+                <w:szCs w:val="24"/>
+              </w:rPr>
+            </w:pPr>
+            <w:r>
+              <w:rPr>
+                <w:rFonts w:ascii="Times New Roman" w:eastAsia="Times New Roman" w:hAnsi="Times New Roman" w:cs="Times New Roman"/>
+                <w:b/>
+                <w:bCs/>
+                <w:sz w:val="24"/>
+                <w:szCs w:val="24"/>
+              </w:rPr>
+              <w:t>Average-case Time</w:t>
+            </w:r>
+          </w:p>
+        </w:tc>
+        <w:tc>
+          <w:tcPr>
+            <w:tcW w:w="0" w:type="auto"/>
+            <w:tcBorders>
+              <w:top w:val="single" w:sz="4" w:space="0" w:color="auto"/>
+              <w:left w:val="single" w:sz="4" w:space="0" w:color="auto"/>
+              <w:bottom w:val="single" w:sz="4" w:space="0" w:color="auto"/>
+              <w:right w:val="single" w:sz="4" w:space="0" w:color="auto"/>
+            </w:tcBorders>
+            <w:vAlign w:val="center"/>
+            <w:hideMark/>
+          </w:tcPr>
+          <w:p>
+            <w:pPr>
+              <w:spacing w:after="320" w:line="240" w:lineRule="auto"/>
+              <w:rPr>
+                <w:rFonts w:ascii="Times New Roman" w:eastAsia="Times New Roman" w:hAnsi="Times New Roman" w:cs="Times New Roman"/>
+                <w:sz w:val="24"/>
+                <w:szCs w:val="24"/>
+              </w:rPr>
+            </w:pPr>
+            <w:r>
+              <w:rPr>
+                <w:rFonts w:ascii="Times New Roman" w:eastAsia="Times New Roman" w:hAnsi="Times New Roman" w:cs="Times New Roman"/>
+                <w:sz w:val="24"/>
+                <w:szCs w:val="24"/>
+              </w:rPr>
+              <w:t>$O(n \log n)$</w:t>
+            </w:r>
+          </w:p>
+        </w:tc>
+      </w:tr>
+      <w:tr>
+        <w:trPr>
+          <w:tblCellSpacing w:w="15" w:type="dxa"/>
+        </w:trPr>
+        <w:tc>
+          <w:tcPr>
+            <w:tcW w:w="0" w:type="auto"/>
+            <w:tcBorders>
+              <w:top w:val="single" w:sz="4" w:space="0" w:color="auto"/>
+              <w:left w:val="single" w:sz="4" w:space="0" w:color="auto"/>
+              <w:bottom w:val="single" w:sz="4" w:space="0" w:color="auto"/>
+              <w:right w:val="single" w:sz="4" w:space="0" w:color="auto"/>
+            </w:tcBorders>
+            <w:vAlign w:val="center"/>
+            <w:hideMark/>
+          </w:tcPr>
+          <w:p>
+            <w:pPr>
+              <w:spacing w:after="320" w:line="240" w:lineRule="auto"/>
+              <w:rPr>
+                <w:rFonts w:ascii="Times New Roman" w:eastAsia="Times New Roman" w:hAnsi="Times New Roman" w:cs="Times New Roman"/>
+                <w:sz w:val="24"/>
+                <w:szCs w:val="24"/>
+              </w:rPr>
+            </w:pPr>
+            <w:r>
+              <w:rPr>
+                <w:rFonts w:ascii="Times New Roman" w:eastAsia="Times New Roman" w:hAnsi="Times New Roman" w:cs="Times New Roman"/>
+                <w:b/>
+                <w:bCs/>
+                <w:sz w:val="24"/>
+                <w:szCs w:val="24"/>
+              </w:rPr>
+              <w:t>Best-case Time</w:t>
+            </w:r>
+          </w:p>
+        </w:tc>
+        <w:tc>
+          <w:tcPr>
+            <w:tcW w:w="0" w:type="auto"/>
+            <w:tcBorders>
+              <w:top w:val="single" w:sz="4" w:space="0" w:color="auto"/>
+              <w:left w:val="single" w:sz="4" w:space="0" w:color="auto"/>
+              <w:bottom w:val="single" w:sz="4" w:space="0" w:color="auto"/>
+              <w:right w:val="single" w:sz="4" w:space="0" w:color="auto"/>
+            </w:tcBorders>
+            <w:vAlign w:val="center"/>
+            <w:hideMark/>
+          </w:tcPr>
+          <w:p>
+            <w:pPr>
+              <w:spacing w:after="320" w:line="240" w:lineRule="auto"/>
+              <w:rPr>
+                <w:rFonts w:ascii="Times New Roman" w:eastAsia="Times New Roman" w:hAnsi="Times New Roman" w:cs="Times New Roman"/>
+                <w:sz w:val="24"/>
+                <w:szCs w:val="24"/>
+              </w:rPr>
+            </w:pPr>
+            <w:r>
+              <w:rPr>
+                <w:rFonts w:ascii="Times New Roman" w:eastAsia="Times New Roman" w:hAnsi="Times New Roman" w:cs="Times New Roman"/>
+                <w:sz w:val="24"/>
+                <w:szCs w:val="24"/>
+              </w:rPr>
+              <w:t>$O(n \log n)$</w:t>
+            </w:r>
+          </w:p>
+        </w:tc>
+      </w:tr>
+      <w:tr>
+        <w:trPr>
+          <w:tblCellSpacing w:w="15" w:type="dxa"/>
+        </w:trPr>
+        <w:tc>
+          <w:tcPr>
+            <w:tcW w:w="0" w:type="auto"/>
+            <w:tcBorders>
+              <w:top w:val="single" w:sz="4" w:space="0" w:color="auto"/>
+              <w:left w:val="single" w:sz="4" w:space="0" w:color="auto"/>
+              <w:bottom w:val="single" w:sz="4" w:space="0" w:color="auto"/>
+              <w:right w:val="single" w:sz="4" w:space="0" w:color="auto"/>
+            </w:tcBorders>
+            <w:vAlign w:val="center"/>
+            <w:hideMark/>
+          </w:tcPr>
+          <w:p>
+            <w:pPr>
+              <w:spacing w:after="320" w:line="240" w:lineRule="auto"/>
+              <w:rPr>
+                <w:rFonts w:ascii="Times New Roman" w:eastAsia="Times New Roman" w:hAnsi="Times New Roman" w:cs="Times New Roman"/>
+                <w:sz w:val="24"/>
+                <w:szCs w:val="24"/>
+              </w:rPr>
+            </w:pPr>
+            <w:r>
+              <w:rPr>
+                <w:rFonts w:ascii="Times New Roman" w:eastAsia="Times New Roman" w:hAnsi="Times New Roman" w:cs="Times New Roman"/>
+                <w:b/>
+                <w:bCs/>
+                <w:sz w:val="24"/>
+                <w:szCs w:val="24"/>
+              </w:rPr>
+              <w:t>Space Complexity</w:t>
+            </w:r>
+          </w:p>
+        </w:tc>
+        <w:tc>
+          <w:tcPr>
+            <w:tcW w:w="0" w:type="auto"/>
+            <w:tcBorders>
+              <w:top w:val="single" w:sz="4" w:space="0" w:color="auto"/>
+              <w:left w:val="single" w:sz="4" w:space="0" w:color="auto"/>
+              <w:bottom w:val="single" w:sz="4" w:space="0" w:color="auto"/>
+              <w:right w:val="single" w:sz="4" w:space="0" w:color="auto"/>
+            </w:tcBorders>
+            <w:vAlign w:val="center"/>
+            <w:hideMark/>
+          </w:tcPr>
+          <w:p>
+            <w:pPr>
+              <w:spacing w:after="320" w:line="240" w:lineRule="auto"/>
+              <w:rPr>
+                <w:rFonts w:ascii="Times New Roman" w:eastAsia="Times New Roman" w:hAnsi="Times New Roman" w:cs="Times New Roman"/>
+                <w:sz w:val="24"/>
+                <w:szCs w:val="24"/>
+              </w:rPr>
+            </w:pPr>
+            <w:r>
+              <w:rPr>
+                <w:rFonts w:ascii="Times New Roman" w:eastAsia="Times New Roman" w:hAnsi="Times New Roman" w:cs="Times New Roman"/>
+                <w:sz w:val="24"/>
+                <w:szCs w:val="24"/>
+              </w:rPr>
+              <w:t>$O(n)$ (</w:t>
+            </w:r>
+            <w:r>
+              <w:rPr>
+                <w:rFonts w:ascii="Times New Roman" w:eastAsia="Times New Roman" w:hAnsi="Times New Roman" w:cs="Times New Roman"/>
+                <w:b/>
+                <w:bCs/>
+                <w:sz w:val="24"/>
+                <w:szCs w:val="24"/>
+              </w:rPr>
+              <w:t>Not</w:t>
+            </w:r>
+            <w:r>
+              <w:rPr>
+                <w:rFonts w:ascii="Times New Roman" w:eastAsia="Times New Roman" w:hAnsi="Times New Roman" w:cs="Times New Roman"/>
+                <w:sz w:val="24"/>
+                <w:szCs w:val="24"/>
+              </w:rPr>
+              <w:t xml:space="preserve"> in-place; it requires extra memory to build the new lists)</w:t>
+            </w:r>
+          </w:p>
+        </w:tc>
+      </w:tr>
+      <w:tr>
+        <w:trPr>
+          <w:tblCellSpacing w:w="15" w:type="dxa"/>
+        </w:trPr>
+        <w:tc>
+          <w:tcPr>
+            <w:tcW w:w="0" w:type="auto"/>
+            <w:tcBorders>
+              <w:top w:val="single" w:sz="4" w:space="0" w:color="auto"/>
+              <w:left w:val="single" w:sz="4" w:space="0" w:color="auto"/>
+              <w:bottom w:val="single" w:sz="4" w:space="0" w:color="auto"/>
+              <w:right w:val="single" w:sz="4" w:space="0" w:color="auto"/>
+            </w:tcBorders>
+            <w:vAlign w:val="center"/>
+            <w:hideMark/>
+          </w:tcPr>
+          <w:p>
+            <w:pPr>
+              <w:spacing w:after="320" w:line="240" w:lineRule="auto"/>
+              <w:rPr>
+                <w:rFonts w:ascii="Times New Roman" w:eastAsia="Times New Roman" w:hAnsi="Times New Roman" w:cs="Times New Roman"/>
+                <w:sz w:val="24"/>
+                <w:szCs w:val="24"/>
+              </w:rPr>
+            </w:pPr>
+            <w:r>
+              <w:rPr>
+                <w:rFonts w:ascii="Times New Roman" w:eastAsia="Times New Roman" w:hAnsi="Times New Roman" w:cs="Times New Roman"/>
+                <w:b/>
+                <w:bCs/>
+                <w:sz w:val="24"/>
+                <w:szCs w:val="24"/>
+              </w:rPr>
+              <w:t>Stability</w:t>
+            </w:r>
+          </w:p>
+        </w:tc>
+        <w:tc>
+          <w:tcPr>
+            <w:tcW w:w="0" w:type="auto"/>
+            <w:tcBorders>
+              <w:top w:val="single" w:sz="4" w:space="0" w:color="auto"/>
+              <w:left w:val="single" w:sz="4" w:space="0" w:color="auto"/>
+              <w:bottom w:val="single" w:sz="4" w:space="0" w:color="auto"/>
+              <w:right w:val="single" w:sz="4" w:space="0" w:color="auto"/>
+            </w:tcBorders>
+            <w:vAlign w:val="center"/>
+            <w:hideMark/>
+          </w:tcPr>
+          <w:p>
+            <w:pPr>
+              <w:spacing w:after="320" w:line="240" w:lineRule="auto"/>
+              <w:rPr>
+                <w:rFonts w:ascii="Times New Roman" w:eastAsia="Times New Roman" w:hAnsi="Times New Roman" w:cs="Times New Roman"/>
+                <w:sz w:val="24"/>
+                <w:szCs w:val="24"/>
+              </w:rPr>
+            </w:pPr>
+            <w:r>
+              <w:rPr>
+                <w:rFonts w:ascii="Times New Roman" w:eastAsia="Times New Roman" w:hAnsi="Times New Roman" w:cs="Times New Roman"/>
+                <w:b/>
+                <w:bCs/>
+                <w:sz w:val="24"/>
+                <w:szCs w:val="24"/>
+              </w:rPr>
+              <w:t>Stable</w:t>
+            </w:r>
+            <w:r>
+              <w:rPr>
+                <w:rFonts w:ascii="Times New Roman" w:eastAsia="Times New Roman" w:hAnsi="Times New Roman" w:cs="Times New Roman"/>
+                <w:sz w:val="24"/>
+                <w:szCs w:val="24"/>
+              </w:rPr>
+              <w:t xml:space="preserve"> (Preserves original order of duplicates)</w:t>
+            </w:r>
+          </w:p>
+        </w:tc>
+      </w:tr>
+    </w:tbl>
+    <w:p>
+      <w:pPr>
+        <w:jc w:val="center"/>
+        <w:rPr>
+          <w:b/>
+          <w:sz w:val="36"/>
+          <w:szCs w:val="36"/>
+        </w:rPr>
+      </w:pPr>
+    </w:p>
     <w:sectPr>
       <w:pgSz w:w="12240" w:h="15840"/>
       <w:pgMar w:top="1440" w:right="1440" w:bottom="1440" w:left="1440" w:header="720" w:footer="720" w:gutter="0"/>
@@ -3675,6 +4910,155 @@
     </w:lvl>
   </w:abstractNum>
   <w:abstractNum w:abstractNumId="2">
+    <w:nsid w:val="1E7F29B8"/>
+    <w:multiLevelType w:val="multilevel"/>
+    <w:tmpl w:val="4CBEA328"/>
+    <w:lvl w:ilvl="0">
+      <w:start w:val="1"/>
+      <w:numFmt w:val="bullet"/>
+      <w:lvlText w:val=""/>
+      <w:lvlJc w:val="left"/>
+      <w:pPr>
+        <w:tabs>
+          <w:tab w:val="num" w:pos="720"/>
+        </w:tabs>
+        <w:ind w:left="720" w:hanging="360"/>
+      </w:pPr>
+      <w:rPr>
+        <w:rFonts w:ascii="Symbol" w:hAnsi="Symbol" w:hint="default"/>
+        <w:sz w:val="20"/>
+      </w:rPr>
+    </w:lvl>
+    <w:lvl w:ilvl="1">
+      <w:start w:val="1"/>
+      <w:numFmt w:val="bullet"/>
+      <w:lvlText w:val="o"/>
+      <w:lvlJc w:val="left"/>
+      <w:pPr>
+        <w:tabs>
+          <w:tab w:val="num" w:pos="1440"/>
+        </w:tabs>
+        <w:ind w:left="1440" w:hanging="360"/>
+      </w:pPr>
+      <w:rPr>
+        <w:rFonts w:ascii="Courier New" w:hAnsi="Courier New" w:hint="default"/>
+        <w:sz w:val="20"/>
+      </w:rPr>
+    </w:lvl>
+    <w:lvl w:ilvl="2" w:tentative="1">
+      <w:start w:val="1"/>
+      <w:numFmt w:val="bullet"/>
+      <w:lvlText w:val=""/>
+      <w:lvlJc w:val="left"/>
+      <w:pPr>
+        <w:tabs>
+          <w:tab w:val="num" w:pos="2160"/>
+        </w:tabs>
+        <w:ind w:left="2160" w:hanging="360"/>
+      </w:pPr>
+      <w:rPr>
+        <w:rFonts w:ascii="Wingdings" w:hAnsi="Wingdings" w:hint="default"/>
+        <w:sz w:val="20"/>
+      </w:rPr>
+    </w:lvl>
+    <w:lvl w:ilvl="3" w:tentative="1">
+      <w:start w:val="1"/>
+      <w:numFmt w:val="bullet"/>
+      <w:lvlText w:val=""/>
+      <w:lvlJc w:val="left"/>
+      <w:pPr>
+        <w:tabs>
+          <w:tab w:val="num" w:pos="2880"/>
+        </w:tabs>
+        <w:ind w:left="2880" w:hanging="360"/>
+      </w:pPr>
+      <w:rPr>
+        <w:rFonts w:ascii="Wingdings" w:hAnsi="Wingdings" w:hint="default"/>
+        <w:sz w:val="20"/>
+      </w:rPr>
+    </w:lvl>
+    <w:lvl w:ilvl="4" w:tentative="1">
+      <w:start w:val="1"/>
+      <w:numFmt w:val="bullet"/>
+      <w:lvlText w:val=""/>
+      <w:lvlJc w:val="left"/>
+      <w:pPr>
+        <w:tabs>
+          <w:tab w:val="num" w:pos="3600"/>
+        </w:tabs>
+        <w:ind w:left="3600" w:hanging="360"/>
+      </w:pPr>
+      <w:rPr>
+        <w:rFonts w:ascii="Wingdings" w:hAnsi="Wingdings" w:hint="default"/>
+        <w:sz w:val="20"/>
+      </w:rPr>
+    </w:lvl>
+    <w:lvl w:ilvl="5" w:tentative="1">
+      <w:start w:val="1"/>
+      <w:numFmt w:val="bullet"/>
+      <w:lvlText w:val=""/>
+      <w:lvlJc w:val="left"/>
+      <w:pPr>
+        <w:tabs>
+          <w:tab w:val="num" w:pos="4320"/>
+        </w:tabs>
+        <w:ind w:left="4320" w:hanging="360"/>
+      </w:pPr>
+      <w:rPr>
+        <w:rFonts w:ascii="Wingdings" w:hAnsi="Wingdings" w:hint="default"/>
+        <w:sz w:val="20"/>
+      </w:rPr>
+    </w:lvl>
+    <w:lvl w:ilvl="6" w:tentative="1">
+      <w:start w:val="1"/>
+      <w:numFmt w:val="bullet"/>
+      <w:lvlText w:val=""/>
+      <w:lvlJc w:val="left"/>
+      <w:pPr>
+        <w:tabs>
+          <w:tab w:val="num" w:pos="5040"/>
+        </w:tabs>
+        <w:ind w:left="5040" w:hanging="360"/>
+      </w:pPr>
+      <w:rPr>
+        <w:rFonts w:ascii="Wingdings" w:hAnsi="Wingdings" w:hint="default"/>
+        <w:sz w:val="20"/>
+      </w:rPr>
+    </w:lvl>
+    <w:lvl w:ilvl="7" w:tentative="1">
+      <w:start w:val="1"/>
+      <w:numFmt w:val="bullet"/>
+      <w:lvlText w:val=""/>
+      <w:lvlJc w:val="left"/>
+      <w:pPr>
+        <w:tabs>
+          <w:tab w:val="num" w:pos="5760"/>
+        </w:tabs>
+        <w:ind w:left="5760" w:hanging="360"/>
+      </w:pPr>
+      <w:rPr>
+        <w:rFonts w:ascii="Wingdings" w:hAnsi="Wingdings" w:hint="default"/>
+        <w:sz w:val="20"/>
+      </w:rPr>
+    </w:lvl>
+    <w:lvl w:ilvl="8" w:tentative="1">
+      <w:start w:val="1"/>
+      <w:numFmt w:val="bullet"/>
+      <w:lvlText w:val=""/>
+      <w:lvlJc w:val="left"/>
+      <w:pPr>
+        <w:tabs>
+          <w:tab w:val="num" w:pos="6480"/>
+        </w:tabs>
+        <w:ind w:left="6480" w:hanging="360"/>
+      </w:pPr>
+      <w:rPr>
+        <w:rFonts w:ascii="Wingdings" w:hAnsi="Wingdings" w:hint="default"/>
+        <w:sz w:val="20"/>
+      </w:rPr>
+    </w:lvl>
+  </w:abstractNum>
+  <w:abstractNum w:abstractNumId="3">
     <w:nsid w:val="354C54D5"/>
     <w:multiLevelType w:val="multilevel"/>
     <w:tmpl w:val="613A4A8C"/>
@@ -3787,7 +5171,7 @@
       </w:pPr>
     </w:lvl>
   </w:abstractNum>
-  <w:abstractNum w:abstractNumId="3">
+  <w:abstractNum w:abstractNumId="4">
     <w:nsid w:val="3A35349D"/>
     <w:multiLevelType w:val="multilevel"/>
     <w:tmpl w:val="2C48345A"/>
@@ -3936,7 +5320,7 @@
       </w:rPr>
     </w:lvl>
   </w:abstractNum>
-  <w:abstractNum w:abstractNumId="4">
+  <w:abstractNum w:abstractNumId="5">
     <w:nsid w:val="3C973128"/>
     <w:multiLevelType w:val="multilevel"/>
     <w:tmpl w:val="277C0526"/>
@@ -4049,7 +5433,120 @@
       </w:pPr>
     </w:lvl>
   </w:abstractNum>
-  <w:abstractNum w:abstractNumId="5">
+  <w:abstractNum w:abstractNumId="6">
+    <w:nsid w:val="595278FC"/>
+    <w:multiLevelType w:val="multilevel"/>
+    <w:tmpl w:val="3908365E"/>
+    <w:lvl w:ilvl="0">
+      <w:start w:val="1"/>
+      <w:numFmt w:val="decimal"/>
+      <w:lvlText w:val="%1."/>
+      <w:lvlJc w:val="left"/>
+      <w:pPr>
+        <w:tabs>
+          <w:tab w:val="num" w:pos="720"/>
+        </w:tabs>
+        <w:ind w:left="720" w:hanging="360"/>
+      </w:pPr>
+    </w:lvl>
+    <w:lvl w:ilvl="1" w:tentative="1">
+      <w:start w:val="1"/>
+      <w:numFmt w:val="decimal"/>
+      <w:lvlText w:val="%2."/>
+      <w:lvlJc w:val="left"/>
+      <w:pPr>
+        <w:tabs>
+          <w:tab w:val="num" w:pos="1440"/>
+        </w:tabs>
+        <w:ind w:left="1440" w:hanging="360"/>
+      </w:pPr>
+    </w:lvl>
+    <w:lvl w:ilvl="2" w:tentative="1">
+      <w:start w:val="1"/>
+      <w:numFmt w:val="decimal"/>
+      <w:lvlText w:val="%3."/>
+      <w:lvlJc w:val="left"/>
+      <w:pPr>
+        <w:tabs>
+          <w:tab w:val="num" w:pos="2160"/>
+        </w:tabs>
+        <w:ind w:left="2160" w:hanging="360"/>
+      </w:pPr>
+    </w:lvl>
+    <w:lvl w:ilvl="3" w:tentative="1">
+      <w:start w:val="1"/>
+      <w:numFmt w:val="decimal"/>
+      <w:lvlText w:val="%4."/>
+      <w:lvlJc w:val="left"/>
+      <w:pPr>
+        <w:tabs>
+          <w:tab w:val="num" w:pos="2880"/>
+        </w:tabs>
+        <w:ind w:left="2880" w:hanging="360"/>
+      </w:pPr>
+    </w:lvl>
+    <w:lvl w:ilvl="4" w:tentative="1">
+      <w:start w:val="1"/>
+      <w:numFmt w:val="decimal"/>
+      <w:lvlText w:val="%5."/>
+      <w:lvlJc w:val="left"/>
+      <w:pPr>
+        <w:tabs>
+          <w:tab w:val="num" w:pos="3600"/>
+        </w:tabs>
+        <w:ind w:left="3600" w:hanging="360"/>
+      </w:pPr>
+    </w:lvl>
+    <w:lvl w:ilvl="5" w:tentative="1">
+      <w:start w:val="1"/>
+      <w:numFmt w:val="decimal"/>
+      <w:lvlText w:val="%6."/>
+      <w:lvlJc w:val="left"/>
+      <w:pPr>
+        <w:tabs>
+          <w:tab w:val="num" w:pos="4320"/>
+        </w:tabs>
+        <w:ind w:left="4320" w:hanging="360"/>
+      </w:pPr>
+    </w:lvl>
+    <w:lvl w:ilvl="6" w:tentative="1">
+      <w:start w:val="1"/>
+      <w:numFmt w:val="decimal"/>
+      <w:lvlText w:val="%7."/>
+      <w:lvlJc w:val="left"/>
+      <w:pPr>
+        <w:tabs>
+          <w:tab w:val="num" w:pos="5040"/>
+        </w:tabs>
+        <w:ind w:left="5040" w:hanging="360"/>
+      </w:pPr>
+    </w:lvl>
+    <w:lvl w:ilvl="7" w:tentative="1">
+      <w:start w:val="1"/>
+      <w:numFmt w:val="decimal"/>
+      <w:lvlText w:val="%8."/>
+      <w:lvlJc w:val="left"/>
+      <w:pPr>
+        <w:tabs>
+          <w:tab w:val="num" w:pos="5760"/>
+        </w:tabs>
+        <w:ind w:left="5760" w:hanging="360"/>
+      </w:pPr>
+    </w:lvl>
+    <w:lvl w:ilvl="8" w:tentative="1">
+      <w:start w:val="1"/>
+      <w:numFmt w:val="decimal"/>
+      <w:lvlText w:val="%9."/>
+      <w:lvlJc w:val="left"/>
+      <w:pPr>
+        <w:tabs>
+          <w:tab w:val="num" w:pos="6480"/>
+        </w:tabs>
+        <w:ind w:left="6480" w:hanging="360"/>
+      </w:pPr>
+    </w:lvl>
+  </w:abstractNum>
+  <w:abstractNum w:abstractNumId="7">
     <w:nsid w:val="67B67538"/>
     <w:multiLevelType w:val="multilevel"/>
     <w:tmpl w:val="6FD26896"/>
@@ -4205,16 +5702,22 @@
     <w:abstractNumId w:val="1"/>
   </w:num>
   <w:num w:numId="3">
+    <w:abstractNumId w:val="5"/>
+  </w:num>
+  <w:num w:numId="4">
+    <w:abstractNumId w:val="7"/>
+  </w:num>
+  <w:num w:numId="5">
+    <w:abstractNumId w:val="3"/>
+  </w:num>
+  <w:num w:numId="6">
     <w:abstractNumId w:val="4"/>
   </w:num>
-  <w:num w:numId="4">
-    <w:abstractNumId w:val="5"/>
+  <w:num w:numId="7">
+    <w:abstractNumId w:val="6"/>
   </w:num>
-  <w:num w:numId="5">
+  <w:num w:numId="8">
     <w:abstractNumId w:val="2"/>
-  </w:num>
-  <w:num w:numId="6">
-    <w:abstractNumId w:val="3"/>
   </w:num>
 </w:numbering>
 </file>

</xml_diff>

<commit_message>
Adding quick sort Algo
</commit_message>
<xml_diff>
--- a/Sorting Algorithms/Sortings.docx
+++ b/Sorting Algorithms/Sortings.docx
@@ -4635,6 +4635,1216 @@
         </w:rPr>
       </w:pPr>
     </w:p>
+    <w:p>
+      <w:pPr>
+        <w:jc w:val="center"/>
+        <w:rPr>
+          <w:b/>
+          <w:sz w:val="36"/>
+          <w:szCs w:val="36"/>
+        </w:rPr>
+      </w:pPr>
+    </w:p>
+    <w:p>
+      <w:pPr>
+        <w:jc w:val="center"/>
+        <w:rPr>
+          <w:b/>
+          <w:sz w:val="36"/>
+          <w:szCs w:val="36"/>
+        </w:rPr>
+      </w:pPr>
+    </w:p>
+    <w:p>
+      <w:pPr>
+        <w:jc w:val="center"/>
+        <w:rPr>
+          <w:b/>
+          <w:sz w:val="36"/>
+          <w:szCs w:val="36"/>
+        </w:rPr>
+      </w:pPr>
+    </w:p>
+    <w:p>
+      <w:pPr>
+        <w:jc w:val="center"/>
+        <w:rPr>
+          <w:b/>
+          <w:sz w:val="36"/>
+          <w:szCs w:val="36"/>
+        </w:rPr>
+      </w:pPr>
+    </w:p>
+    <w:p>
+      <w:pPr>
+        <w:jc w:val="center"/>
+        <w:rPr>
+          <w:b/>
+          <w:sz w:val="36"/>
+          <w:szCs w:val="36"/>
+        </w:rPr>
+      </w:pPr>
+    </w:p>
+    <w:p>
+      <w:pPr>
+        <w:jc w:val="center"/>
+        <w:rPr>
+          <w:b/>
+          <w:sz w:val="36"/>
+          <w:szCs w:val="36"/>
+        </w:rPr>
+      </w:pPr>
+    </w:p>
+    <w:p>
+      <w:pPr>
+        <w:jc w:val="center"/>
+        <w:rPr>
+          <w:b/>
+          <w:sz w:val="36"/>
+          <w:szCs w:val="36"/>
+        </w:rPr>
+      </w:pPr>
+    </w:p>
+    <w:p>
+      <w:pPr>
+        <w:jc w:val="center"/>
+        <w:rPr>
+          <w:b/>
+          <w:sz w:val="36"/>
+          <w:szCs w:val="36"/>
+        </w:rPr>
+      </w:pPr>
+      <w:r>
+        <w:rPr>
+          <w:b/>
+          <w:sz w:val="36"/>
+          <w:szCs w:val="36"/>
+        </w:rPr>
+        <w:lastRenderedPageBreak/>
+        <w:t>Quick Sort</w:t>
+      </w:r>
+    </w:p>
+    <w:p>
+      <w:pPr>
+        <w:spacing w:before="100" w:beforeAutospacing="1" w:after="100" w:afterAutospacing="1" w:line="240" w:lineRule="auto"/>
+        <w:rPr>
+          <w:rFonts w:ascii="Times New Roman" w:eastAsia="Times New Roman" w:hAnsi="Times New Roman" w:cs="Times New Roman"/>
+          <w:sz w:val="24"/>
+          <w:szCs w:val="24"/>
+        </w:rPr>
+      </w:pPr>
+      <w:r>
+        <w:rPr>
+          <w:rFonts w:ascii="Times New Roman" w:eastAsia="Times New Roman" w:hAnsi="Times New Roman" w:cs="Times New Roman"/>
+          <w:b/>
+          <w:bCs/>
+          <w:sz w:val="24"/>
+          <w:szCs w:val="24"/>
+        </w:rPr>
+        <w:t>Quick Sort</w:t>
+      </w:r>
+      <w:r>
+        <w:rPr>
+          <w:rFonts w:ascii="Times New Roman" w:eastAsia="Times New Roman" w:hAnsi="Times New Roman" w:cs="Times New Roman"/>
+          <w:sz w:val="24"/>
+          <w:szCs w:val="24"/>
+        </w:rPr>
+        <w:t xml:space="preserve"> is </w:t>
+      </w:r>
+      <w:r>
+        <w:rPr>
+          <w:rFonts w:ascii="Times New Roman" w:eastAsia="Times New Roman" w:hAnsi="Times New Roman" w:cs="Times New Roman"/>
+          <w:b/>
+          <w:bCs/>
+          <w:sz w:val="24"/>
+          <w:szCs w:val="24"/>
+        </w:rPr>
+        <w:t>"The Ultimate Delegator."</w:t>
+      </w:r>
+    </w:p>
+    <w:p>
+      <w:pPr>
+        <w:spacing w:before="100" w:beforeAutospacing="1" w:after="100" w:afterAutospacing="1" w:line="240" w:lineRule="auto"/>
+        <w:rPr>
+          <w:rFonts w:ascii="Times New Roman" w:eastAsia="Times New Roman" w:hAnsi="Times New Roman" w:cs="Times New Roman"/>
+          <w:sz w:val="24"/>
+          <w:szCs w:val="24"/>
+        </w:rPr>
+      </w:pPr>
+      <w:r>
+        <w:rPr>
+          <w:rFonts w:ascii="Times New Roman" w:eastAsia="Times New Roman" w:hAnsi="Times New Roman" w:cs="Times New Roman"/>
+          <w:sz w:val="24"/>
+          <w:szCs w:val="24"/>
+        </w:rPr>
+        <w:t xml:space="preserve">It is arguably the most widely used sorting algorithm in the world. Like Merge Sort, it uses a divide-and-conquer strategy, but it does something Merge Sort can't: it sorts everything </w:t>
+      </w:r>
+      <w:r>
+        <w:rPr>
+          <w:rFonts w:ascii="Times New Roman" w:eastAsia="Times New Roman" w:hAnsi="Times New Roman" w:cs="Times New Roman"/>
+          <w:b/>
+          <w:bCs/>
+          <w:sz w:val="24"/>
+          <w:szCs w:val="24"/>
+        </w:rPr>
+        <w:t>in-place</w:t>
+      </w:r>
+      <w:r>
+        <w:rPr>
+          <w:rFonts w:ascii="Times New Roman" w:eastAsia="Times New Roman" w:hAnsi="Times New Roman" w:cs="Times New Roman"/>
+          <w:sz w:val="24"/>
+          <w:szCs w:val="24"/>
+        </w:rPr>
+        <w:t>, meaning it doesn't need to waste extra memory allocating new lists.</w:t>
+      </w:r>
+    </w:p>
+    <w:p>
+      <w:pPr>
+        <w:spacing w:before="100" w:beforeAutospacing="1" w:after="100" w:afterAutospacing="1" w:line="240" w:lineRule="auto"/>
+        <w:outlineLvl w:val="2"/>
+        <w:rPr>
+          <w:rFonts w:ascii="Times New Roman" w:eastAsia="Times New Roman" w:hAnsi="Times New Roman" w:cs="Times New Roman"/>
+          <w:b/>
+          <w:bCs/>
+          <w:sz w:val="27"/>
+          <w:szCs w:val="27"/>
+        </w:rPr>
+      </w:pPr>
+      <w:r>
+        <w:rPr>
+          <w:rFonts w:ascii="Times New Roman" w:eastAsia="Times New Roman" w:hAnsi="Times New Roman" w:cs="Times New Roman"/>
+          <w:b/>
+          <w:bCs/>
+          <w:sz w:val="27"/>
+          <w:szCs w:val="27"/>
+        </w:rPr>
+        <w:t>How It Works (The Power of the Pivot)</w:t>
+      </w:r>
+    </w:p>
+    <w:p>
+      <w:pPr>
+        <w:spacing w:before="100" w:beforeAutospacing="1" w:after="100" w:afterAutospacing="1" w:line="240" w:lineRule="auto"/>
+        <w:rPr>
+          <w:rFonts w:ascii="Times New Roman" w:eastAsia="Times New Roman" w:hAnsi="Times New Roman" w:cs="Times New Roman"/>
+          <w:sz w:val="24"/>
+          <w:szCs w:val="24"/>
+        </w:rPr>
+      </w:pPr>
+      <w:r>
+        <w:rPr>
+          <w:rFonts w:ascii="Times New Roman" w:eastAsia="Times New Roman" w:hAnsi="Times New Roman" w:cs="Times New Roman"/>
+          <w:sz w:val="24"/>
+          <w:szCs w:val="24"/>
+        </w:rPr>
+        <w:t xml:space="preserve">Quick Sort relies entirely on picking a benchmark element called a </w:t>
+      </w:r>
+      <w:r>
+        <w:rPr>
+          <w:rFonts w:ascii="Times New Roman" w:eastAsia="Times New Roman" w:hAnsi="Times New Roman" w:cs="Times New Roman"/>
+          <w:b/>
+          <w:bCs/>
+          <w:sz w:val="24"/>
+          <w:szCs w:val="24"/>
+        </w:rPr>
+        <w:t>pivot</w:t>
+      </w:r>
+      <w:r>
+        <w:rPr>
+          <w:rFonts w:ascii="Times New Roman" w:eastAsia="Times New Roman" w:hAnsi="Times New Roman" w:cs="Times New Roman"/>
+          <w:sz w:val="24"/>
+          <w:szCs w:val="24"/>
+        </w:rPr>
+        <w:t>. The goal is to move the pivot to its exact final resting place in the sorted array.</w:t>
+      </w:r>
+    </w:p>
+    <w:p>
+      <w:pPr>
+        <w:numPr>
+          <w:ilvl w:val="0"/>
+          <w:numId w:val="9"/>
+        </w:numPr>
+        <w:spacing w:before="100" w:beforeAutospacing="1" w:after="100" w:afterAutospacing="1" w:line="240" w:lineRule="auto"/>
+        <w:rPr>
+          <w:rFonts w:ascii="Times New Roman" w:eastAsia="Times New Roman" w:hAnsi="Times New Roman" w:cs="Times New Roman"/>
+          <w:sz w:val="24"/>
+          <w:szCs w:val="24"/>
+        </w:rPr>
+      </w:pPr>
+      <w:r>
+        <w:rPr>
+          <w:rFonts w:ascii="Times New Roman" w:eastAsia="Times New Roman" w:hAnsi="Times New Roman" w:cs="Times New Roman"/>
+          <w:b/>
+          <w:bCs/>
+          <w:sz w:val="24"/>
+          <w:szCs w:val="24"/>
+        </w:rPr>
+        <w:t>Pick a Pivot:</w:t>
+      </w:r>
+      <w:r>
+        <w:rPr>
+          <w:rFonts w:ascii="Times New Roman" w:eastAsia="Times New Roman" w:hAnsi="Times New Roman" w:cs="Times New Roman"/>
+          <w:sz w:val="24"/>
+          <w:szCs w:val="24"/>
+        </w:rPr>
+        <w:t xml:space="preserve"> Choose any element from the array (commonly the last element, the first element, or a random one).</w:t>
+      </w:r>
+    </w:p>
+    <w:p>
+      <w:pPr>
+        <w:numPr>
+          <w:ilvl w:val="0"/>
+          <w:numId w:val="9"/>
+        </w:numPr>
+        <w:spacing w:before="100" w:beforeAutospacing="1" w:after="100" w:afterAutospacing="1" w:line="240" w:lineRule="auto"/>
+        <w:rPr>
+          <w:rFonts w:ascii="Times New Roman" w:eastAsia="Times New Roman" w:hAnsi="Times New Roman" w:cs="Times New Roman"/>
+          <w:sz w:val="24"/>
+          <w:szCs w:val="24"/>
+        </w:rPr>
+      </w:pPr>
+      <w:r>
+        <w:rPr>
+          <w:rFonts w:ascii="Times New Roman" w:eastAsia="Times New Roman" w:hAnsi="Times New Roman" w:cs="Times New Roman"/>
+          <w:b/>
+          <w:bCs/>
+          <w:sz w:val="24"/>
+          <w:szCs w:val="24"/>
+        </w:rPr>
+        <w:t>Partitioning:</w:t>
+      </w:r>
+      <w:r>
+        <w:rPr>
+          <w:rFonts w:ascii="Times New Roman" w:eastAsia="Times New Roman" w:hAnsi="Times New Roman" w:cs="Times New Roman"/>
+          <w:sz w:val="24"/>
+          <w:szCs w:val="24"/>
+        </w:rPr>
+        <w:t xml:space="preserve"> Rearrange the array so that:</w:t>
+      </w:r>
+    </w:p>
+    <w:p>
+      <w:pPr>
+        <w:numPr>
+          <w:ilvl w:val="1"/>
+          <w:numId w:val="9"/>
+        </w:numPr>
+        <w:spacing w:before="100" w:beforeAutospacing="1" w:after="100" w:afterAutospacing="1" w:line="240" w:lineRule="auto"/>
+        <w:rPr>
+          <w:rFonts w:ascii="Times New Roman" w:eastAsia="Times New Roman" w:hAnsi="Times New Roman" w:cs="Times New Roman"/>
+          <w:sz w:val="24"/>
+          <w:szCs w:val="24"/>
+        </w:rPr>
+      </w:pPr>
+      <w:r>
+        <w:rPr>
+          <w:rFonts w:ascii="Times New Roman" w:eastAsia="Times New Roman" w:hAnsi="Times New Roman" w:cs="Times New Roman"/>
+          <w:sz w:val="24"/>
+          <w:szCs w:val="24"/>
+        </w:rPr>
+        <w:t xml:space="preserve">All elements </w:t>
+      </w:r>
+      <w:r>
+        <w:rPr>
+          <w:rFonts w:ascii="Times New Roman" w:eastAsia="Times New Roman" w:hAnsi="Times New Roman" w:cs="Times New Roman"/>
+          <w:b/>
+          <w:bCs/>
+          <w:sz w:val="24"/>
+          <w:szCs w:val="24"/>
+        </w:rPr>
+        <w:t>smaller</w:t>
+      </w:r>
+      <w:r>
+        <w:rPr>
+          <w:rFonts w:ascii="Times New Roman" w:eastAsia="Times New Roman" w:hAnsi="Times New Roman" w:cs="Times New Roman"/>
+          <w:sz w:val="24"/>
+          <w:szCs w:val="24"/>
+        </w:rPr>
+        <w:t xml:space="preserve"> than the pivot move to its </w:t>
+      </w:r>
+      <w:r>
+        <w:rPr>
+          <w:rFonts w:ascii="Times New Roman" w:eastAsia="Times New Roman" w:hAnsi="Times New Roman" w:cs="Times New Roman"/>
+          <w:b/>
+          <w:bCs/>
+          <w:sz w:val="24"/>
+          <w:szCs w:val="24"/>
+        </w:rPr>
+        <w:t>left</w:t>
+      </w:r>
+      <w:r>
+        <w:rPr>
+          <w:rFonts w:ascii="Times New Roman" w:eastAsia="Times New Roman" w:hAnsi="Times New Roman" w:cs="Times New Roman"/>
+          <w:sz w:val="24"/>
+          <w:szCs w:val="24"/>
+        </w:rPr>
+        <w:t>.</w:t>
+      </w:r>
+    </w:p>
+    <w:p>
+      <w:pPr>
+        <w:numPr>
+          <w:ilvl w:val="1"/>
+          <w:numId w:val="9"/>
+        </w:numPr>
+        <w:spacing w:before="100" w:beforeAutospacing="1" w:after="100" w:afterAutospacing="1" w:line="240" w:lineRule="auto"/>
+        <w:rPr>
+          <w:rFonts w:ascii="Times New Roman" w:eastAsia="Times New Roman" w:hAnsi="Times New Roman" w:cs="Times New Roman"/>
+          <w:sz w:val="24"/>
+          <w:szCs w:val="24"/>
+        </w:rPr>
+      </w:pPr>
+      <w:r>
+        <w:rPr>
+          <w:rFonts w:ascii="Times New Roman" w:eastAsia="Times New Roman" w:hAnsi="Times New Roman" w:cs="Times New Roman"/>
+          <w:sz w:val="24"/>
+          <w:szCs w:val="24"/>
+        </w:rPr>
+        <w:t xml:space="preserve">All elements </w:t>
+      </w:r>
+      <w:r>
+        <w:rPr>
+          <w:rFonts w:ascii="Times New Roman" w:eastAsia="Times New Roman" w:hAnsi="Times New Roman" w:cs="Times New Roman"/>
+          <w:b/>
+          <w:bCs/>
+          <w:sz w:val="24"/>
+          <w:szCs w:val="24"/>
+        </w:rPr>
+        <w:t>larger</w:t>
+      </w:r>
+      <w:r>
+        <w:rPr>
+          <w:rFonts w:ascii="Times New Roman" w:eastAsia="Times New Roman" w:hAnsi="Times New Roman" w:cs="Times New Roman"/>
+          <w:sz w:val="24"/>
+          <w:szCs w:val="24"/>
+        </w:rPr>
+        <w:t xml:space="preserve"> than the pivot move to its </w:t>
+      </w:r>
+      <w:r>
+        <w:rPr>
+          <w:rFonts w:ascii="Times New Roman" w:eastAsia="Times New Roman" w:hAnsi="Times New Roman" w:cs="Times New Roman"/>
+          <w:b/>
+          <w:bCs/>
+          <w:sz w:val="24"/>
+          <w:szCs w:val="24"/>
+        </w:rPr>
+        <w:t>right</w:t>
+      </w:r>
+      <w:r>
+        <w:rPr>
+          <w:rFonts w:ascii="Times New Roman" w:eastAsia="Times New Roman" w:hAnsi="Times New Roman" w:cs="Times New Roman"/>
+          <w:sz w:val="24"/>
+          <w:szCs w:val="24"/>
+        </w:rPr>
+        <w:t>.</w:t>
+      </w:r>
+    </w:p>
+    <w:p>
+      <w:pPr>
+        <w:numPr>
+          <w:ilvl w:val="0"/>
+          <w:numId w:val="9"/>
+        </w:numPr>
+        <w:spacing w:before="100" w:beforeAutospacing="1" w:after="100" w:afterAutospacing="1" w:line="240" w:lineRule="auto"/>
+        <w:rPr>
+          <w:rFonts w:ascii="Times New Roman" w:eastAsia="Times New Roman" w:hAnsi="Times New Roman" w:cs="Times New Roman"/>
+          <w:sz w:val="24"/>
+          <w:szCs w:val="24"/>
+        </w:rPr>
+      </w:pPr>
+      <w:proofErr w:type="spellStart"/>
+      <w:r>
+        <w:rPr>
+          <w:rFonts w:ascii="Times New Roman" w:eastAsia="Times New Roman" w:hAnsi="Times New Roman" w:cs="Times New Roman"/>
+          <w:b/>
+          <w:bCs/>
+          <w:sz w:val="24"/>
+          <w:szCs w:val="24"/>
+        </w:rPr>
+        <w:t>Recurse</w:t>
+      </w:r>
+      <w:proofErr w:type="spellEnd"/>
+      <w:r>
+        <w:rPr>
+          <w:rFonts w:ascii="Times New Roman" w:eastAsia="Times New Roman" w:hAnsi="Times New Roman" w:cs="Times New Roman"/>
+          <w:b/>
+          <w:bCs/>
+          <w:sz w:val="24"/>
+          <w:szCs w:val="24"/>
+        </w:rPr>
+        <w:t>:</w:t>
+      </w:r>
+      <w:r>
+        <w:rPr>
+          <w:rFonts w:ascii="Times New Roman" w:eastAsia="Times New Roman" w:hAnsi="Times New Roman" w:cs="Times New Roman"/>
+          <w:sz w:val="24"/>
+          <w:szCs w:val="24"/>
+        </w:rPr>
+        <w:t xml:space="preserve"> The pivot is now perfectly in its final sorted position. Now, recursively repeat this exact process for the left side and the right side.</w:t>
+      </w:r>
+    </w:p>
+    <w:p>
+      <w:pPr>
+        <w:spacing w:before="100" w:beforeAutospacing="1" w:after="100" w:afterAutospacing="1" w:line="240" w:lineRule="auto"/>
+        <w:rPr>
+          <w:rFonts w:ascii="Times New Roman" w:eastAsia="Times New Roman" w:hAnsi="Times New Roman" w:cs="Times New Roman"/>
+          <w:sz w:val="24"/>
+          <w:szCs w:val="24"/>
+        </w:rPr>
+      </w:pPr>
+      <w:r>
+        <w:rPr>
+          <w:rFonts w:ascii="Times New Roman" w:eastAsia="Times New Roman" w:hAnsi="Times New Roman" w:cs="Times New Roman"/>
+          <w:b/>
+          <w:bCs/>
+          <w:sz w:val="24"/>
+          <w:szCs w:val="24"/>
+        </w:rPr>
+        <w:t>Example Walkthrough:</w:t>
+      </w:r>
+      <w:r>
+        <w:rPr>
+          <w:rFonts w:ascii="Times New Roman" w:eastAsia="Times New Roman" w:hAnsi="Times New Roman" w:cs="Times New Roman"/>
+          <w:sz w:val="24"/>
+          <w:szCs w:val="24"/>
+        </w:rPr>
+        <w:t xml:space="preserve"> </w:t>
+      </w:r>
+      <w:r>
+        <w:rPr>
+          <w:rFonts w:ascii="Courier New" w:eastAsia="Times New Roman" w:hAnsi="Courier New" w:cs="Courier New"/>
+          <w:sz w:val="20"/>
+        </w:rPr>
+        <w:t>[10, 80, 30, 90, 40, 50]</w:t>
+      </w:r>
+    </w:p>
+    <w:p>
+      <w:pPr>
+        <w:numPr>
+          <w:ilvl w:val="0"/>
+          <w:numId w:val="10"/>
+        </w:numPr>
+        <w:spacing w:before="100" w:beforeAutospacing="1" w:after="100" w:afterAutospacing="1" w:line="240" w:lineRule="auto"/>
+        <w:rPr>
+          <w:rFonts w:ascii="Times New Roman" w:eastAsia="Times New Roman" w:hAnsi="Times New Roman" w:cs="Times New Roman"/>
+          <w:sz w:val="24"/>
+          <w:szCs w:val="24"/>
+        </w:rPr>
+      </w:pPr>
+      <w:r>
+        <w:rPr>
+          <w:rFonts w:ascii="Times New Roman" w:eastAsia="Times New Roman" w:hAnsi="Times New Roman" w:cs="Times New Roman"/>
+          <w:b/>
+          <w:bCs/>
+          <w:sz w:val="24"/>
+          <w:szCs w:val="24"/>
+        </w:rPr>
+        <w:t>Step 1:</w:t>
+      </w:r>
+      <w:r>
+        <w:rPr>
+          <w:rFonts w:ascii="Times New Roman" w:eastAsia="Times New Roman" w:hAnsi="Times New Roman" w:cs="Times New Roman"/>
+          <w:sz w:val="24"/>
+          <w:szCs w:val="24"/>
+        </w:rPr>
+        <w:t xml:space="preserve"> Pick </w:t>
+      </w:r>
+      <w:r>
+        <w:rPr>
+          <w:rFonts w:ascii="Courier New" w:eastAsia="Times New Roman" w:hAnsi="Courier New" w:cs="Courier New"/>
+          <w:sz w:val="20"/>
+        </w:rPr>
+        <w:t>50</w:t>
+      </w:r>
+      <w:r>
+        <w:rPr>
+          <w:rFonts w:ascii="Times New Roman" w:eastAsia="Times New Roman" w:hAnsi="Times New Roman" w:cs="Times New Roman"/>
+          <w:sz w:val="24"/>
+          <w:szCs w:val="24"/>
+        </w:rPr>
+        <w:t xml:space="preserve"> as the pivot.</w:t>
+      </w:r>
+    </w:p>
+    <w:p>
+      <w:pPr>
+        <w:numPr>
+          <w:ilvl w:val="0"/>
+          <w:numId w:val="10"/>
+        </w:numPr>
+        <w:spacing w:before="100" w:beforeAutospacing="1" w:after="100" w:afterAutospacing="1" w:line="240" w:lineRule="auto"/>
+        <w:rPr>
+          <w:rFonts w:ascii="Times New Roman" w:eastAsia="Times New Roman" w:hAnsi="Times New Roman" w:cs="Times New Roman"/>
+          <w:sz w:val="24"/>
+          <w:szCs w:val="24"/>
+        </w:rPr>
+      </w:pPr>
+      <w:r>
+        <w:rPr>
+          <w:rFonts w:ascii="Times New Roman" w:eastAsia="Times New Roman" w:hAnsi="Times New Roman" w:cs="Times New Roman"/>
+          <w:b/>
+          <w:bCs/>
+          <w:sz w:val="24"/>
+          <w:szCs w:val="24"/>
+        </w:rPr>
+        <w:t>Step 2 (Partition):</w:t>
+      </w:r>
+      <w:r>
+        <w:rPr>
+          <w:rFonts w:ascii="Times New Roman" w:eastAsia="Times New Roman" w:hAnsi="Times New Roman" w:cs="Times New Roman"/>
+          <w:sz w:val="24"/>
+          <w:szCs w:val="24"/>
+        </w:rPr>
+        <w:t xml:space="preserve"> Rearrange elements around </w:t>
+      </w:r>
+      <w:r>
+        <w:rPr>
+          <w:rFonts w:ascii="Courier New" w:eastAsia="Times New Roman" w:hAnsi="Courier New" w:cs="Courier New"/>
+          <w:sz w:val="20"/>
+        </w:rPr>
+        <w:t>50</w:t>
+      </w:r>
+      <w:r>
+        <w:rPr>
+          <w:rFonts w:ascii="Times New Roman" w:eastAsia="Times New Roman" w:hAnsi="Times New Roman" w:cs="Times New Roman"/>
+          <w:sz w:val="24"/>
+          <w:szCs w:val="24"/>
+        </w:rPr>
+        <w:t>.</w:t>
+      </w:r>
+    </w:p>
+    <w:p>
+      <w:pPr>
+        <w:numPr>
+          <w:ilvl w:val="1"/>
+          <w:numId w:val="10"/>
+        </w:numPr>
+        <w:spacing w:before="100" w:beforeAutospacing="1" w:after="100" w:afterAutospacing="1" w:line="240" w:lineRule="auto"/>
+        <w:rPr>
+          <w:rFonts w:ascii="Times New Roman" w:eastAsia="Times New Roman" w:hAnsi="Times New Roman" w:cs="Times New Roman"/>
+          <w:sz w:val="24"/>
+          <w:szCs w:val="24"/>
+        </w:rPr>
+      </w:pPr>
+      <w:r>
+        <w:rPr>
+          <w:rFonts w:ascii="Times New Roman" w:eastAsia="Times New Roman" w:hAnsi="Times New Roman" w:cs="Times New Roman"/>
+          <w:sz w:val="24"/>
+          <w:szCs w:val="24"/>
+        </w:rPr>
+        <w:t xml:space="preserve">Numbers smaller than 50: </w:t>
+      </w:r>
+      <w:r>
+        <w:rPr>
+          <w:rFonts w:ascii="Courier New" w:eastAsia="Times New Roman" w:hAnsi="Courier New" w:cs="Courier New"/>
+          <w:sz w:val="20"/>
+        </w:rPr>
+        <w:t>10</w:t>
+      </w:r>
+      <w:r>
+        <w:rPr>
+          <w:rFonts w:ascii="Times New Roman" w:eastAsia="Times New Roman" w:hAnsi="Times New Roman" w:cs="Times New Roman"/>
+          <w:sz w:val="24"/>
+          <w:szCs w:val="24"/>
+        </w:rPr>
+        <w:t xml:space="preserve">, </w:t>
+      </w:r>
+      <w:r>
+        <w:rPr>
+          <w:rFonts w:ascii="Courier New" w:eastAsia="Times New Roman" w:hAnsi="Courier New" w:cs="Courier New"/>
+          <w:sz w:val="20"/>
+        </w:rPr>
+        <w:t>30</w:t>
+      </w:r>
+      <w:r>
+        <w:rPr>
+          <w:rFonts w:ascii="Times New Roman" w:eastAsia="Times New Roman" w:hAnsi="Times New Roman" w:cs="Times New Roman"/>
+          <w:sz w:val="24"/>
+          <w:szCs w:val="24"/>
+        </w:rPr>
+        <w:t xml:space="preserve">, </w:t>
+      </w:r>
+      <w:r>
+        <w:rPr>
+          <w:rFonts w:ascii="Courier New" w:eastAsia="Times New Roman" w:hAnsi="Courier New" w:cs="Courier New"/>
+          <w:sz w:val="20"/>
+        </w:rPr>
+        <w:t>40</w:t>
+      </w:r>
+    </w:p>
+    <w:p>
+      <w:pPr>
+        <w:numPr>
+          <w:ilvl w:val="1"/>
+          <w:numId w:val="10"/>
+        </w:numPr>
+        <w:spacing w:before="100" w:beforeAutospacing="1" w:after="100" w:afterAutospacing="1" w:line="240" w:lineRule="auto"/>
+        <w:rPr>
+          <w:rFonts w:ascii="Times New Roman" w:eastAsia="Times New Roman" w:hAnsi="Times New Roman" w:cs="Times New Roman"/>
+          <w:sz w:val="24"/>
+          <w:szCs w:val="24"/>
+        </w:rPr>
+      </w:pPr>
+      <w:r>
+        <w:rPr>
+          <w:rFonts w:ascii="Times New Roman" w:eastAsia="Times New Roman" w:hAnsi="Times New Roman" w:cs="Times New Roman"/>
+          <w:sz w:val="24"/>
+          <w:szCs w:val="24"/>
+        </w:rPr>
+        <w:t xml:space="preserve">Numbers larger than 50: </w:t>
+      </w:r>
+      <w:r>
+        <w:rPr>
+          <w:rFonts w:ascii="Courier New" w:eastAsia="Times New Roman" w:hAnsi="Courier New" w:cs="Courier New"/>
+          <w:sz w:val="20"/>
+        </w:rPr>
+        <w:t>80</w:t>
+      </w:r>
+      <w:r>
+        <w:rPr>
+          <w:rFonts w:ascii="Times New Roman" w:eastAsia="Times New Roman" w:hAnsi="Times New Roman" w:cs="Times New Roman"/>
+          <w:sz w:val="24"/>
+          <w:szCs w:val="24"/>
+        </w:rPr>
+        <w:t xml:space="preserve">, </w:t>
+      </w:r>
+      <w:r>
+        <w:rPr>
+          <w:rFonts w:ascii="Courier New" w:eastAsia="Times New Roman" w:hAnsi="Courier New" w:cs="Courier New"/>
+          <w:sz w:val="20"/>
+        </w:rPr>
+        <w:t>90</w:t>
+      </w:r>
+    </w:p>
+    <w:p>
+      <w:pPr>
+        <w:numPr>
+          <w:ilvl w:val="1"/>
+          <w:numId w:val="10"/>
+        </w:numPr>
+        <w:spacing w:before="100" w:beforeAutospacing="1" w:after="100" w:afterAutospacing="1" w:line="240" w:lineRule="auto"/>
+        <w:rPr>
+          <w:rFonts w:ascii="Times New Roman" w:eastAsia="Times New Roman" w:hAnsi="Times New Roman" w:cs="Times New Roman"/>
+          <w:sz w:val="24"/>
+          <w:szCs w:val="24"/>
+        </w:rPr>
+      </w:pPr>
+      <w:r>
+        <w:rPr>
+          <w:rFonts w:ascii="Times New Roman" w:eastAsia="Times New Roman" w:hAnsi="Times New Roman" w:cs="Times New Roman"/>
+          <w:sz w:val="24"/>
+          <w:szCs w:val="24"/>
+        </w:rPr>
+        <w:t xml:space="preserve">Result: </w:t>
+      </w:r>
+      <w:r>
+        <w:rPr>
+          <w:rFonts w:ascii="Courier New" w:eastAsia="Times New Roman" w:hAnsi="Courier New" w:cs="Courier New"/>
+          <w:sz w:val="20"/>
+        </w:rPr>
+        <w:t>[10, 30, 40, 50, 90, 80]</w:t>
+      </w:r>
+      <w:r>
+        <w:rPr>
+          <w:rFonts w:ascii="Times New Roman" w:eastAsia="Times New Roman" w:hAnsi="Times New Roman" w:cs="Times New Roman"/>
+          <w:sz w:val="24"/>
+          <w:szCs w:val="24"/>
+        </w:rPr>
+        <w:t xml:space="preserve"> (Notice how 50 is now in the correct spot!)</w:t>
+      </w:r>
+    </w:p>
+    <w:p>
+      <w:pPr>
+        <w:numPr>
+          <w:ilvl w:val="0"/>
+          <w:numId w:val="10"/>
+        </w:numPr>
+        <w:spacing w:before="100" w:beforeAutospacing="1" w:after="100" w:afterAutospacing="1" w:line="240" w:lineRule="auto"/>
+        <w:rPr>
+          <w:rFonts w:ascii="Times New Roman" w:eastAsia="Times New Roman" w:hAnsi="Times New Roman" w:cs="Times New Roman"/>
+          <w:sz w:val="24"/>
+          <w:szCs w:val="24"/>
+        </w:rPr>
+      </w:pPr>
+      <w:r>
+        <w:rPr>
+          <w:rFonts w:ascii="Times New Roman" w:eastAsia="Times New Roman" w:hAnsi="Times New Roman" w:cs="Times New Roman"/>
+          <w:b/>
+          <w:bCs/>
+          <w:sz w:val="24"/>
+          <w:szCs w:val="24"/>
+        </w:rPr>
+        <w:t>Step 3:</w:t>
+      </w:r>
+      <w:r>
+        <w:rPr>
+          <w:rFonts w:ascii="Times New Roman" w:eastAsia="Times New Roman" w:hAnsi="Times New Roman" w:cs="Times New Roman"/>
+          <w:sz w:val="24"/>
+          <w:szCs w:val="24"/>
+        </w:rPr>
+        <w:t xml:space="preserve"> Repeat the process for the left sub-array </w:t>
+      </w:r>
+      <w:r>
+        <w:rPr>
+          <w:rFonts w:ascii="Courier New" w:eastAsia="Times New Roman" w:hAnsi="Courier New" w:cs="Courier New"/>
+          <w:sz w:val="20"/>
+        </w:rPr>
+        <w:t xml:space="preserve">[10, 30, </w:t>
+      </w:r>
+      <w:proofErr w:type="gramStart"/>
+      <w:r>
+        <w:rPr>
+          <w:rFonts w:ascii="Courier New" w:eastAsia="Times New Roman" w:hAnsi="Courier New" w:cs="Courier New"/>
+          <w:sz w:val="20"/>
+        </w:rPr>
+        <w:t>40</w:t>
+      </w:r>
+      <w:proofErr w:type="gramEnd"/>
+      <w:r>
+        <w:rPr>
+          <w:rFonts w:ascii="Courier New" w:eastAsia="Times New Roman" w:hAnsi="Courier New" w:cs="Courier New"/>
+          <w:sz w:val="20"/>
+        </w:rPr>
+        <w:t>]</w:t>
+      </w:r>
+      <w:r>
+        <w:rPr>
+          <w:rFonts w:ascii="Times New Roman" w:eastAsia="Times New Roman" w:hAnsi="Times New Roman" w:cs="Times New Roman"/>
+          <w:sz w:val="24"/>
+          <w:szCs w:val="24"/>
+        </w:rPr>
+        <w:t xml:space="preserve"> and the right sub-array </w:t>
+      </w:r>
+      <w:r>
+        <w:rPr>
+          <w:rFonts w:ascii="Courier New" w:eastAsia="Times New Roman" w:hAnsi="Courier New" w:cs="Courier New"/>
+          <w:sz w:val="20"/>
+        </w:rPr>
+        <w:t>[90, 80]</w:t>
+      </w:r>
+      <w:r>
+        <w:rPr>
+          <w:rFonts w:ascii="Times New Roman" w:eastAsia="Times New Roman" w:hAnsi="Times New Roman" w:cs="Times New Roman"/>
+          <w:sz w:val="24"/>
+          <w:szCs w:val="24"/>
+        </w:rPr>
+        <w:t>.</w:t>
+      </w:r>
+    </w:p>
+    <w:p>
+      <w:pPr>
+        <w:spacing w:before="100" w:beforeAutospacing="1" w:after="100" w:afterAutospacing="1" w:line="240" w:lineRule="auto"/>
+        <w:outlineLvl w:val="2"/>
+        <w:rPr>
+          <w:rFonts w:ascii="Times New Roman" w:eastAsia="Times New Roman" w:hAnsi="Times New Roman" w:cs="Times New Roman"/>
+          <w:b/>
+          <w:bCs/>
+          <w:sz w:val="27"/>
+          <w:szCs w:val="27"/>
+        </w:rPr>
+      </w:pPr>
+      <w:r>
+        <w:rPr>
+          <w:rFonts w:ascii="Times New Roman" w:eastAsia="Times New Roman" w:hAnsi="Times New Roman" w:cs="Times New Roman"/>
+          <w:b/>
+          <w:bCs/>
+          <w:sz w:val="27"/>
+          <w:szCs w:val="27"/>
+        </w:rPr>
+        <w:t>Complexity &amp; Efficiency</w:t>
+      </w:r>
+    </w:p>
+    <w:p>
+      <w:pPr>
+        <w:spacing w:before="100" w:beforeAutospacing="1" w:after="100" w:afterAutospacing="1" w:line="240" w:lineRule="auto"/>
+        <w:rPr>
+          <w:rFonts w:ascii="Times New Roman" w:eastAsia="Times New Roman" w:hAnsi="Times New Roman" w:cs="Times New Roman"/>
+          <w:sz w:val="24"/>
+          <w:szCs w:val="24"/>
+        </w:rPr>
+      </w:pPr>
+      <w:r>
+        <w:rPr>
+          <w:rFonts w:ascii="Times New Roman" w:eastAsia="Times New Roman" w:hAnsi="Times New Roman" w:cs="Times New Roman"/>
+          <w:sz w:val="24"/>
+          <w:szCs w:val="24"/>
+        </w:rPr>
+        <w:t>Quick Sort is incredibly fast on average, but it does have an Achilles' heel. If you pick a terrible pivot every single time (like picking the largest number in an already sorted list), it degrades significantly.</w:t>
+      </w:r>
+    </w:p>
+    <w:tbl>
+      <w:tblPr>
+        <w:tblW w:w="0" w:type="auto"/>
+        <w:tblCellSpacing w:w="15" w:type="dxa"/>
+        <w:tblCellMar>
+          <w:top w:w="15" w:type="dxa"/>
+          <w:left w:w="15" w:type="dxa"/>
+          <w:bottom w:w="15" w:type="dxa"/>
+          <w:right w:w="15" w:type="dxa"/>
+        </w:tblCellMar>
+        <w:tblLook w:val="04A0"/>
+      </w:tblPr>
+      <w:tblGrid>
+        <w:gridCol w:w="2048"/>
+        <w:gridCol w:w="6553"/>
+      </w:tblGrid>
+      <w:tr>
+        <w:trPr>
+          <w:tblHeader/>
+          <w:tblCellSpacing w:w="15" w:type="dxa"/>
+        </w:trPr>
+        <w:tc>
+          <w:tcPr>
+            <w:tcW w:w="0" w:type="auto"/>
+            <w:tcBorders>
+              <w:top w:val="single" w:sz="4" w:space="0" w:color="auto"/>
+              <w:left w:val="single" w:sz="4" w:space="0" w:color="auto"/>
+              <w:bottom w:val="single" w:sz="4" w:space="0" w:color="auto"/>
+              <w:right w:val="single" w:sz="4" w:space="0" w:color="auto"/>
+            </w:tcBorders>
+            <w:vAlign w:val="center"/>
+            <w:hideMark/>
+          </w:tcPr>
+          <w:p>
+            <w:pPr>
+              <w:spacing w:after="320" w:line="240" w:lineRule="auto"/>
+              <w:rPr>
+                <w:rFonts w:ascii="Times New Roman" w:eastAsia="Times New Roman" w:hAnsi="Times New Roman" w:cs="Times New Roman"/>
+                <w:sz w:val="24"/>
+                <w:szCs w:val="24"/>
+              </w:rPr>
+            </w:pPr>
+            <w:r>
+              <w:rPr>
+                <w:rFonts w:ascii="Times New Roman" w:eastAsia="Times New Roman" w:hAnsi="Times New Roman" w:cs="Times New Roman"/>
+                <w:b/>
+                <w:bCs/>
+                <w:sz w:val="24"/>
+                <w:szCs w:val="24"/>
+              </w:rPr>
+              <w:t>Metric</w:t>
+            </w:r>
+          </w:p>
+        </w:tc>
+        <w:tc>
+          <w:tcPr>
+            <w:tcW w:w="0" w:type="auto"/>
+            <w:tcBorders>
+              <w:top w:val="single" w:sz="4" w:space="0" w:color="auto"/>
+              <w:left w:val="single" w:sz="4" w:space="0" w:color="auto"/>
+              <w:bottom w:val="single" w:sz="4" w:space="0" w:color="auto"/>
+              <w:right w:val="single" w:sz="4" w:space="0" w:color="auto"/>
+            </w:tcBorders>
+            <w:vAlign w:val="center"/>
+            <w:hideMark/>
+          </w:tcPr>
+          <w:p>
+            <w:pPr>
+              <w:spacing w:after="320" w:line="240" w:lineRule="auto"/>
+              <w:rPr>
+                <w:rFonts w:ascii="Times New Roman" w:eastAsia="Times New Roman" w:hAnsi="Times New Roman" w:cs="Times New Roman"/>
+                <w:sz w:val="24"/>
+                <w:szCs w:val="24"/>
+              </w:rPr>
+            </w:pPr>
+            <w:r>
+              <w:rPr>
+                <w:rFonts w:ascii="Times New Roman" w:eastAsia="Times New Roman" w:hAnsi="Times New Roman" w:cs="Times New Roman"/>
+                <w:b/>
+                <w:bCs/>
+                <w:sz w:val="24"/>
+                <w:szCs w:val="24"/>
+              </w:rPr>
+              <w:t>Complexity</w:t>
+            </w:r>
+          </w:p>
+        </w:tc>
+      </w:tr>
+      <w:tr>
+        <w:trPr>
+          <w:tblCellSpacing w:w="15" w:type="dxa"/>
+        </w:trPr>
+        <w:tc>
+          <w:tcPr>
+            <w:tcW w:w="0" w:type="auto"/>
+            <w:tcBorders>
+              <w:top w:val="single" w:sz="4" w:space="0" w:color="auto"/>
+              <w:left w:val="single" w:sz="4" w:space="0" w:color="auto"/>
+              <w:bottom w:val="single" w:sz="4" w:space="0" w:color="auto"/>
+              <w:right w:val="single" w:sz="4" w:space="0" w:color="auto"/>
+            </w:tcBorders>
+            <w:vAlign w:val="center"/>
+            <w:hideMark/>
+          </w:tcPr>
+          <w:p>
+            <w:pPr>
+              <w:spacing w:after="320" w:line="240" w:lineRule="auto"/>
+              <w:rPr>
+                <w:rFonts w:ascii="Times New Roman" w:eastAsia="Times New Roman" w:hAnsi="Times New Roman" w:cs="Times New Roman"/>
+                <w:sz w:val="24"/>
+                <w:szCs w:val="24"/>
+              </w:rPr>
+            </w:pPr>
+            <w:r>
+              <w:rPr>
+                <w:rFonts w:ascii="Times New Roman" w:eastAsia="Times New Roman" w:hAnsi="Times New Roman" w:cs="Times New Roman"/>
+                <w:b/>
+                <w:bCs/>
+                <w:sz w:val="24"/>
+                <w:szCs w:val="24"/>
+              </w:rPr>
+              <w:t>Worst-case Time</w:t>
+            </w:r>
+          </w:p>
+        </w:tc>
+        <w:tc>
+          <w:tcPr>
+            <w:tcW w:w="0" w:type="auto"/>
+            <w:tcBorders>
+              <w:top w:val="single" w:sz="4" w:space="0" w:color="auto"/>
+              <w:left w:val="single" w:sz="4" w:space="0" w:color="auto"/>
+              <w:bottom w:val="single" w:sz="4" w:space="0" w:color="auto"/>
+              <w:right w:val="single" w:sz="4" w:space="0" w:color="auto"/>
+            </w:tcBorders>
+            <w:vAlign w:val="center"/>
+            <w:hideMark/>
+          </w:tcPr>
+          <w:p>
+            <w:pPr>
+              <w:spacing w:after="320" w:line="240" w:lineRule="auto"/>
+              <w:rPr>
+                <w:rFonts w:ascii="Times New Roman" w:eastAsia="Times New Roman" w:hAnsi="Times New Roman" w:cs="Times New Roman"/>
+                <w:sz w:val="24"/>
+                <w:szCs w:val="24"/>
+              </w:rPr>
+            </w:pPr>
+            <w:r>
+              <w:rPr>
+                <w:rFonts w:ascii="Times New Roman" w:eastAsia="Times New Roman" w:hAnsi="Times New Roman" w:cs="Times New Roman"/>
+                <w:sz w:val="24"/>
+                <w:szCs w:val="24"/>
+              </w:rPr>
+              <w:t>$O(n^2)$ (Rare—happens with highly skewed pivots)</w:t>
+            </w:r>
+          </w:p>
+        </w:tc>
+      </w:tr>
+      <w:tr>
+        <w:trPr>
+          <w:tblCellSpacing w:w="15" w:type="dxa"/>
+        </w:trPr>
+        <w:tc>
+          <w:tcPr>
+            <w:tcW w:w="0" w:type="auto"/>
+            <w:tcBorders>
+              <w:top w:val="single" w:sz="4" w:space="0" w:color="auto"/>
+              <w:left w:val="single" w:sz="4" w:space="0" w:color="auto"/>
+              <w:bottom w:val="single" w:sz="4" w:space="0" w:color="auto"/>
+              <w:right w:val="single" w:sz="4" w:space="0" w:color="auto"/>
+            </w:tcBorders>
+            <w:vAlign w:val="center"/>
+            <w:hideMark/>
+          </w:tcPr>
+          <w:p>
+            <w:pPr>
+              <w:spacing w:after="320" w:line="240" w:lineRule="auto"/>
+              <w:rPr>
+                <w:rFonts w:ascii="Times New Roman" w:eastAsia="Times New Roman" w:hAnsi="Times New Roman" w:cs="Times New Roman"/>
+                <w:sz w:val="24"/>
+                <w:szCs w:val="24"/>
+              </w:rPr>
+            </w:pPr>
+            <w:r>
+              <w:rPr>
+                <w:rFonts w:ascii="Times New Roman" w:eastAsia="Times New Roman" w:hAnsi="Times New Roman" w:cs="Times New Roman"/>
+                <w:b/>
+                <w:bCs/>
+                <w:sz w:val="24"/>
+                <w:szCs w:val="24"/>
+              </w:rPr>
+              <w:t>Average-case Time</w:t>
+            </w:r>
+          </w:p>
+        </w:tc>
+        <w:tc>
+          <w:tcPr>
+            <w:tcW w:w="0" w:type="auto"/>
+            <w:tcBorders>
+              <w:top w:val="single" w:sz="4" w:space="0" w:color="auto"/>
+              <w:left w:val="single" w:sz="4" w:space="0" w:color="auto"/>
+              <w:bottom w:val="single" w:sz="4" w:space="0" w:color="auto"/>
+              <w:right w:val="single" w:sz="4" w:space="0" w:color="auto"/>
+            </w:tcBorders>
+            <w:vAlign w:val="center"/>
+            <w:hideMark/>
+          </w:tcPr>
+          <w:p>
+            <w:pPr>
+              <w:spacing w:after="320" w:line="240" w:lineRule="auto"/>
+              <w:rPr>
+                <w:rFonts w:ascii="Times New Roman" w:eastAsia="Times New Roman" w:hAnsi="Times New Roman" w:cs="Times New Roman"/>
+                <w:sz w:val="24"/>
+                <w:szCs w:val="24"/>
+              </w:rPr>
+            </w:pPr>
+            <w:r>
+              <w:rPr>
+                <w:rFonts w:ascii="Times New Roman" w:eastAsia="Times New Roman" w:hAnsi="Times New Roman" w:cs="Times New Roman"/>
+                <w:sz w:val="24"/>
+                <w:szCs w:val="24"/>
+              </w:rPr>
+              <w:t>$O(n \log n)$</w:t>
+            </w:r>
+          </w:p>
+        </w:tc>
+      </w:tr>
+      <w:tr>
+        <w:trPr>
+          <w:tblCellSpacing w:w="15" w:type="dxa"/>
+        </w:trPr>
+        <w:tc>
+          <w:tcPr>
+            <w:tcW w:w="0" w:type="auto"/>
+            <w:tcBorders>
+              <w:top w:val="single" w:sz="4" w:space="0" w:color="auto"/>
+              <w:left w:val="single" w:sz="4" w:space="0" w:color="auto"/>
+              <w:bottom w:val="single" w:sz="4" w:space="0" w:color="auto"/>
+              <w:right w:val="single" w:sz="4" w:space="0" w:color="auto"/>
+            </w:tcBorders>
+            <w:vAlign w:val="center"/>
+            <w:hideMark/>
+          </w:tcPr>
+          <w:p>
+            <w:pPr>
+              <w:spacing w:after="320" w:line="240" w:lineRule="auto"/>
+              <w:rPr>
+                <w:rFonts w:ascii="Times New Roman" w:eastAsia="Times New Roman" w:hAnsi="Times New Roman" w:cs="Times New Roman"/>
+                <w:sz w:val="24"/>
+                <w:szCs w:val="24"/>
+              </w:rPr>
+            </w:pPr>
+            <w:r>
+              <w:rPr>
+                <w:rFonts w:ascii="Times New Roman" w:eastAsia="Times New Roman" w:hAnsi="Times New Roman" w:cs="Times New Roman"/>
+                <w:b/>
+                <w:bCs/>
+                <w:sz w:val="24"/>
+                <w:szCs w:val="24"/>
+              </w:rPr>
+              <w:lastRenderedPageBreak/>
+              <w:t>Best-case Time</w:t>
+            </w:r>
+          </w:p>
+        </w:tc>
+        <w:tc>
+          <w:tcPr>
+            <w:tcW w:w="0" w:type="auto"/>
+            <w:tcBorders>
+              <w:top w:val="single" w:sz="4" w:space="0" w:color="auto"/>
+              <w:left w:val="single" w:sz="4" w:space="0" w:color="auto"/>
+              <w:bottom w:val="single" w:sz="4" w:space="0" w:color="auto"/>
+              <w:right w:val="single" w:sz="4" w:space="0" w:color="auto"/>
+            </w:tcBorders>
+            <w:vAlign w:val="center"/>
+            <w:hideMark/>
+          </w:tcPr>
+          <w:p>
+            <w:pPr>
+              <w:spacing w:after="320" w:line="240" w:lineRule="auto"/>
+              <w:rPr>
+                <w:rFonts w:ascii="Times New Roman" w:eastAsia="Times New Roman" w:hAnsi="Times New Roman" w:cs="Times New Roman"/>
+                <w:sz w:val="24"/>
+                <w:szCs w:val="24"/>
+              </w:rPr>
+            </w:pPr>
+            <w:r>
+              <w:rPr>
+                <w:rFonts w:ascii="Times New Roman" w:eastAsia="Times New Roman" w:hAnsi="Times New Roman" w:cs="Times New Roman"/>
+                <w:sz w:val="24"/>
+                <w:szCs w:val="24"/>
+              </w:rPr>
+              <w:t>$O(n \log n)$</w:t>
+            </w:r>
+          </w:p>
+        </w:tc>
+      </w:tr>
+      <w:tr>
+        <w:trPr>
+          <w:tblCellSpacing w:w="15" w:type="dxa"/>
+        </w:trPr>
+        <w:tc>
+          <w:tcPr>
+            <w:tcW w:w="0" w:type="auto"/>
+            <w:tcBorders>
+              <w:top w:val="single" w:sz="4" w:space="0" w:color="auto"/>
+              <w:left w:val="single" w:sz="4" w:space="0" w:color="auto"/>
+              <w:bottom w:val="single" w:sz="4" w:space="0" w:color="auto"/>
+              <w:right w:val="single" w:sz="4" w:space="0" w:color="auto"/>
+            </w:tcBorders>
+            <w:vAlign w:val="center"/>
+            <w:hideMark/>
+          </w:tcPr>
+          <w:p>
+            <w:pPr>
+              <w:spacing w:after="320" w:line="240" w:lineRule="auto"/>
+              <w:rPr>
+                <w:rFonts w:ascii="Times New Roman" w:eastAsia="Times New Roman" w:hAnsi="Times New Roman" w:cs="Times New Roman"/>
+                <w:sz w:val="24"/>
+                <w:szCs w:val="24"/>
+              </w:rPr>
+            </w:pPr>
+            <w:r>
+              <w:rPr>
+                <w:rFonts w:ascii="Times New Roman" w:eastAsia="Times New Roman" w:hAnsi="Times New Roman" w:cs="Times New Roman"/>
+                <w:b/>
+                <w:bCs/>
+                <w:sz w:val="24"/>
+                <w:szCs w:val="24"/>
+              </w:rPr>
+              <w:t>Space Complexity</w:t>
+            </w:r>
+          </w:p>
+        </w:tc>
+        <w:tc>
+          <w:tcPr>
+            <w:tcW w:w="0" w:type="auto"/>
+            <w:tcBorders>
+              <w:top w:val="single" w:sz="4" w:space="0" w:color="auto"/>
+              <w:left w:val="single" w:sz="4" w:space="0" w:color="auto"/>
+              <w:bottom w:val="single" w:sz="4" w:space="0" w:color="auto"/>
+              <w:right w:val="single" w:sz="4" w:space="0" w:color="auto"/>
+            </w:tcBorders>
+            <w:vAlign w:val="center"/>
+            <w:hideMark/>
+          </w:tcPr>
+          <w:p>
+            <w:pPr>
+              <w:spacing w:after="320" w:line="240" w:lineRule="auto"/>
+              <w:rPr>
+                <w:rFonts w:ascii="Times New Roman" w:eastAsia="Times New Roman" w:hAnsi="Times New Roman" w:cs="Times New Roman"/>
+                <w:sz w:val="24"/>
+                <w:szCs w:val="24"/>
+              </w:rPr>
+            </w:pPr>
+            <w:r>
+              <w:rPr>
+                <w:rFonts w:ascii="Times New Roman" w:eastAsia="Times New Roman" w:hAnsi="Times New Roman" w:cs="Times New Roman"/>
+                <w:sz w:val="24"/>
+                <w:szCs w:val="24"/>
+              </w:rPr>
+              <w:t>$O(\log n)$ (For the recursive call stack; uses no extra array space)</w:t>
+            </w:r>
+          </w:p>
+        </w:tc>
+      </w:tr>
+    </w:tbl>
+    <w:p>
+      <w:pPr>
+        <w:jc w:val="center"/>
+        <w:rPr>
+          <w:b/>
+          <w:sz w:val="36"/>
+          <w:szCs w:val="36"/>
+        </w:rPr>
+      </w:pPr>
+    </w:p>
     <w:sectPr>
       <w:pgSz w:w="12240" w:h="15840"/>
       <w:pgMar w:top="1440" w:right="1440" w:bottom="1440" w:left="1440" w:header="720" w:footer="720" w:gutter="0"/>
@@ -5434,6 +6644,272 @@
     </w:lvl>
   </w:abstractNum>
   <w:abstractNum w:abstractNumId="6">
+    <w:nsid w:val="3F2C3468"/>
+    <w:multiLevelType w:val="multilevel"/>
+    <w:tmpl w:val="875EAECE"/>
+    <w:lvl w:ilvl="0">
+      <w:start w:val="1"/>
+      <w:numFmt w:val="bullet"/>
+      <w:lvlText w:val=""/>
+      <w:lvlJc w:val="left"/>
+      <w:pPr>
+        <w:tabs>
+          <w:tab w:val="num" w:pos="720"/>
+        </w:tabs>
+        <w:ind w:left="720" w:hanging="360"/>
+      </w:pPr>
+      <w:rPr>
+        <w:rFonts w:ascii="Symbol" w:hAnsi="Symbol" w:hint="default"/>
+        <w:sz w:val="20"/>
+      </w:rPr>
+    </w:lvl>
+    <w:lvl w:ilvl="1">
+      <w:start w:val="1"/>
+      <w:numFmt w:val="bullet"/>
+      <w:lvlText w:val="o"/>
+      <w:lvlJc w:val="left"/>
+      <w:pPr>
+        <w:tabs>
+          <w:tab w:val="num" w:pos="1440"/>
+        </w:tabs>
+        <w:ind w:left="1440" w:hanging="360"/>
+      </w:pPr>
+      <w:rPr>
+        <w:rFonts w:ascii="Courier New" w:hAnsi="Courier New" w:hint="default"/>
+        <w:sz w:val="20"/>
+      </w:rPr>
+    </w:lvl>
+    <w:lvl w:ilvl="2" w:tentative="1">
+      <w:start w:val="1"/>
+      <w:numFmt w:val="bullet"/>
+      <w:lvlText w:val=""/>
+      <w:lvlJc w:val="left"/>
+      <w:pPr>
+        <w:tabs>
+          <w:tab w:val="num" w:pos="2160"/>
+        </w:tabs>
+        <w:ind w:left="2160" w:hanging="360"/>
+      </w:pPr>
+      <w:rPr>
+        <w:rFonts w:ascii="Wingdings" w:hAnsi="Wingdings" w:hint="default"/>
+        <w:sz w:val="20"/>
+      </w:rPr>
+    </w:lvl>
+    <w:lvl w:ilvl="3" w:tentative="1">
+      <w:start w:val="1"/>
+      <w:numFmt w:val="bullet"/>
+      <w:lvlText w:val=""/>
+      <w:lvlJc w:val="left"/>
+      <w:pPr>
+        <w:tabs>
+          <w:tab w:val="num" w:pos="2880"/>
+        </w:tabs>
+        <w:ind w:left="2880" w:hanging="360"/>
+      </w:pPr>
+      <w:rPr>
+        <w:rFonts w:ascii="Wingdings" w:hAnsi="Wingdings" w:hint="default"/>
+        <w:sz w:val="20"/>
+      </w:rPr>
+    </w:lvl>
+    <w:lvl w:ilvl="4" w:tentative="1">
+      <w:start w:val="1"/>
+      <w:numFmt w:val="bullet"/>
+      <w:lvlText w:val=""/>
+      <w:lvlJc w:val="left"/>
+      <w:pPr>
+        <w:tabs>
+          <w:tab w:val="num" w:pos="3600"/>
+        </w:tabs>
+        <w:ind w:left="3600" w:hanging="360"/>
+      </w:pPr>
+      <w:rPr>
+        <w:rFonts w:ascii="Wingdings" w:hAnsi="Wingdings" w:hint="default"/>
+        <w:sz w:val="20"/>
+      </w:rPr>
+    </w:lvl>
+    <w:lvl w:ilvl="5" w:tentative="1">
+      <w:start w:val="1"/>
+      <w:numFmt w:val="bullet"/>
+      <w:lvlText w:val=""/>
+      <w:lvlJc w:val="left"/>
+      <w:pPr>
+        <w:tabs>
+          <w:tab w:val="num" w:pos="4320"/>
+        </w:tabs>
+        <w:ind w:left="4320" w:hanging="360"/>
+      </w:pPr>
+      <w:rPr>
+        <w:rFonts w:ascii="Wingdings" w:hAnsi="Wingdings" w:hint="default"/>
+        <w:sz w:val="20"/>
+      </w:rPr>
+    </w:lvl>
+    <w:lvl w:ilvl="6" w:tentative="1">
+      <w:start w:val="1"/>
+      <w:numFmt w:val="bullet"/>
+      <w:lvlText w:val=""/>
+      <w:lvlJc w:val="left"/>
+      <w:pPr>
+        <w:tabs>
+          <w:tab w:val="num" w:pos="5040"/>
+        </w:tabs>
+        <w:ind w:left="5040" w:hanging="360"/>
+      </w:pPr>
+      <w:rPr>
+        <w:rFonts w:ascii="Wingdings" w:hAnsi="Wingdings" w:hint="default"/>
+        <w:sz w:val="20"/>
+      </w:rPr>
+    </w:lvl>
+    <w:lvl w:ilvl="7" w:tentative="1">
+      <w:start w:val="1"/>
+      <w:numFmt w:val="bullet"/>
+      <w:lvlText w:val=""/>
+      <w:lvlJc w:val="left"/>
+      <w:pPr>
+        <w:tabs>
+          <w:tab w:val="num" w:pos="5760"/>
+        </w:tabs>
+        <w:ind w:left="5760" w:hanging="360"/>
+      </w:pPr>
+      <w:rPr>
+        <w:rFonts w:ascii="Wingdings" w:hAnsi="Wingdings" w:hint="default"/>
+        <w:sz w:val="20"/>
+      </w:rPr>
+    </w:lvl>
+    <w:lvl w:ilvl="8" w:tentative="1">
+      <w:start w:val="1"/>
+      <w:numFmt w:val="bullet"/>
+      <w:lvlText w:val=""/>
+      <w:lvlJc w:val="left"/>
+      <w:pPr>
+        <w:tabs>
+          <w:tab w:val="num" w:pos="6480"/>
+        </w:tabs>
+        <w:ind w:left="6480" w:hanging="360"/>
+      </w:pPr>
+      <w:rPr>
+        <w:rFonts w:ascii="Wingdings" w:hAnsi="Wingdings" w:hint="default"/>
+        <w:sz w:val="20"/>
+      </w:rPr>
+    </w:lvl>
+  </w:abstractNum>
+  <w:abstractNum w:abstractNumId="7">
+    <w:nsid w:val="43A30779"/>
+    <w:multiLevelType w:val="multilevel"/>
+    <w:tmpl w:val="BACC9242"/>
+    <w:lvl w:ilvl="0">
+      <w:start w:val="1"/>
+      <w:numFmt w:val="decimal"/>
+      <w:lvlText w:val="%1."/>
+      <w:lvlJc w:val="left"/>
+      <w:pPr>
+        <w:tabs>
+          <w:tab w:val="num" w:pos="720"/>
+        </w:tabs>
+        <w:ind w:left="720" w:hanging="360"/>
+      </w:pPr>
+    </w:lvl>
+    <w:lvl w:ilvl="1">
+      <w:start w:val="1"/>
+      <w:numFmt w:val="bullet"/>
+      <w:lvlText w:val="o"/>
+      <w:lvlJc w:val="left"/>
+      <w:pPr>
+        <w:tabs>
+          <w:tab w:val="num" w:pos="1440"/>
+        </w:tabs>
+        <w:ind w:left="1440" w:hanging="360"/>
+      </w:pPr>
+      <w:rPr>
+        <w:rFonts w:ascii="Courier New" w:hAnsi="Courier New" w:hint="default"/>
+        <w:sz w:val="20"/>
+      </w:rPr>
+    </w:lvl>
+    <w:lvl w:ilvl="2" w:tentative="1">
+      <w:start w:val="1"/>
+      <w:numFmt w:val="decimal"/>
+      <w:lvlText w:val="%3."/>
+      <w:lvlJc w:val="left"/>
+      <w:pPr>
+        <w:tabs>
+          <w:tab w:val="num" w:pos="2160"/>
+        </w:tabs>
+        <w:ind w:left="2160" w:hanging="360"/>
+      </w:pPr>
+    </w:lvl>
+    <w:lvl w:ilvl="3" w:tentative="1">
+      <w:start w:val="1"/>
+      <w:numFmt w:val="decimal"/>
+      <w:lvlText w:val="%4."/>
+      <w:lvlJc w:val="left"/>
+      <w:pPr>
+        <w:tabs>
+          <w:tab w:val="num" w:pos="2880"/>
+        </w:tabs>
+        <w:ind w:left="2880" w:hanging="360"/>
+      </w:pPr>
+    </w:lvl>
+    <w:lvl w:ilvl="4" w:tentative="1">
+      <w:start w:val="1"/>
+      <w:numFmt w:val="decimal"/>
+      <w:lvlText w:val="%5."/>
+      <w:lvlJc w:val="left"/>
+      <w:pPr>
+        <w:tabs>
+          <w:tab w:val="num" w:pos="3600"/>
+        </w:tabs>
+        <w:ind w:left="3600" w:hanging="360"/>
+      </w:pPr>
+    </w:lvl>
+    <w:lvl w:ilvl="5" w:tentative="1">
+      <w:start w:val="1"/>
+      <w:numFmt w:val="decimal"/>
+      <w:lvlText w:val="%6."/>
+      <w:lvlJc w:val="left"/>
+      <w:pPr>
+        <w:tabs>
+          <w:tab w:val="num" w:pos="4320"/>
+        </w:tabs>
+        <w:ind w:left="4320" w:hanging="360"/>
+      </w:pPr>
+    </w:lvl>
+    <w:lvl w:ilvl="6" w:tentative="1">
+      <w:start w:val="1"/>
+      <w:numFmt w:val="decimal"/>
+      <w:lvlText w:val="%7."/>
+      <w:lvlJc w:val="left"/>
+      <w:pPr>
+        <w:tabs>
+          <w:tab w:val="num" w:pos="5040"/>
+        </w:tabs>
+        <w:ind w:left="5040" w:hanging="360"/>
+      </w:pPr>
+    </w:lvl>
+    <w:lvl w:ilvl="7" w:tentative="1">
+      <w:start w:val="1"/>
+      <w:numFmt w:val="decimal"/>
+      <w:lvlText w:val="%8."/>
+      <w:lvlJc w:val="left"/>
+      <w:pPr>
+        <w:tabs>
+          <w:tab w:val="num" w:pos="5760"/>
+        </w:tabs>
+        <w:ind w:left="5760" w:hanging="360"/>
+      </w:pPr>
+    </w:lvl>
+    <w:lvl w:ilvl="8" w:tentative="1">
+      <w:start w:val="1"/>
+      <w:numFmt w:val="decimal"/>
+      <w:lvlText w:val="%9."/>
+      <w:lvlJc w:val="left"/>
+      <w:pPr>
+        <w:tabs>
+          <w:tab w:val="num" w:pos="6480"/>
+        </w:tabs>
+        <w:ind w:left="6480" w:hanging="360"/>
+      </w:pPr>
+    </w:lvl>
+  </w:abstractNum>
+  <w:abstractNum w:abstractNumId="8">
     <w:nsid w:val="595278FC"/>
     <w:multiLevelType w:val="multilevel"/>
     <w:tmpl w:val="3908365E"/>
@@ -5546,7 +7022,7 @@
       </w:pPr>
     </w:lvl>
   </w:abstractNum>
-  <w:abstractNum w:abstractNumId="7">
+  <w:abstractNum w:abstractNumId="9">
     <w:nsid w:val="67B67538"/>
     <w:multiLevelType w:val="multilevel"/>
     <w:tmpl w:val="6FD26896"/>
@@ -5705,7 +7181,7 @@
     <w:abstractNumId w:val="5"/>
   </w:num>
   <w:num w:numId="4">
-    <w:abstractNumId w:val="7"/>
+    <w:abstractNumId w:val="9"/>
   </w:num>
   <w:num w:numId="5">
     <w:abstractNumId w:val="3"/>
@@ -5714,10 +7190,16 @@
     <w:abstractNumId w:val="4"/>
   </w:num>
   <w:num w:numId="7">
-    <w:abstractNumId w:val="6"/>
+    <w:abstractNumId w:val="8"/>
   </w:num>
   <w:num w:numId="8">
     <w:abstractNumId w:val="2"/>
+  </w:num>
+  <w:num w:numId="9">
+    <w:abstractNumId w:val="7"/>
+  </w:num>
+  <w:num w:numId="10">
+    <w:abstractNumId w:val="6"/>
   </w:num>
 </w:numbering>
 </file>

</xml_diff>

<commit_message>
Adding Counting Sort Algo
</commit_message>
<xml_diff>
--- a/Sorting Algorithms/Sortings.docx
+++ b/Sorting Algorithms/Sortings.docx
@@ -1911,7 +1911,7 @@
                 <w:sz w:val="24"/>
                 <w:szCs w:val="24"/>
               </w:rPr>
-              <w:t>$O(n^2)$</w:t>
+              <w:t>O(n^2)</w:t>
             </w:r>
           </w:p>
         </w:tc>
@@ -1980,7 +1980,7 @@
                 <w:sz w:val="24"/>
                 <w:szCs w:val="24"/>
               </w:rPr>
-              <w:t>$O(n^2)$</w:t>
+              <w:t>O(n^2)</w:t>
             </w:r>
           </w:p>
         </w:tc>
@@ -2049,7 +2049,7 @@
                 <w:sz w:val="24"/>
                 <w:szCs w:val="24"/>
               </w:rPr>
-              <w:t>$O(n^2)$</w:t>
+              <w:t>O(n^2)</w:t>
             </w:r>
           </w:p>
         </w:tc>
@@ -2118,7 +2118,15 @@
                 <w:sz w:val="24"/>
                 <w:szCs w:val="24"/>
               </w:rPr>
-              <w:t>$O(1)$ (In-place)</w:t>
+              <w:t>O(1)</w:t>
+            </w:r>
+            <w:r>
+              <w:rPr>
+                <w:rFonts w:ascii="Times New Roman" w:eastAsia="Times New Roman" w:hAnsi="Times New Roman" w:cs="Times New Roman"/>
+                <w:sz w:val="24"/>
+                <w:szCs w:val="24"/>
+              </w:rPr>
+              <w:t xml:space="preserve"> (In-place)</w:t>
             </w:r>
           </w:p>
         </w:tc>
@@ -2602,7 +2610,15 @@
           <w:sz w:val="24"/>
           <w:szCs w:val="24"/>
         </w:rPr>
-        <w:t xml:space="preserve"> is our key. Is $11 &lt; 12$? Yes. Move 12 right $\</w:t>
+        <w:t xml:space="preserve"> is our key. Is 11 &lt; 1</w:t>
+      </w:r>
+      <w:r>
+        <w:rPr>
+          <w:rFonts w:ascii="Times New Roman" w:eastAsia="Times New Roman" w:hAnsi="Times New Roman" w:cs="Times New Roman"/>
+          <w:sz w:val="24"/>
+          <w:szCs w:val="24"/>
+        </w:rPr>
+        <w:t>$? Yes. Move 12 right $\</w:t>
       </w:r>
       <w:proofErr w:type="spellStart"/>
       <w:r>
@@ -2682,7 +2698,7 @@
           <w:sz w:val="24"/>
           <w:szCs w:val="24"/>
         </w:rPr>
-        <w:t xml:space="preserve"> is our key. Is $13 &lt; 12$? No. Stay put $\</w:t>
+        <w:t xml:space="preserve"> is our key. Is 13 &lt; 12? No. Stay put </w:t>
       </w:r>
       <w:proofErr w:type="spellStart"/>
       <w:r>
@@ -2700,14 +2716,30 @@
           <w:sz w:val="24"/>
           <w:szCs w:val="24"/>
         </w:rPr>
-        <w:t xml:space="preserve">$ </w:t>
+        <w:t xml:space="preserve"> </w:t>
       </w:r>
       <w:r>
         <w:rPr>
           <w:rFonts w:ascii="Courier New" w:eastAsia="Times New Roman" w:hAnsi="Courier New" w:cs="Courier New"/>
           <w:sz w:val="20"/>
         </w:rPr>
-        <w:t>[11, 12, 13, 5]</w:t>
+        <w:t xml:space="preserve">[11, 12, 13, </w:t>
+      </w:r>
+      <w:proofErr w:type="gramStart"/>
+      <w:r>
+        <w:rPr>
+          <w:rFonts w:ascii="Courier New" w:eastAsia="Times New Roman" w:hAnsi="Courier New" w:cs="Courier New"/>
+          <w:sz w:val="20"/>
+        </w:rPr>
+        <w:t>5</w:t>
+      </w:r>
+      <w:proofErr w:type="gramEnd"/>
+      <w:r>
+        <w:rPr>
+          <w:rFonts w:ascii="Courier New" w:eastAsia="Times New Roman" w:hAnsi="Courier New" w:cs="Courier New"/>
+          <w:sz w:val="20"/>
+        </w:rPr>
+        <w:t>]</w:t>
       </w:r>
       <w:r>
         <w:rPr>
@@ -2784,7 +2816,15 @@
           <w:sz w:val="24"/>
           <w:szCs w:val="24"/>
         </w:rPr>
-        <w:t>Is $5 &lt; 13$? Yes. Shift 13.</w:t>
+        <w:t>Is 5 &lt; 13</w:t>
+      </w:r>
+      <w:r>
+        <w:rPr>
+          <w:rFonts w:ascii="Times New Roman" w:eastAsia="Times New Roman" w:hAnsi="Times New Roman" w:cs="Times New Roman"/>
+          <w:sz w:val="24"/>
+          <w:szCs w:val="24"/>
+        </w:rPr>
+        <w:t>? Yes. Shift 13.</w:t>
       </w:r>
     </w:p>
     <w:p>
@@ -2806,7 +2846,15 @@
           <w:sz w:val="24"/>
           <w:szCs w:val="24"/>
         </w:rPr>
-        <w:t>Is $5 &lt; 12$? Yes. Shift 12.</w:t>
+        <w:t>Is 5 &lt; 12</w:t>
+      </w:r>
+      <w:r>
+        <w:rPr>
+          <w:rFonts w:ascii="Times New Roman" w:eastAsia="Times New Roman" w:hAnsi="Times New Roman" w:cs="Times New Roman"/>
+          <w:sz w:val="24"/>
+          <w:szCs w:val="24"/>
+        </w:rPr>
+        <w:t>? Yes. Shift 12.</w:t>
       </w:r>
     </w:p>
     <w:p>
@@ -2828,7 +2876,15 @@
           <w:sz w:val="24"/>
           <w:szCs w:val="24"/>
         </w:rPr>
-        <w:t>Is $5 &lt; 11$? Yes. Shift 11.</w:t>
+        <w:t>Is 5 &lt; 11</w:t>
+      </w:r>
+      <w:r>
+        <w:rPr>
+          <w:rFonts w:ascii="Times New Roman" w:eastAsia="Times New Roman" w:hAnsi="Times New Roman" w:cs="Times New Roman"/>
+          <w:sz w:val="24"/>
+          <w:szCs w:val="24"/>
+        </w:rPr>
+        <w:t>? Yes. Shift 11.</w:t>
       </w:r>
     </w:p>
     <w:p>
@@ -2995,7 +3051,6 @@
                 <w:sz w:val="24"/>
                 <w:szCs w:val="24"/>
               </w:rPr>
-              <w:lastRenderedPageBreak/>
               <w:t>Metric</w:t>
             </w:r>
           </w:p>
@@ -3067,6 +3122,7 @@
                 <w:sz w:val="24"/>
                 <w:szCs w:val="24"/>
               </w:rPr>
+              <w:lastRenderedPageBreak/>
               <w:t>Worst-case Time</w:t>
             </w:r>
           </w:p>
@@ -3098,7 +3154,7 @@
                 <w:sz w:val="24"/>
                 <w:szCs w:val="24"/>
               </w:rPr>
-              <w:t>$O(n^2)$</w:t>
+              <w:t>O(n^2)</w:t>
             </w:r>
           </w:p>
         </w:tc>
@@ -3167,7 +3223,7 @@
                 <w:sz w:val="24"/>
                 <w:szCs w:val="24"/>
               </w:rPr>
-              <w:t>$O(n^2)$</w:t>
+              <w:t>O(n^2)</w:t>
             </w:r>
           </w:p>
         </w:tc>
@@ -3236,7 +3292,15 @@
                 <w:sz w:val="24"/>
                 <w:szCs w:val="24"/>
               </w:rPr>
-              <w:t>$O(n)$ (If list is already sorted)</w:t>
+              <w:t>O(n)</w:t>
+            </w:r>
+            <w:r>
+              <w:rPr>
+                <w:rFonts w:ascii="Times New Roman" w:eastAsia="Times New Roman" w:hAnsi="Times New Roman" w:cs="Times New Roman"/>
+                <w:sz w:val="24"/>
+                <w:szCs w:val="24"/>
+              </w:rPr>
+              <w:t xml:space="preserve"> (If list is already sorted)</w:t>
             </w:r>
           </w:p>
         </w:tc>
@@ -3305,7 +3369,15 @@
                 <w:sz w:val="24"/>
                 <w:szCs w:val="24"/>
               </w:rPr>
-              <w:t>$O(1)$ (In-place)</w:t>
+              <w:t>O(1)</w:t>
+            </w:r>
+            <w:r>
+              <w:rPr>
+                <w:rFonts w:ascii="Times New Roman" w:eastAsia="Times New Roman" w:hAnsi="Times New Roman" w:cs="Times New Roman"/>
+                <w:sz w:val="24"/>
+                <w:szCs w:val="24"/>
+              </w:rPr>
+              <w:t xml:space="preserve"> (In-place)</w:t>
             </w:r>
           </w:p>
         </w:tc>
@@ -4177,7 +4249,7 @@
       </w:tblPr>
       <w:tblGrid>
         <w:gridCol w:w="2048"/>
-        <w:gridCol w:w="6767"/>
+        <w:gridCol w:w="6527"/>
       </w:tblGrid>
       <w:tr>
         <w:trPr>
@@ -4315,7 +4387,7 @@
                 <w:sz w:val="24"/>
                 <w:szCs w:val="24"/>
               </w:rPr>
-              <w:t>$O(n \log n)$</w:t>
+              <w:t>O(n \log n)</w:t>
             </w:r>
           </w:p>
         </w:tc>
@@ -4384,7 +4456,7 @@
                 <w:sz w:val="24"/>
                 <w:szCs w:val="24"/>
               </w:rPr>
-              <w:t>$O(n \log n)$</w:t>
+              <w:t>O(n \log n)</w:t>
             </w:r>
           </w:p>
         </w:tc>
@@ -4453,7 +4525,7 @@
                 <w:sz w:val="24"/>
                 <w:szCs w:val="24"/>
               </w:rPr>
-              <w:t>$O(n \log n)$</w:t>
+              <w:t>O(n \log n)</w:t>
             </w:r>
           </w:p>
         </w:tc>
@@ -4522,7 +4594,15 @@
                 <w:sz w:val="24"/>
                 <w:szCs w:val="24"/>
               </w:rPr>
-              <w:t>$O(n)$ (</w:t>
+              <w:t>O(n)</w:t>
+            </w:r>
+            <w:r>
+              <w:rPr>
+                <w:rFonts w:ascii="Times New Roman" w:eastAsia="Times New Roman" w:hAnsi="Times New Roman" w:cs="Times New Roman"/>
+                <w:sz w:val="24"/>
+                <w:szCs w:val="24"/>
+              </w:rPr>
+              <w:t xml:space="preserve"> (</w:t>
             </w:r>
             <w:r>
               <w:rPr>
@@ -5483,7 +5563,7 @@
       </w:tblPr>
       <w:tblGrid>
         <w:gridCol w:w="2048"/>
-        <w:gridCol w:w="6553"/>
+        <w:gridCol w:w="6313"/>
       </w:tblGrid>
       <w:tr>
         <w:trPr>
@@ -5621,7 +5701,15 @@
                 <w:sz w:val="24"/>
                 <w:szCs w:val="24"/>
               </w:rPr>
-              <w:t>$O(n^2)$ (Rare—happens with highly skewed pivots)</w:t>
+              <w:t>O(n^2)</w:t>
+            </w:r>
+            <w:r>
+              <w:rPr>
+                <w:rFonts w:ascii="Times New Roman" w:eastAsia="Times New Roman" w:hAnsi="Times New Roman" w:cs="Times New Roman"/>
+                <w:sz w:val="24"/>
+                <w:szCs w:val="24"/>
+              </w:rPr>
+              <w:t xml:space="preserve"> (Rare—happens with highly skewed pivots)</w:t>
             </w:r>
           </w:p>
         </w:tc>
@@ -5690,7 +5778,7 @@
                 <w:sz w:val="24"/>
                 <w:szCs w:val="24"/>
               </w:rPr>
-              <w:t>$O(n \log n)$</w:t>
+              <w:t>O(n \log n)</w:t>
             </w:r>
           </w:p>
         </w:tc>
@@ -5760,7 +5848,7 @@
                 <w:sz w:val="24"/>
                 <w:szCs w:val="24"/>
               </w:rPr>
-              <w:t>$O(n \log n)$</w:t>
+              <w:t>O(n \log n)</w:t>
             </w:r>
           </w:p>
         </w:tc>
@@ -5829,7 +5917,1062 @@
                 <w:sz w:val="24"/>
                 <w:szCs w:val="24"/>
               </w:rPr>
-              <w:t>$O(\log n)$ (For the recursive call stack; uses no extra array space)</w:t>
+              <w:t>O(\log n)</w:t>
+            </w:r>
+            <w:r>
+              <w:rPr>
+                <w:rFonts w:ascii="Times New Roman" w:eastAsia="Times New Roman" w:hAnsi="Times New Roman" w:cs="Times New Roman"/>
+                <w:sz w:val="24"/>
+                <w:szCs w:val="24"/>
+              </w:rPr>
+              <w:t xml:space="preserve"> (For the recursive call stack; uses no extra array space)</w:t>
+            </w:r>
+          </w:p>
+        </w:tc>
+      </w:tr>
+    </w:tbl>
+    <w:p>
+      <w:pPr>
+        <w:jc w:val="center"/>
+        <w:rPr>
+          <w:b/>
+          <w:sz w:val="36"/>
+          <w:szCs w:val="36"/>
+        </w:rPr>
+      </w:pPr>
+    </w:p>
+    <w:p>
+      <w:pPr>
+        <w:jc w:val="center"/>
+        <w:rPr>
+          <w:b/>
+          <w:sz w:val="36"/>
+          <w:szCs w:val="36"/>
+        </w:rPr>
+      </w:pPr>
+    </w:p>
+    <w:p>
+      <w:pPr>
+        <w:jc w:val="center"/>
+        <w:rPr>
+          <w:b/>
+          <w:sz w:val="36"/>
+          <w:szCs w:val="36"/>
+        </w:rPr>
+      </w:pPr>
+      <w:r>
+        <w:rPr>
+          <w:b/>
+          <w:sz w:val="36"/>
+          <w:szCs w:val="36"/>
+        </w:rPr>
+        <w:t>Counting Sort</w:t>
+      </w:r>
+    </w:p>
+    <w:p>
+      <w:pPr>
+        <w:spacing w:before="100" w:beforeAutospacing="1" w:after="100" w:afterAutospacing="1" w:line="240" w:lineRule="auto"/>
+        <w:rPr>
+          <w:rFonts w:ascii="Times New Roman" w:eastAsia="Times New Roman" w:hAnsi="Times New Roman" w:cs="Times New Roman"/>
+          <w:sz w:val="24"/>
+          <w:szCs w:val="24"/>
+        </w:rPr>
+      </w:pPr>
+      <w:r>
+        <w:rPr>
+          <w:rFonts w:ascii="Times New Roman" w:eastAsia="Times New Roman" w:hAnsi="Times New Roman" w:cs="Times New Roman"/>
+          <w:b/>
+          <w:bCs/>
+          <w:sz w:val="24"/>
+          <w:szCs w:val="24"/>
+        </w:rPr>
+        <w:t>Counting Sort</w:t>
+      </w:r>
+      <w:r>
+        <w:rPr>
+          <w:rFonts w:ascii="Times New Roman" w:eastAsia="Times New Roman" w:hAnsi="Times New Roman" w:cs="Times New Roman"/>
+          <w:sz w:val="24"/>
+          <w:szCs w:val="24"/>
+        </w:rPr>
+        <w:t xml:space="preserve"> is </w:t>
+      </w:r>
+      <w:r>
+        <w:rPr>
+          <w:rFonts w:ascii="Times New Roman" w:eastAsia="Times New Roman" w:hAnsi="Times New Roman" w:cs="Times New Roman"/>
+          <w:b/>
+          <w:bCs/>
+          <w:sz w:val="24"/>
+          <w:szCs w:val="24"/>
+        </w:rPr>
+        <w:t>"The Inventory Clerk."</w:t>
+      </w:r>
+      <w:r>
+        <w:rPr>
+          <w:rFonts w:ascii="Times New Roman" w:eastAsia="Times New Roman" w:hAnsi="Times New Roman" w:cs="Times New Roman"/>
+          <w:sz w:val="24"/>
+          <w:szCs w:val="24"/>
+        </w:rPr>
+        <w:t xml:space="preserve"> It completely shatters that speed limit because it </w:t>
+      </w:r>
+      <w:r>
+        <w:rPr>
+          <w:rFonts w:ascii="Times New Roman" w:eastAsia="Times New Roman" w:hAnsi="Times New Roman" w:cs="Times New Roman"/>
+          <w:b/>
+          <w:bCs/>
+          <w:sz w:val="24"/>
+          <w:szCs w:val="24"/>
+        </w:rPr>
+        <w:t>does not compare elements</w:t>
+      </w:r>
+      <w:r>
+        <w:rPr>
+          <w:rFonts w:ascii="Times New Roman" w:eastAsia="Times New Roman" w:hAnsi="Times New Roman" w:cs="Times New Roman"/>
+          <w:sz w:val="24"/>
+          <w:szCs w:val="24"/>
+        </w:rPr>
+        <w:t>. Instead, it loops through the list, counts how many times each number appears, and uses math to map them directly to their final positions.</w:t>
+      </w:r>
+    </w:p>
+    <w:p>
+      <w:pPr>
+        <w:spacing w:before="100" w:beforeAutospacing="1" w:after="100" w:afterAutospacing="1" w:line="240" w:lineRule="auto"/>
+        <w:outlineLvl w:val="2"/>
+        <w:rPr>
+          <w:rFonts w:ascii="Times New Roman" w:eastAsia="Times New Roman" w:hAnsi="Times New Roman" w:cs="Times New Roman"/>
+          <w:b/>
+          <w:bCs/>
+          <w:sz w:val="27"/>
+          <w:szCs w:val="27"/>
+        </w:rPr>
+      </w:pPr>
+      <w:r>
+        <w:rPr>
+          <w:rFonts w:ascii="Times New Roman" w:eastAsia="Times New Roman" w:hAnsi="Times New Roman" w:cs="Times New Roman"/>
+          <w:b/>
+          <w:bCs/>
+          <w:sz w:val="27"/>
+          <w:szCs w:val="27"/>
+        </w:rPr>
+        <w:t>How It Works (The Metaphor)</w:t>
+      </w:r>
+    </w:p>
+    <w:p>
+      <w:pPr>
+        <w:spacing w:before="100" w:beforeAutospacing="1" w:after="100" w:afterAutospacing="1" w:line="240" w:lineRule="auto"/>
+        <w:rPr>
+          <w:rFonts w:ascii="Times New Roman" w:eastAsia="Times New Roman" w:hAnsi="Times New Roman" w:cs="Times New Roman"/>
+          <w:sz w:val="24"/>
+          <w:szCs w:val="24"/>
+        </w:rPr>
+      </w:pPr>
+      <w:r>
+        <w:rPr>
+          <w:rFonts w:ascii="Times New Roman" w:eastAsia="Times New Roman" w:hAnsi="Times New Roman" w:cs="Times New Roman"/>
+          <w:sz w:val="24"/>
+          <w:szCs w:val="24"/>
+        </w:rPr>
+        <w:t>Imagine you are sorting a big box of T-shirts by size: Small, Medium, and Large. You wouldn't compare a Small to a Medium to see which is bigger. Instead, you throw all the Smalls in pile 1, Mediums in pile 2, and Larges in pile 3. Then you just lay them out in order.</w:t>
+      </w:r>
+    </w:p>
+    <w:p>
+      <w:pPr>
+        <w:numPr>
+          <w:ilvl w:val="0"/>
+          <w:numId w:val="11"/>
+        </w:numPr>
+        <w:spacing w:before="100" w:beforeAutospacing="1" w:after="100" w:afterAutospacing="1" w:line="240" w:lineRule="auto"/>
+        <w:rPr>
+          <w:rFonts w:ascii="Times New Roman" w:eastAsia="Times New Roman" w:hAnsi="Times New Roman" w:cs="Times New Roman"/>
+          <w:sz w:val="24"/>
+          <w:szCs w:val="24"/>
+        </w:rPr>
+      </w:pPr>
+      <w:r>
+        <w:rPr>
+          <w:rFonts w:ascii="Times New Roman" w:eastAsia="Times New Roman" w:hAnsi="Times New Roman" w:cs="Times New Roman"/>
+          <w:b/>
+          <w:bCs/>
+          <w:sz w:val="24"/>
+          <w:szCs w:val="24"/>
+        </w:rPr>
+        <w:t>Find the Maximum:</w:t>
+      </w:r>
+      <w:r>
+        <w:rPr>
+          <w:rFonts w:ascii="Times New Roman" w:eastAsia="Times New Roman" w:hAnsi="Times New Roman" w:cs="Times New Roman"/>
+          <w:sz w:val="24"/>
+          <w:szCs w:val="24"/>
+        </w:rPr>
+        <w:t xml:space="preserve"> Look at the input list to find the largest number (let's call it $k$).</w:t>
+      </w:r>
+    </w:p>
+    <w:p>
+      <w:pPr>
+        <w:numPr>
+          <w:ilvl w:val="0"/>
+          <w:numId w:val="11"/>
+        </w:numPr>
+        <w:spacing w:before="100" w:beforeAutospacing="1" w:after="100" w:afterAutospacing="1" w:line="240" w:lineRule="auto"/>
+        <w:rPr>
+          <w:rFonts w:ascii="Times New Roman" w:eastAsia="Times New Roman" w:hAnsi="Times New Roman" w:cs="Times New Roman"/>
+          <w:sz w:val="24"/>
+          <w:szCs w:val="24"/>
+        </w:rPr>
+      </w:pPr>
+      <w:r>
+        <w:rPr>
+          <w:rFonts w:ascii="Times New Roman" w:eastAsia="Times New Roman" w:hAnsi="Times New Roman" w:cs="Times New Roman"/>
+          <w:b/>
+          <w:bCs/>
+          <w:sz w:val="24"/>
+          <w:szCs w:val="24"/>
+        </w:rPr>
+        <w:t>Create a Count Array:</w:t>
+      </w:r>
+      <w:r>
+        <w:rPr>
+          <w:rFonts w:ascii="Times New Roman" w:eastAsia="Times New Roman" w:hAnsi="Times New Roman" w:cs="Times New Roman"/>
+          <w:sz w:val="24"/>
+          <w:szCs w:val="24"/>
+        </w:rPr>
+        <w:t xml:space="preserve"> Create a new array of zeros with a size of $k + 1$. Each index represents a number from your list.</w:t>
+      </w:r>
+    </w:p>
+    <w:p>
+      <w:pPr>
+        <w:numPr>
+          <w:ilvl w:val="0"/>
+          <w:numId w:val="11"/>
+        </w:numPr>
+        <w:spacing w:before="100" w:beforeAutospacing="1" w:after="100" w:afterAutospacing="1" w:line="240" w:lineRule="auto"/>
+        <w:rPr>
+          <w:rFonts w:ascii="Times New Roman" w:eastAsia="Times New Roman" w:hAnsi="Times New Roman" w:cs="Times New Roman"/>
+          <w:sz w:val="24"/>
+          <w:szCs w:val="24"/>
+        </w:rPr>
+      </w:pPr>
+      <w:r>
+        <w:rPr>
+          <w:rFonts w:ascii="Times New Roman" w:eastAsia="Times New Roman" w:hAnsi="Times New Roman" w:cs="Times New Roman"/>
+          <w:b/>
+          <w:bCs/>
+          <w:sz w:val="24"/>
+          <w:szCs w:val="24"/>
+        </w:rPr>
+        <w:t>Count '</w:t>
+      </w:r>
+      <w:proofErr w:type="spellStart"/>
+      <w:r>
+        <w:rPr>
+          <w:rFonts w:ascii="Times New Roman" w:eastAsia="Times New Roman" w:hAnsi="Times New Roman" w:cs="Times New Roman"/>
+          <w:b/>
+          <w:bCs/>
+          <w:sz w:val="24"/>
+          <w:szCs w:val="24"/>
+        </w:rPr>
+        <w:t>Em</w:t>
+      </w:r>
+      <w:proofErr w:type="spellEnd"/>
+      <w:r>
+        <w:rPr>
+          <w:rFonts w:ascii="Times New Roman" w:eastAsia="Times New Roman" w:hAnsi="Times New Roman" w:cs="Times New Roman"/>
+          <w:b/>
+          <w:bCs/>
+          <w:sz w:val="24"/>
+          <w:szCs w:val="24"/>
+        </w:rPr>
+        <w:t xml:space="preserve"> Up:</w:t>
+      </w:r>
+      <w:r>
+        <w:rPr>
+          <w:rFonts w:ascii="Times New Roman" w:eastAsia="Times New Roman" w:hAnsi="Times New Roman" w:cs="Times New Roman"/>
+          <w:sz w:val="24"/>
+          <w:szCs w:val="24"/>
+        </w:rPr>
+        <w:t xml:space="preserve"> Walk through your original list. Every time you see a number, add 1 to its corresponding index in the count array.</w:t>
+      </w:r>
+    </w:p>
+    <w:p>
+      <w:pPr>
+        <w:numPr>
+          <w:ilvl w:val="0"/>
+          <w:numId w:val="11"/>
+        </w:numPr>
+        <w:spacing w:before="100" w:beforeAutospacing="1" w:after="100" w:afterAutospacing="1" w:line="240" w:lineRule="auto"/>
+        <w:rPr>
+          <w:rFonts w:ascii="Times New Roman" w:eastAsia="Times New Roman" w:hAnsi="Times New Roman" w:cs="Times New Roman"/>
+          <w:sz w:val="24"/>
+          <w:szCs w:val="24"/>
+        </w:rPr>
+      </w:pPr>
+      <w:r>
+        <w:rPr>
+          <w:rFonts w:ascii="Times New Roman" w:eastAsia="Times New Roman" w:hAnsi="Times New Roman" w:cs="Times New Roman"/>
+          <w:b/>
+          <w:bCs/>
+          <w:sz w:val="24"/>
+          <w:szCs w:val="24"/>
+        </w:rPr>
+        <w:t>Accumulate (For Stability):</w:t>
+      </w:r>
+      <w:r>
+        <w:rPr>
+          <w:rFonts w:ascii="Times New Roman" w:eastAsia="Times New Roman" w:hAnsi="Times New Roman" w:cs="Times New Roman"/>
+          <w:sz w:val="24"/>
+          <w:szCs w:val="24"/>
+        </w:rPr>
+        <w:t xml:space="preserve"> Modify the count array so that each element is the sum of itself and the previous element. This tells you the exact </w:t>
+      </w:r>
+      <w:r>
+        <w:rPr>
+          <w:rFonts w:ascii="Times New Roman" w:eastAsia="Times New Roman" w:hAnsi="Times New Roman" w:cs="Times New Roman"/>
+          <w:i/>
+          <w:iCs/>
+          <w:sz w:val="24"/>
+          <w:szCs w:val="24"/>
+        </w:rPr>
+        <w:t>ending index</w:t>
+      </w:r>
+      <w:r>
+        <w:rPr>
+          <w:rFonts w:ascii="Times New Roman" w:eastAsia="Times New Roman" w:hAnsi="Times New Roman" w:cs="Times New Roman"/>
+          <w:sz w:val="24"/>
+          <w:szCs w:val="24"/>
+        </w:rPr>
+        <w:t xml:space="preserve"> for each number.</w:t>
+      </w:r>
+    </w:p>
+    <w:p>
+      <w:pPr>
+        <w:numPr>
+          <w:ilvl w:val="0"/>
+          <w:numId w:val="11"/>
+        </w:numPr>
+        <w:spacing w:before="100" w:beforeAutospacing="1" w:after="100" w:afterAutospacing="1" w:line="240" w:lineRule="auto"/>
+        <w:rPr>
+          <w:rFonts w:ascii="Times New Roman" w:eastAsia="Times New Roman" w:hAnsi="Times New Roman" w:cs="Times New Roman"/>
+          <w:sz w:val="24"/>
+          <w:szCs w:val="24"/>
+        </w:rPr>
+      </w:pPr>
+      <w:r>
+        <w:rPr>
+          <w:rFonts w:ascii="Times New Roman" w:eastAsia="Times New Roman" w:hAnsi="Times New Roman" w:cs="Times New Roman"/>
+          <w:b/>
+          <w:bCs/>
+          <w:sz w:val="24"/>
+          <w:szCs w:val="24"/>
+        </w:rPr>
+        <w:t>Build the Output:</w:t>
+      </w:r>
+      <w:r>
+        <w:rPr>
+          <w:rFonts w:ascii="Times New Roman" w:eastAsia="Times New Roman" w:hAnsi="Times New Roman" w:cs="Times New Roman"/>
+          <w:sz w:val="24"/>
+          <w:szCs w:val="24"/>
+        </w:rPr>
+        <w:t xml:space="preserve"> Walk through the original list (backwards to preserve order) and place each item into its correct spot using the count array map.</w:t>
+      </w:r>
+    </w:p>
+    <w:p>
+      <w:pPr>
+        <w:spacing w:before="100" w:beforeAutospacing="1" w:after="100" w:afterAutospacing="1" w:line="240" w:lineRule="auto"/>
+        <w:rPr>
+          <w:rFonts w:ascii="Times New Roman" w:eastAsia="Times New Roman" w:hAnsi="Times New Roman" w:cs="Times New Roman"/>
+          <w:sz w:val="24"/>
+          <w:szCs w:val="24"/>
+        </w:rPr>
+      </w:pPr>
+      <w:r>
+        <w:rPr>
+          <w:rFonts w:ascii="Times New Roman" w:eastAsia="Times New Roman" w:hAnsi="Times New Roman" w:cs="Times New Roman"/>
+          <w:b/>
+          <w:bCs/>
+          <w:sz w:val="24"/>
+          <w:szCs w:val="24"/>
+        </w:rPr>
+        <w:t>Example Walkthrough:</w:t>
+      </w:r>
+      <w:r>
+        <w:rPr>
+          <w:rFonts w:ascii="Times New Roman" w:eastAsia="Times New Roman" w:hAnsi="Times New Roman" w:cs="Times New Roman"/>
+          <w:sz w:val="24"/>
+          <w:szCs w:val="24"/>
+        </w:rPr>
+        <w:t xml:space="preserve"> </w:t>
+      </w:r>
+      <w:r>
+        <w:rPr>
+          <w:rFonts w:ascii="Courier New" w:eastAsia="Times New Roman" w:hAnsi="Courier New" w:cs="Courier New"/>
+          <w:sz w:val="20"/>
+        </w:rPr>
+        <w:t>[1, 4, 1, 2, 7]</w:t>
+      </w:r>
+    </w:p>
+    <w:p>
+      <w:pPr>
+        <w:numPr>
+          <w:ilvl w:val="0"/>
+          <w:numId w:val="12"/>
+        </w:numPr>
+        <w:spacing w:before="100" w:beforeAutospacing="1" w:after="100" w:afterAutospacing="1" w:line="240" w:lineRule="auto"/>
+        <w:rPr>
+          <w:rFonts w:ascii="Times New Roman" w:eastAsia="Times New Roman" w:hAnsi="Times New Roman" w:cs="Times New Roman"/>
+          <w:sz w:val="24"/>
+          <w:szCs w:val="24"/>
+        </w:rPr>
+      </w:pPr>
+      <w:r>
+        <w:rPr>
+          <w:rFonts w:ascii="Times New Roman" w:eastAsia="Times New Roman" w:hAnsi="Times New Roman" w:cs="Times New Roman"/>
+          <w:sz w:val="24"/>
+          <w:szCs w:val="24"/>
+        </w:rPr>
+        <w:t>Max value is 7. We make a count array up to index 7.</w:t>
+      </w:r>
+    </w:p>
+    <w:p>
+      <w:pPr>
+        <w:numPr>
+          <w:ilvl w:val="0"/>
+          <w:numId w:val="12"/>
+        </w:numPr>
+        <w:spacing w:before="100" w:beforeAutospacing="1" w:after="100" w:afterAutospacing="1" w:line="240" w:lineRule="auto"/>
+        <w:rPr>
+          <w:rFonts w:ascii="Times New Roman" w:eastAsia="Times New Roman" w:hAnsi="Times New Roman" w:cs="Times New Roman"/>
+          <w:sz w:val="24"/>
+          <w:szCs w:val="24"/>
+        </w:rPr>
+      </w:pPr>
+      <w:r>
+        <w:rPr>
+          <w:rFonts w:ascii="Times New Roman" w:eastAsia="Times New Roman" w:hAnsi="Times New Roman" w:cs="Times New Roman"/>
+          <w:sz w:val="24"/>
+          <w:szCs w:val="24"/>
+        </w:rPr>
+        <w:t xml:space="preserve">We count the frequencies: We have two </w:t>
+      </w:r>
+      <w:r>
+        <w:rPr>
+          <w:rFonts w:ascii="Courier New" w:eastAsia="Times New Roman" w:hAnsi="Courier New" w:cs="Courier New"/>
+          <w:sz w:val="20"/>
+        </w:rPr>
+        <w:t>1</w:t>
+      </w:r>
+      <w:r>
+        <w:rPr>
+          <w:rFonts w:ascii="Times New Roman" w:eastAsia="Times New Roman" w:hAnsi="Times New Roman" w:cs="Times New Roman"/>
+          <w:sz w:val="24"/>
+          <w:szCs w:val="24"/>
+        </w:rPr>
+        <w:t xml:space="preserve">s, one </w:t>
+      </w:r>
+      <w:r>
+        <w:rPr>
+          <w:rFonts w:ascii="Courier New" w:eastAsia="Times New Roman" w:hAnsi="Courier New" w:cs="Courier New"/>
+          <w:sz w:val="20"/>
+        </w:rPr>
+        <w:t>2</w:t>
+      </w:r>
+      <w:r>
+        <w:rPr>
+          <w:rFonts w:ascii="Times New Roman" w:eastAsia="Times New Roman" w:hAnsi="Times New Roman" w:cs="Times New Roman"/>
+          <w:sz w:val="24"/>
+          <w:szCs w:val="24"/>
+        </w:rPr>
+        <w:t xml:space="preserve">, one </w:t>
+      </w:r>
+      <w:proofErr w:type="gramStart"/>
+      <w:r>
+        <w:rPr>
+          <w:rFonts w:ascii="Courier New" w:eastAsia="Times New Roman" w:hAnsi="Courier New" w:cs="Courier New"/>
+          <w:sz w:val="20"/>
+        </w:rPr>
+        <w:t>4</w:t>
+      </w:r>
+      <w:r>
+        <w:rPr>
+          <w:rFonts w:ascii="Times New Roman" w:eastAsia="Times New Roman" w:hAnsi="Times New Roman" w:cs="Times New Roman"/>
+          <w:sz w:val="24"/>
+          <w:szCs w:val="24"/>
+        </w:rPr>
+        <w:t>,</w:t>
+      </w:r>
+      <w:proofErr w:type="gramEnd"/>
+      <w:r>
+        <w:rPr>
+          <w:rFonts w:ascii="Times New Roman" w:eastAsia="Times New Roman" w:hAnsi="Times New Roman" w:cs="Times New Roman"/>
+          <w:sz w:val="24"/>
+          <w:szCs w:val="24"/>
+        </w:rPr>
+        <w:t xml:space="preserve"> and one </w:t>
+      </w:r>
+      <w:r>
+        <w:rPr>
+          <w:rFonts w:ascii="Courier New" w:eastAsia="Times New Roman" w:hAnsi="Courier New" w:cs="Courier New"/>
+          <w:sz w:val="20"/>
+        </w:rPr>
+        <w:t>7</w:t>
+      </w:r>
+      <w:r>
+        <w:rPr>
+          <w:rFonts w:ascii="Times New Roman" w:eastAsia="Times New Roman" w:hAnsi="Times New Roman" w:cs="Times New Roman"/>
+          <w:sz w:val="24"/>
+          <w:szCs w:val="24"/>
+        </w:rPr>
+        <w:t>.</w:t>
+      </w:r>
+    </w:p>
+    <w:p>
+      <w:pPr>
+        <w:numPr>
+          <w:ilvl w:val="0"/>
+          <w:numId w:val="12"/>
+        </w:numPr>
+        <w:spacing w:before="100" w:beforeAutospacing="1" w:after="100" w:afterAutospacing="1" w:line="240" w:lineRule="auto"/>
+        <w:rPr>
+          <w:rFonts w:ascii="Times New Roman" w:eastAsia="Times New Roman" w:hAnsi="Times New Roman" w:cs="Times New Roman"/>
+          <w:sz w:val="24"/>
+          <w:szCs w:val="24"/>
+        </w:rPr>
+      </w:pPr>
+      <w:r>
+        <w:rPr>
+          <w:rFonts w:ascii="Times New Roman" w:eastAsia="Times New Roman" w:hAnsi="Times New Roman" w:cs="Times New Roman"/>
+          <w:sz w:val="24"/>
+          <w:szCs w:val="24"/>
+        </w:rPr>
+        <w:t>We do the math to know where each group starts and ends.</w:t>
+      </w:r>
+    </w:p>
+    <w:p>
+      <w:pPr>
+        <w:numPr>
+          <w:ilvl w:val="0"/>
+          <w:numId w:val="12"/>
+        </w:numPr>
+        <w:spacing w:before="100" w:beforeAutospacing="1" w:after="100" w:afterAutospacing="1" w:line="240" w:lineRule="auto"/>
+        <w:rPr>
+          <w:rFonts w:ascii="Times New Roman" w:eastAsia="Times New Roman" w:hAnsi="Times New Roman" w:cs="Times New Roman"/>
+          <w:sz w:val="24"/>
+          <w:szCs w:val="24"/>
+        </w:rPr>
+      </w:pPr>
+      <w:r>
+        <w:rPr>
+          <w:rFonts w:ascii="Times New Roman" w:eastAsia="Times New Roman" w:hAnsi="Times New Roman" w:cs="Times New Roman"/>
+          <w:b/>
+          <w:bCs/>
+          <w:sz w:val="24"/>
+          <w:szCs w:val="24"/>
+        </w:rPr>
+        <w:t>Result:</w:t>
+      </w:r>
+      <w:r>
+        <w:rPr>
+          <w:rFonts w:ascii="Times New Roman" w:eastAsia="Times New Roman" w:hAnsi="Times New Roman" w:cs="Times New Roman"/>
+          <w:sz w:val="24"/>
+          <w:szCs w:val="24"/>
+        </w:rPr>
+        <w:t xml:space="preserve"> </w:t>
+      </w:r>
+      <w:r>
+        <w:rPr>
+          <w:rFonts w:ascii="Courier New" w:eastAsia="Times New Roman" w:hAnsi="Courier New" w:cs="Courier New"/>
+          <w:sz w:val="20"/>
+        </w:rPr>
+        <w:t>[1, 1, 2, 4, 7]</w:t>
+      </w:r>
+    </w:p>
+    <w:p>
+      <w:pPr>
+        <w:spacing w:before="100" w:beforeAutospacing="1" w:after="100" w:afterAutospacing="1" w:line="240" w:lineRule="auto"/>
+        <w:outlineLvl w:val="2"/>
+        <w:rPr>
+          <w:rFonts w:ascii="Times New Roman" w:eastAsia="Times New Roman" w:hAnsi="Times New Roman" w:cs="Times New Roman"/>
+          <w:b/>
+          <w:bCs/>
+          <w:sz w:val="27"/>
+          <w:szCs w:val="27"/>
+        </w:rPr>
+      </w:pPr>
+      <w:r>
+        <w:rPr>
+          <w:rFonts w:ascii="Times New Roman" w:eastAsia="Times New Roman" w:hAnsi="Times New Roman" w:cs="Times New Roman"/>
+          <w:b/>
+          <w:bCs/>
+          <w:sz w:val="27"/>
+          <w:szCs w:val="27"/>
+        </w:rPr>
+        <w:t>Complexity &amp; Efficiency</w:t>
+      </w:r>
+    </w:p>
+    <w:p>
+      <w:pPr>
+        <w:spacing w:before="100" w:beforeAutospacing="1" w:after="100" w:afterAutospacing="1" w:line="240" w:lineRule="auto"/>
+        <w:rPr>
+          <w:rFonts w:ascii="Times New Roman" w:eastAsia="Times New Roman" w:hAnsi="Times New Roman" w:cs="Times New Roman"/>
+          <w:sz w:val="24"/>
+          <w:szCs w:val="24"/>
+        </w:rPr>
+      </w:pPr>
+      <w:r>
+        <w:rPr>
+          <w:rFonts w:ascii="Times New Roman" w:eastAsia="Times New Roman" w:hAnsi="Times New Roman" w:cs="Times New Roman"/>
+          <w:sz w:val="24"/>
+          <w:szCs w:val="24"/>
+        </w:rPr>
+        <w:t>When the conditions are right, Counting Sort is blindingly fast.</w:t>
+      </w:r>
+    </w:p>
+    <w:tbl>
+      <w:tblPr>
+        <w:tblW w:w="0" w:type="auto"/>
+        <w:tblCellSpacing w:w="15" w:type="dxa"/>
+        <w:tblCellMar>
+          <w:top w:w="15" w:type="dxa"/>
+          <w:left w:w="15" w:type="dxa"/>
+          <w:bottom w:w="15" w:type="dxa"/>
+          <w:right w:w="15" w:type="dxa"/>
+        </w:tblCellMar>
+        <w:tblLook w:val="04A0"/>
+      </w:tblPr>
+      <w:tblGrid>
+        <w:gridCol w:w="2048"/>
+        <w:gridCol w:w="7054"/>
+      </w:tblGrid>
+      <w:tr>
+        <w:trPr>
+          <w:tblHeader/>
+          <w:tblCellSpacing w:w="15" w:type="dxa"/>
+        </w:trPr>
+        <w:tc>
+          <w:tcPr>
+            <w:tcW w:w="0" w:type="auto"/>
+            <w:tcBorders>
+              <w:top w:val="single" w:sz="4" w:space="0" w:color="auto"/>
+              <w:left w:val="single" w:sz="4" w:space="0" w:color="auto"/>
+              <w:bottom w:val="single" w:sz="4" w:space="0" w:color="auto"/>
+              <w:right w:val="single" w:sz="4" w:space="0" w:color="auto"/>
+            </w:tcBorders>
+            <w:vAlign w:val="center"/>
+            <w:hideMark/>
+          </w:tcPr>
+          <w:p>
+            <w:pPr>
+              <w:spacing w:after="320" w:line="240" w:lineRule="auto"/>
+              <w:rPr>
+                <w:rFonts w:ascii="Times New Roman" w:eastAsia="Times New Roman" w:hAnsi="Times New Roman" w:cs="Times New Roman"/>
+                <w:sz w:val="24"/>
+                <w:szCs w:val="24"/>
+              </w:rPr>
+            </w:pPr>
+            <w:r>
+              <w:rPr>
+                <w:rFonts w:ascii="Times New Roman" w:eastAsia="Times New Roman" w:hAnsi="Times New Roman" w:cs="Times New Roman"/>
+                <w:b/>
+                <w:bCs/>
+                <w:sz w:val="24"/>
+                <w:szCs w:val="24"/>
+              </w:rPr>
+              <w:lastRenderedPageBreak/>
+              <w:t>Metric</w:t>
+            </w:r>
+          </w:p>
+        </w:tc>
+        <w:tc>
+          <w:tcPr>
+            <w:tcW w:w="0" w:type="auto"/>
+            <w:tcBorders>
+              <w:top w:val="single" w:sz="4" w:space="0" w:color="auto"/>
+              <w:left w:val="single" w:sz="4" w:space="0" w:color="auto"/>
+              <w:bottom w:val="single" w:sz="4" w:space="0" w:color="auto"/>
+              <w:right w:val="single" w:sz="4" w:space="0" w:color="auto"/>
+            </w:tcBorders>
+            <w:vAlign w:val="center"/>
+            <w:hideMark/>
+          </w:tcPr>
+          <w:p>
+            <w:pPr>
+              <w:spacing w:after="320" w:line="240" w:lineRule="auto"/>
+              <w:rPr>
+                <w:rFonts w:ascii="Times New Roman" w:eastAsia="Times New Roman" w:hAnsi="Times New Roman" w:cs="Times New Roman"/>
+                <w:sz w:val="24"/>
+                <w:szCs w:val="24"/>
+              </w:rPr>
+            </w:pPr>
+            <w:r>
+              <w:rPr>
+                <w:rFonts w:ascii="Times New Roman" w:eastAsia="Times New Roman" w:hAnsi="Times New Roman" w:cs="Times New Roman"/>
+                <w:b/>
+                <w:bCs/>
+                <w:sz w:val="24"/>
+                <w:szCs w:val="24"/>
+              </w:rPr>
+              <w:t>Complexity</w:t>
+            </w:r>
+          </w:p>
+        </w:tc>
+      </w:tr>
+      <w:tr>
+        <w:trPr>
+          <w:tblCellSpacing w:w="15" w:type="dxa"/>
+        </w:trPr>
+        <w:tc>
+          <w:tcPr>
+            <w:tcW w:w="0" w:type="auto"/>
+            <w:tcBorders>
+              <w:top w:val="single" w:sz="4" w:space="0" w:color="auto"/>
+              <w:left w:val="single" w:sz="4" w:space="0" w:color="auto"/>
+              <w:bottom w:val="single" w:sz="4" w:space="0" w:color="auto"/>
+              <w:right w:val="single" w:sz="4" w:space="0" w:color="auto"/>
+            </w:tcBorders>
+            <w:vAlign w:val="center"/>
+            <w:hideMark/>
+          </w:tcPr>
+          <w:p>
+            <w:pPr>
+              <w:spacing w:after="320" w:line="240" w:lineRule="auto"/>
+              <w:rPr>
+                <w:rFonts w:ascii="Times New Roman" w:eastAsia="Times New Roman" w:hAnsi="Times New Roman" w:cs="Times New Roman"/>
+                <w:sz w:val="24"/>
+                <w:szCs w:val="24"/>
+              </w:rPr>
+            </w:pPr>
+            <w:r>
+              <w:rPr>
+                <w:rFonts w:ascii="Times New Roman" w:eastAsia="Times New Roman" w:hAnsi="Times New Roman" w:cs="Times New Roman"/>
+                <w:b/>
+                <w:bCs/>
+                <w:sz w:val="24"/>
+                <w:szCs w:val="24"/>
+              </w:rPr>
+              <w:t>Worst-case Time</w:t>
+            </w:r>
+          </w:p>
+        </w:tc>
+        <w:tc>
+          <w:tcPr>
+            <w:tcW w:w="0" w:type="auto"/>
+            <w:tcBorders>
+              <w:top w:val="single" w:sz="4" w:space="0" w:color="auto"/>
+              <w:left w:val="single" w:sz="4" w:space="0" w:color="auto"/>
+              <w:bottom w:val="single" w:sz="4" w:space="0" w:color="auto"/>
+              <w:right w:val="single" w:sz="4" w:space="0" w:color="auto"/>
+            </w:tcBorders>
+            <w:vAlign w:val="center"/>
+            <w:hideMark/>
+          </w:tcPr>
+          <w:p>
+            <w:pPr>
+              <w:spacing w:after="320" w:line="240" w:lineRule="auto"/>
+              <w:rPr>
+                <w:rFonts w:ascii="Times New Roman" w:eastAsia="Times New Roman" w:hAnsi="Times New Roman" w:cs="Times New Roman"/>
+                <w:sz w:val="24"/>
+                <w:szCs w:val="24"/>
+              </w:rPr>
+            </w:pPr>
+            <w:r>
+              <w:rPr>
+                <w:rFonts w:ascii="Times New Roman" w:eastAsia="Times New Roman" w:hAnsi="Times New Roman" w:cs="Times New Roman"/>
+                <w:sz w:val="24"/>
+                <w:szCs w:val="24"/>
+              </w:rPr>
+              <w:t>O(n + k)</w:t>
+            </w:r>
+          </w:p>
+        </w:tc>
+      </w:tr>
+      <w:tr>
+        <w:trPr>
+          <w:tblCellSpacing w:w="15" w:type="dxa"/>
+        </w:trPr>
+        <w:tc>
+          <w:tcPr>
+            <w:tcW w:w="0" w:type="auto"/>
+            <w:tcBorders>
+              <w:top w:val="single" w:sz="4" w:space="0" w:color="auto"/>
+              <w:left w:val="single" w:sz="4" w:space="0" w:color="auto"/>
+              <w:bottom w:val="single" w:sz="4" w:space="0" w:color="auto"/>
+              <w:right w:val="single" w:sz="4" w:space="0" w:color="auto"/>
+            </w:tcBorders>
+            <w:vAlign w:val="center"/>
+            <w:hideMark/>
+          </w:tcPr>
+          <w:p>
+            <w:pPr>
+              <w:spacing w:after="320" w:line="240" w:lineRule="auto"/>
+              <w:rPr>
+                <w:rFonts w:ascii="Times New Roman" w:eastAsia="Times New Roman" w:hAnsi="Times New Roman" w:cs="Times New Roman"/>
+                <w:sz w:val="24"/>
+                <w:szCs w:val="24"/>
+              </w:rPr>
+            </w:pPr>
+            <w:r>
+              <w:rPr>
+                <w:rFonts w:ascii="Times New Roman" w:eastAsia="Times New Roman" w:hAnsi="Times New Roman" w:cs="Times New Roman"/>
+                <w:b/>
+                <w:bCs/>
+                <w:sz w:val="24"/>
+                <w:szCs w:val="24"/>
+              </w:rPr>
+              <w:t>Average-case Time</w:t>
+            </w:r>
+          </w:p>
+        </w:tc>
+        <w:tc>
+          <w:tcPr>
+            <w:tcW w:w="0" w:type="auto"/>
+            <w:tcBorders>
+              <w:top w:val="single" w:sz="4" w:space="0" w:color="auto"/>
+              <w:left w:val="single" w:sz="4" w:space="0" w:color="auto"/>
+              <w:bottom w:val="single" w:sz="4" w:space="0" w:color="auto"/>
+              <w:right w:val="single" w:sz="4" w:space="0" w:color="auto"/>
+            </w:tcBorders>
+            <w:vAlign w:val="center"/>
+            <w:hideMark/>
+          </w:tcPr>
+          <w:p>
+            <w:pPr>
+              <w:spacing w:after="320" w:line="240" w:lineRule="auto"/>
+              <w:rPr>
+                <w:rFonts w:ascii="Times New Roman" w:eastAsia="Times New Roman" w:hAnsi="Times New Roman" w:cs="Times New Roman"/>
+                <w:sz w:val="24"/>
+                <w:szCs w:val="24"/>
+              </w:rPr>
+            </w:pPr>
+            <w:r>
+              <w:rPr>
+                <w:rFonts w:ascii="Times New Roman" w:eastAsia="Times New Roman" w:hAnsi="Times New Roman" w:cs="Times New Roman"/>
+                <w:sz w:val="24"/>
+                <w:szCs w:val="24"/>
+              </w:rPr>
+              <w:t>O(n + k)</w:t>
+            </w:r>
+          </w:p>
+        </w:tc>
+      </w:tr>
+      <w:tr>
+        <w:trPr>
+          <w:tblCellSpacing w:w="15" w:type="dxa"/>
+        </w:trPr>
+        <w:tc>
+          <w:tcPr>
+            <w:tcW w:w="0" w:type="auto"/>
+            <w:tcBorders>
+              <w:top w:val="single" w:sz="4" w:space="0" w:color="auto"/>
+              <w:left w:val="single" w:sz="4" w:space="0" w:color="auto"/>
+              <w:bottom w:val="single" w:sz="4" w:space="0" w:color="auto"/>
+              <w:right w:val="single" w:sz="4" w:space="0" w:color="auto"/>
+            </w:tcBorders>
+            <w:vAlign w:val="center"/>
+            <w:hideMark/>
+          </w:tcPr>
+          <w:p>
+            <w:pPr>
+              <w:spacing w:after="320" w:line="240" w:lineRule="auto"/>
+              <w:rPr>
+                <w:rFonts w:ascii="Times New Roman" w:eastAsia="Times New Roman" w:hAnsi="Times New Roman" w:cs="Times New Roman"/>
+                <w:sz w:val="24"/>
+                <w:szCs w:val="24"/>
+              </w:rPr>
+            </w:pPr>
+            <w:r>
+              <w:rPr>
+                <w:rFonts w:ascii="Times New Roman" w:eastAsia="Times New Roman" w:hAnsi="Times New Roman" w:cs="Times New Roman"/>
+                <w:b/>
+                <w:bCs/>
+                <w:sz w:val="24"/>
+                <w:szCs w:val="24"/>
+              </w:rPr>
+              <w:t>Best-case Time</w:t>
+            </w:r>
+          </w:p>
+        </w:tc>
+        <w:tc>
+          <w:tcPr>
+            <w:tcW w:w="0" w:type="auto"/>
+            <w:tcBorders>
+              <w:top w:val="single" w:sz="4" w:space="0" w:color="auto"/>
+              <w:left w:val="single" w:sz="4" w:space="0" w:color="auto"/>
+              <w:bottom w:val="single" w:sz="4" w:space="0" w:color="auto"/>
+              <w:right w:val="single" w:sz="4" w:space="0" w:color="auto"/>
+            </w:tcBorders>
+            <w:vAlign w:val="center"/>
+            <w:hideMark/>
+          </w:tcPr>
+          <w:p>
+            <w:pPr>
+              <w:spacing w:after="320" w:line="240" w:lineRule="auto"/>
+              <w:rPr>
+                <w:rFonts w:ascii="Times New Roman" w:eastAsia="Times New Roman" w:hAnsi="Times New Roman" w:cs="Times New Roman"/>
+                <w:sz w:val="24"/>
+                <w:szCs w:val="24"/>
+              </w:rPr>
+            </w:pPr>
+            <w:r>
+              <w:rPr>
+                <w:rFonts w:ascii="Times New Roman" w:eastAsia="Times New Roman" w:hAnsi="Times New Roman" w:cs="Times New Roman"/>
+                <w:sz w:val="24"/>
+                <w:szCs w:val="24"/>
+              </w:rPr>
+              <w:t>O(n + k)</w:t>
+            </w:r>
+          </w:p>
+        </w:tc>
+      </w:tr>
+      <w:tr>
+        <w:trPr>
+          <w:tblCellSpacing w:w="15" w:type="dxa"/>
+        </w:trPr>
+        <w:tc>
+          <w:tcPr>
+            <w:tcW w:w="0" w:type="auto"/>
+            <w:tcBorders>
+              <w:top w:val="single" w:sz="4" w:space="0" w:color="auto"/>
+              <w:left w:val="single" w:sz="4" w:space="0" w:color="auto"/>
+              <w:bottom w:val="single" w:sz="4" w:space="0" w:color="auto"/>
+              <w:right w:val="single" w:sz="4" w:space="0" w:color="auto"/>
+            </w:tcBorders>
+            <w:vAlign w:val="center"/>
+            <w:hideMark/>
+          </w:tcPr>
+          <w:p>
+            <w:pPr>
+              <w:spacing w:after="320" w:line="240" w:lineRule="auto"/>
+              <w:rPr>
+                <w:rFonts w:ascii="Times New Roman" w:eastAsia="Times New Roman" w:hAnsi="Times New Roman" w:cs="Times New Roman"/>
+                <w:sz w:val="24"/>
+                <w:szCs w:val="24"/>
+              </w:rPr>
+            </w:pPr>
+            <w:r>
+              <w:rPr>
+                <w:rFonts w:ascii="Times New Roman" w:eastAsia="Times New Roman" w:hAnsi="Times New Roman" w:cs="Times New Roman"/>
+                <w:b/>
+                <w:bCs/>
+                <w:sz w:val="24"/>
+                <w:szCs w:val="24"/>
+              </w:rPr>
+              <w:t>Space Complexity</w:t>
+            </w:r>
+          </w:p>
+        </w:tc>
+        <w:tc>
+          <w:tcPr>
+            <w:tcW w:w="0" w:type="auto"/>
+            <w:tcBorders>
+              <w:top w:val="single" w:sz="4" w:space="0" w:color="auto"/>
+              <w:left w:val="single" w:sz="4" w:space="0" w:color="auto"/>
+              <w:bottom w:val="single" w:sz="4" w:space="0" w:color="auto"/>
+              <w:right w:val="single" w:sz="4" w:space="0" w:color="auto"/>
+            </w:tcBorders>
+            <w:vAlign w:val="center"/>
+            <w:hideMark/>
+          </w:tcPr>
+          <w:p>
+            <w:pPr>
+              <w:spacing w:after="320" w:line="240" w:lineRule="auto"/>
+              <w:rPr>
+                <w:rFonts w:ascii="Times New Roman" w:eastAsia="Times New Roman" w:hAnsi="Times New Roman" w:cs="Times New Roman"/>
+                <w:sz w:val="24"/>
+                <w:szCs w:val="24"/>
+              </w:rPr>
+            </w:pPr>
+            <w:r>
+              <w:rPr>
+                <w:rFonts w:ascii="Times New Roman" w:eastAsia="Times New Roman" w:hAnsi="Times New Roman" w:cs="Times New Roman"/>
+                <w:sz w:val="24"/>
+                <w:szCs w:val="24"/>
+              </w:rPr>
+              <w:t>O(n + k)</w:t>
+            </w:r>
+            <w:r>
+              <w:rPr>
+                <w:rFonts w:ascii="Times New Roman" w:eastAsia="Times New Roman" w:hAnsi="Times New Roman" w:cs="Times New Roman"/>
+                <w:sz w:val="24"/>
+                <w:szCs w:val="24"/>
+              </w:rPr>
+              <w:t>(Requires extra space for the count and output arrays)</w:t>
+            </w:r>
+          </w:p>
+        </w:tc>
+      </w:tr>
+      <w:tr>
+        <w:trPr>
+          <w:tblCellSpacing w:w="15" w:type="dxa"/>
+        </w:trPr>
+        <w:tc>
+          <w:tcPr>
+            <w:tcW w:w="0" w:type="auto"/>
+            <w:tcBorders>
+              <w:top w:val="single" w:sz="4" w:space="0" w:color="auto"/>
+              <w:left w:val="single" w:sz="4" w:space="0" w:color="auto"/>
+              <w:bottom w:val="single" w:sz="4" w:space="0" w:color="auto"/>
+              <w:right w:val="single" w:sz="4" w:space="0" w:color="auto"/>
+            </w:tcBorders>
+            <w:vAlign w:val="center"/>
+            <w:hideMark/>
+          </w:tcPr>
+          <w:p>
+            <w:pPr>
+              <w:spacing w:after="320" w:line="240" w:lineRule="auto"/>
+              <w:rPr>
+                <w:rFonts w:ascii="Times New Roman" w:eastAsia="Times New Roman" w:hAnsi="Times New Roman" w:cs="Times New Roman"/>
+                <w:sz w:val="24"/>
+                <w:szCs w:val="24"/>
+              </w:rPr>
+            </w:pPr>
+            <w:r>
+              <w:rPr>
+                <w:rFonts w:ascii="Times New Roman" w:eastAsia="Times New Roman" w:hAnsi="Times New Roman" w:cs="Times New Roman"/>
+                <w:b/>
+                <w:bCs/>
+                <w:sz w:val="24"/>
+                <w:szCs w:val="24"/>
+              </w:rPr>
+              <w:t>Stability</w:t>
+            </w:r>
+          </w:p>
+        </w:tc>
+        <w:tc>
+          <w:tcPr>
+            <w:tcW w:w="0" w:type="auto"/>
+            <w:tcBorders>
+              <w:top w:val="single" w:sz="4" w:space="0" w:color="auto"/>
+              <w:left w:val="single" w:sz="4" w:space="0" w:color="auto"/>
+              <w:bottom w:val="single" w:sz="4" w:space="0" w:color="auto"/>
+              <w:right w:val="single" w:sz="4" w:space="0" w:color="auto"/>
+            </w:tcBorders>
+            <w:vAlign w:val="center"/>
+            <w:hideMark/>
+          </w:tcPr>
+          <w:p>
+            <w:pPr>
+              <w:spacing w:after="320" w:line="240" w:lineRule="auto"/>
+              <w:rPr>
+                <w:rFonts w:ascii="Times New Roman" w:eastAsia="Times New Roman" w:hAnsi="Times New Roman" w:cs="Times New Roman"/>
+                <w:sz w:val="24"/>
+                <w:szCs w:val="24"/>
+              </w:rPr>
+            </w:pPr>
+            <w:r>
+              <w:rPr>
+                <w:rFonts w:ascii="Times New Roman" w:eastAsia="Times New Roman" w:hAnsi="Times New Roman" w:cs="Times New Roman"/>
+                <w:b/>
+                <w:bCs/>
+                <w:sz w:val="24"/>
+                <w:szCs w:val="24"/>
+              </w:rPr>
+              <w:t>Stable</w:t>
+            </w:r>
+            <w:r>
+              <w:rPr>
+                <w:rFonts w:ascii="Times New Roman" w:eastAsia="Times New Roman" w:hAnsi="Times New Roman" w:cs="Times New Roman"/>
+                <w:sz w:val="24"/>
+                <w:szCs w:val="24"/>
+              </w:rPr>
+              <w:t xml:space="preserve"> (When implemented correctly using the cumulative sum method)</w:t>
             </w:r>
           </w:p>
         </w:tc>
@@ -6269,6 +7412,268 @@
     </w:lvl>
   </w:abstractNum>
   <w:abstractNum w:abstractNumId="3">
+    <w:nsid w:val="2BA0495C"/>
+    <w:multiLevelType w:val="multilevel"/>
+    <w:tmpl w:val="31981036"/>
+    <w:lvl w:ilvl="0">
+      <w:start w:val="1"/>
+      <w:numFmt w:val="bullet"/>
+      <w:lvlText w:val=""/>
+      <w:lvlJc w:val="left"/>
+      <w:pPr>
+        <w:tabs>
+          <w:tab w:val="num" w:pos="720"/>
+        </w:tabs>
+        <w:ind w:left="720" w:hanging="360"/>
+      </w:pPr>
+      <w:rPr>
+        <w:rFonts w:ascii="Symbol" w:hAnsi="Symbol" w:hint="default"/>
+        <w:sz w:val="20"/>
+      </w:rPr>
+    </w:lvl>
+    <w:lvl w:ilvl="1" w:tentative="1">
+      <w:start w:val="1"/>
+      <w:numFmt w:val="bullet"/>
+      <w:lvlText w:val="o"/>
+      <w:lvlJc w:val="left"/>
+      <w:pPr>
+        <w:tabs>
+          <w:tab w:val="num" w:pos="1440"/>
+        </w:tabs>
+        <w:ind w:left="1440" w:hanging="360"/>
+      </w:pPr>
+      <w:rPr>
+        <w:rFonts w:ascii="Courier New" w:hAnsi="Courier New" w:hint="default"/>
+        <w:sz w:val="20"/>
+      </w:rPr>
+    </w:lvl>
+    <w:lvl w:ilvl="2" w:tentative="1">
+      <w:start w:val="1"/>
+      <w:numFmt w:val="bullet"/>
+      <w:lvlText w:val=""/>
+      <w:lvlJc w:val="left"/>
+      <w:pPr>
+        <w:tabs>
+          <w:tab w:val="num" w:pos="2160"/>
+        </w:tabs>
+        <w:ind w:left="2160" w:hanging="360"/>
+      </w:pPr>
+      <w:rPr>
+        <w:rFonts w:ascii="Wingdings" w:hAnsi="Wingdings" w:hint="default"/>
+        <w:sz w:val="20"/>
+      </w:rPr>
+    </w:lvl>
+    <w:lvl w:ilvl="3" w:tentative="1">
+      <w:start w:val="1"/>
+      <w:numFmt w:val="bullet"/>
+      <w:lvlText w:val=""/>
+      <w:lvlJc w:val="left"/>
+      <w:pPr>
+        <w:tabs>
+          <w:tab w:val="num" w:pos="2880"/>
+        </w:tabs>
+        <w:ind w:left="2880" w:hanging="360"/>
+      </w:pPr>
+      <w:rPr>
+        <w:rFonts w:ascii="Wingdings" w:hAnsi="Wingdings" w:hint="default"/>
+        <w:sz w:val="20"/>
+      </w:rPr>
+    </w:lvl>
+    <w:lvl w:ilvl="4" w:tentative="1">
+      <w:start w:val="1"/>
+      <w:numFmt w:val="bullet"/>
+      <w:lvlText w:val=""/>
+      <w:lvlJc w:val="left"/>
+      <w:pPr>
+        <w:tabs>
+          <w:tab w:val="num" w:pos="3600"/>
+        </w:tabs>
+        <w:ind w:left="3600" w:hanging="360"/>
+      </w:pPr>
+      <w:rPr>
+        <w:rFonts w:ascii="Wingdings" w:hAnsi="Wingdings" w:hint="default"/>
+        <w:sz w:val="20"/>
+      </w:rPr>
+    </w:lvl>
+    <w:lvl w:ilvl="5" w:tentative="1">
+      <w:start w:val="1"/>
+      <w:numFmt w:val="bullet"/>
+      <w:lvlText w:val=""/>
+      <w:lvlJc w:val="left"/>
+      <w:pPr>
+        <w:tabs>
+          <w:tab w:val="num" w:pos="4320"/>
+        </w:tabs>
+        <w:ind w:left="4320" w:hanging="360"/>
+      </w:pPr>
+      <w:rPr>
+        <w:rFonts w:ascii="Wingdings" w:hAnsi="Wingdings" w:hint="default"/>
+        <w:sz w:val="20"/>
+      </w:rPr>
+    </w:lvl>
+    <w:lvl w:ilvl="6" w:tentative="1">
+      <w:start w:val="1"/>
+      <w:numFmt w:val="bullet"/>
+      <w:lvlText w:val=""/>
+      <w:lvlJc w:val="left"/>
+      <w:pPr>
+        <w:tabs>
+          <w:tab w:val="num" w:pos="5040"/>
+        </w:tabs>
+        <w:ind w:left="5040" w:hanging="360"/>
+      </w:pPr>
+      <w:rPr>
+        <w:rFonts w:ascii="Wingdings" w:hAnsi="Wingdings" w:hint="default"/>
+        <w:sz w:val="20"/>
+      </w:rPr>
+    </w:lvl>
+    <w:lvl w:ilvl="7" w:tentative="1">
+      <w:start w:val="1"/>
+      <w:numFmt w:val="bullet"/>
+      <w:lvlText w:val=""/>
+      <w:lvlJc w:val="left"/>
+      <w:pPr>
+        <w:tabs>
+          <w:tab w:val="num" w:pos="5760"/>
+        </w:tabs>
+        <w:ind w:left="5760" w:hanging="360"/>
+      </w:pPr>
+      <w:rPr>
+        <w:rFonts w:ascii="Wingdings" w:hAnsi="Wingdings" w:hint="default"/>
+        <w:sz w:val="20"/>
+      </w:rPr>
+    </w:lvl>
+    <w:lvl w:ilvl="8" w:tentative="1">
+      <w:start w:val="1"/>
+      <w:numFmt w:val="bullet"/>
+      <w:lvlText w:val=""/>
+      <w:lvlJc w:val="left"/>
+      <w:pPr>
+        <w:tabs>
+          <w:tab w:val="num" w:pos="6480"/>
+        </w:tabs>
+        <w:ind w:left="6480" w:hanging="360"/>
+      </w:pPr>
+      <w:rPr>
+        <w:rFonts w:ascii="Wingdings" w:hAnsi="Wingdings" w:hint="default"/>
+        <w:sz w:val="20"/>
+      </w:rPr>
+    </w:lvl>
+  </w:abstractNum>
+  <w:abstractNum w:abstractNumId="4">
+    <w:nsid w:val="30C47B54"/>
+    <w:multiLevelType w:val="multilevel"/>
+    <w:tmpl w:val="4524EAE8"/>
+    <w:lvl w:ilvl="0">
+      <w:start w:val="1"/>
+      <w:numFmt w:val="decimal"/>
+      <w:lvlText w:val="%1."/>
+      <w:lvlJc w:val="left"/>
+      <w:pPr>
+        <w:tabs>
+          <w:tab w:val="num" w:pos="720"/>
+        </w:tabs>
+        <w:ind w:left="720" w:hanging="360"/>
+      </w:pPr>
+    </w:lvl>
+    <w:lvl w:ilvl="1" w:tentative="1">
+      <w:start w:val="1"/>
+      <w:numFmt w:val="decimal"/>
+      <w:lvlText w:val="%2."/>
+      <w:lvlJc w:val="left"/>
+      <w:pPr>
+        <w:tabs>
+          <w:tab w:val="num" w:pos="1440"/>
+        </w:tabs>
+        <w:ind w:left="1440" w:hanging="360"/>
+      </w:pPr>
+    </w:lvl>
+    <w:lvl w:ilvl="2" w:tentative="1">
+      <w:start w:val="1"/>
+      <w:numFmt w:val="decimal"/>
+      <w:lvlText w:val="%3."/>
+      <w:lvlJc w:val="left"/>
+      <w:pPr>
+        <w:tabs>
+          <w:tab w:val="num" w:pos="2160"/>
+        </w:tabs>
+        <w:ind w:left="2160" w:hanging="360"/>
+      </w:pPr>
+    </w:lvl>
+    <w:lvl w:ilvl="3" w:tentative="1">
+      <w:start w:val="1"/>
+      <w:numFmt w:val="decimal"/>
+      <w:lvlText w:val="%4."/>
+      <w:lvlJc w:val="left"/>
+      <w:pPr>
+        <w:tabs>
+          <w:tab w:val="num" w:pos="2880"/>
+        </w:tabs>
+        <w:ind w:left="2880" w:hanging="360"/>
+      </w:pPr>
+    </w:lvl>
+    <w:lvl w:ilvl="4" w:tentative="1">
+      <w:start w:val="1"/>
+      <w:numFmt w:val="decimal"/>
+      <w:lvlText w:val="%5."/>
+      <w:lvlJc w:val="left"/>
+      <w:pPr>
+        <w:tabs>
+          <w:tab w:val="num" w:pos="3600"/>
+        </w:tabs>
+        <w:ind w:left="3600" w:hanging="360"/>
+      </w:pPr>
+    </w:lvl>
+    <w:lvl w:ilvl="5" w:tentative="1">
+      <w:start w:val="1"/>
+      <w:numFmt w:val="decimal"/>
+      <w:lvlText w:val="%6."/>
+      <w:lvlJc w:val="left"/>
+      <w:pPr>
+        <w:tabs>
+          <w:tab w:val="num" w:pos="4320"/>
+        </w:tabs>
+        <w:ind w:left="4320" w:hanging="360"/>
+      </w:pPr>
+    </w:lvl>
+    <w:lvl w:ilvl="6" w:tentative="1">
+      <w:start w:val="1"/>
+      <w:numFmt w:val="decimal"/>
+      <w:lvlText w:val="%7."/>
+      <w:lvlJc w:val="left"/>
+      <w:pPr>
+        <w:tabs>
+          <w:tab w:val="num" w:pos="5040"/>
+        </w:tabs>
+        <w:ind w:left="5040" w:hanging="360"/>
+      </w:pPr>
+    </w:lvl>
+    <w:lvl w:ilvl="7" w:tentative="1">
+      <w:start w:val="1"/>
+      <w:numFmt w:val="decimal"/>
+      <w:lvlText w:val="%8."/>
+      <w:lvlJc w:val="left"/>
+      <w:pPr>
+        <w:tabs>
+          <w:tab w:val="num" w:pos="5760"/>
+        </w:tabs>
+        <w:ind w:left="5760" w:hanging="360"/>
+      </w:pPr>
+    </w:lvl>
+    <w:lvl w:ilvl="8" w:tentative="1">
+      <w:start w:val="1"/>
+      <w:numFmt w:val="decimal"/>
+      <w:lvlText w:val="%9."/>
+      <w:lvlJc w:val="left"/>
+      <w:pPr>
+        <w:tabs>
+          <w:tab w:val="num" w:pos="6480"/>
+        </w:tabs>
+        <w:ind w:left="6480" w:hanging="360"/>
+      </w:pPr>
+    </w:lvl>
+  </w:abstractNum>
+  <w:abstractNum w:abstractNumId="5">
     <w:nsid w:val="354C54D5"/>
     <w:multiLevelType w:val="multilevel"/>
     <w:tmpl w:val="613A4A8C"/>
@@ -6381,7 +7786,7 @@
       </w:pPr>
     </w:lvl>
   </w:abstractNum>
-  <w:abstractNum w:abstractNumId="4">
+  <w:abstractNum w:abstractNumId="6">
     <w:nsid w:val="3A35349D"/>
     <w:multiLevelType w:val="multilevel"/>
     <w:tmpl w:val="2C48345A"/>
@@ -6530,7 +7935,7 @@
       </w:rPr>
     </w:lvl>
   </w:abstractNum>
-  <w:abstractNum w:abstractNumId="5">
+  <w:abstractNum w:abstractNumId="7">
     <w:nsid w:val="3C973128"/>
     <w:multiLevelType w:val="multilevel"/>
     <w:tmpl w:val="277C0526"/>
@@ -6643,7 +8048,7 @@
       </w:pPr>
     </w:lvl>
   </w:abstractNum>
-  <w:abstractNum w:abstractNumId="6">
+  <w:abstractNum w:abstractNumId="8">
     <w:nsid w:val="3F2C3468"/>
     <w:multiLevelType w:val="multilevel"/>
     <w:tmpl w:val="875EAECE"/>
@@ -6792,7 +8197,7 @@
       </w:rPr>
     </w:lvl>
   </w:abstractNum>
-  <w:abstractNum w:abstractNumId="7">
+  <w:abstractNum w:abstractNumId="9">
     <w:nsid w:val="43A30779"/>
     <w:multiLevelType w:val="multilevel"/>
     <w:tmpl w:val="BACC9242"/>
@@ -6909,7 +8314,7 @@
       </w:pPr>
     </w:lvl>
   </w:abstractNum>
-  <w:abstractNum w:abstractNumId="8">
+  <w:abstractNum w:abstractNumId="10">
     <w:nsid w:val="595278FC"/>
     <w:multiLevelType w:val="multilevel"/>
     <w:tmpl w:val="3908365E"/>
@@ -7022,7 +8427,7 @@
       </w:pPr>
     </w:lvl>
   </w:abstractNum>
-  <w:abstractNum w:abstractNumId="9">
+  <w:abstractNum w:abstractNumId="11">
     <w:nsid w:val="67B67538"/>
     <w:multiLevelType w:val="multilevel"/>
     <w:tmpl w:val="6FD26896"/>
@@ -7178,28 +8583,34 @@
     <w:abstractNumId w:val="1"/>
   </w:num>
   <w:num w:numId="3">
+    <w:abstractNumId w:val="7"/>
+  </w:num>
+  <w:num w:numId="4">
+    <w:abstractNumId w:val="11"/>
+  </w:num>
+  <w:num w:numId="5">
     <w:abstractNumId w:val="5"/>
   </w:num>
-  <w:num w:numId="4">
-    <w:abstractNumId w:val="9"/>
-  </w:num>
-  <w:num w:numId="5">
-    <w:abstractNumId w:val="3"/>
-  </w:num>
   <w:num w:numId="6">
-    <w:abstractNumId w:val="4"/>
+    <w:abstractNumId w:val="6"/>
   </w:num>
   <w:num w:numId="7">
-    <w:abstractNumId w:val="8"/>
+    <w:abstractNumId w:val="10"/>
   </w:num>
   <w:num w:numId="8">
     <w:abstractNumId w:val="2"/>
   </w:num>
   <w:num w:numId="9">
-    <w:abstractNumId w:val="7"/>
+    <w:abstractNumId w:val="9"/>
   </w:num>
   <w:num w:numId="10">
-    <w:abstractNumId w:val="6"/>
+    <w:abstractNumId w:val="8"/>
+  </w:num>
+  <w:num w:numId="11">
+    <w:abstractNumId w:val="4"/>
+  </w:num>
+  <w:num w:numId="12">
+    <w:abstractNumId w:val="3"/>
   </w:num>
 </w:numbering>
 </file>

</xml_diff>

<commit_message>
Adding Bucket Sort Algo
</commit_message>
<xml_diff>
--- a/Sorting Algorithms/Sortings.docx
+++ b/Sorting Algorithms/Sortings.docx
@@ -6988,6 +6988,982 @@
         </w:rPr>
       </w:pPr>
     </w:p>
+    <w:p>
+      <w:pPr>
+        <w:jc w:val="center"/>
+        <w:rPr>
+          <w:b/>
+          <w:sz w:val="36"/>
+          <w:szCs w:val="36"/>
+        </w:rPr>
+      </w:pPr>
+    </w:p>
+    <w:p>
+      <w:pPr>
+        <w:jc w:val="center"/>
+        <w:rPr>
+          <w:b/>
+          <w:sz w:val="36"/>
+          <w:szCs w:val="36"/>
+        </w:rPr>
+      </w:pPr>
+      <w:r>
+        <w:rPr>
+          <w:b/>
+          <w:sz w:val="36"/>
+          <w:szCs w:val="36"/>
+        </w:rPr>
+        <w:t>Bucket Sort</w:t>
+      </w:r>
+    </w:p>
+    <w:p>
+      <w:pPr>
+        <w:pStyle w:val="NormalWeb"/>
+      </w:pPr>
+      <w:r>
+        <w:rPr>
+          <w:b/>
+          <w:bCs/>
+        </w:rPr>
+        <w:t>Bucket Sort</w:t>
+      </w:r>
+      <w:r>
+        <w:t xml:space="preserve"> (or Bin Sort) is a popular "divide-and-conquer" sorting algorithm. It is highly efficient when the input data is </w:t>
+      </w:r>
+      <w:r>
+        <w:rPr>
+          <w:b/>
+          <w:bCs/>
+        </w:rPr>
+        <w:t>uniformly distributed</w:t>
+      </w:r>
+      <w:r>
+        <w:t xml:space="preserve"> over a specific range (for example, a large set of floating-point numbers between 0.0 and 1.0).</w:t>
+      </w:r>
+    </w:p>
+    <w:p>
+      <w:pPr>
+        <w:pStyle w:val="NormalWeb"/>
+      </w:pPr>
+      <w:r>
+        <w:t>Here is a complete breakdown of how it works, its complexity, and when to use it.</w:t>
+      </w:r>
+    </w:p>
+    <w:p>
+      <w:pPr>
+        <w:pStyle w:val="Heading2"/>
+      </w:pPr>
+      <w:r>
+        <w:rPr>
+          <w:rFonts w:ascii="Cambria" w:hAnsi="Cambria" w:cs="Cambria"/>
+        </w:rPr>
+        <w:t>🛠️</w:t>
+      </w:r>
+      <w:r>
+        <w:t xml:space="preserve"> How Bucket Sort Works (Scatter-Gather)</w:t>
+      </w:r>
+    </w:p>
+    <w:p>
+      <w:pPr>
+        <w:pStyle w:val="NormalWeb"/>
+      </w:pPr>
+      <w:r>
+        <w:t xml:space="preserve">The algorithm works by splitting the unsorted array into a finite number of smaller groups called </w:t>
+      </w:r>
+      <w:r>
+        <w:rPr>
+          <w:b/>
+          <w:bCs/>
+        </w:rPr>
+        <w:t>buckets</w:t>
+      </w:r>
+      <w:r>
+        <w:t xml:space="preserve">. Each bucket is then sorted individually—often using another sorting algorithm like </w:t>
+      </w:r>
+      <w:r>
+        <w:rPr>
+          <w:b/>
+          <w:bCs/>
+        </w:rPr>
+        <w:t>Insertion Sort</w:t>
+      </w:r>
+      <w:r>
+        <w:t>—and then recombined.</w:t>
+      </w:r>
+    </w:p>
+    <w:p>
+      <w:pPr>
+        <w:pStyle w:val="Heading3"/>
+      </w:pPr>
+      <w:r>
+        <w:t>The 4 Core Steps:</w:t>
+      </w:r>
+    </w:p>
+    <w:p>
+      <w:pPr>
+        <w:pStyle w:val="NormalWeb"/>
+        <w:numPr>
+          <w:ilvl w:val="0"/>
+          <w:numId w:val="13"/>
+        </w:numPr>
+      </w:pPr>
+      <w:r>
+        <w:rPr>
+          <w:b/>
+          <w:bCs/>
+        </w:rPr>
+        <w:t>Create Buckets:</w:t>
+      </w:r>
+      <w:r>
+        <w:t xml:space="preserve"> Set up an array of empty buckets (lists).</w:t>
+      </w:r>
+    </w:p>
+    <w:p>
+      <w:pPr>
+        <w:pStyle w:val="NormalWeb"/>
+        <w:numPr>
+          <w:ilvl w:val="0"/>
+          <w:numId w:val="13"/>
+        </w:numPr>
+      </w:pPr>
+      <w:r>
+        <w:rPr>
+          <w:b/>
+          <w:bCs/>
+        </w:rPr>
+        <w:t>Scatter:</w:t>
+      </w:r>
+      <w:r>
+        <w:t xml:space="preserve"> Go through the original array and place each element into its corresponding bucket based on a specific function or range.</w:t>
+      </w:r>
+    </w:p>
+    <w:p>
+      <w:pPr>
+        <w:pStyle w:val="NormalWeb"/>
+        <w:numPr>
+          <w:ilvl w:val="0"/>
+          <w:numId w:val="13"/>
+        </w:numPr>
+      </w:pPr>
+      <w:r>
+        <w:rPr>
+          <w:b/>
+          <w:bCs/>
+        </w:rPr>
+        <w:t>Sort:</w:t>
+      </w:r>
+      <w:r>
+        <w:t xml:space="preserve"> Sort each non-empty bucket individually.</w:t>
+      </w:r>
+    </w:p>
+    <w:p>
+      <w:pPr>
+        <w:pStyle w:val="NormalWeb"/>
+        <w:numPr>
+          <w:ilvl w:val="0"/>
+          <w:numId w:val="13"/>
+        </w:numPr>
+      </w:pPr>
+      <w:r>
+        <w:rPr>
+          <w:b/>
+          <w:bCs/>
+        </w:rPr>
+        <w:t>Gather:</w:t>
+      </w:r>
+      <w:r>
+        <w:t xml:space="preserve"> Visit each bucket in order and concatenate all the elements back into the original array.</w:t>
+      </w:r>
+    </w:p>
+    <w:p>
+      <w:pPr>
+        <w:pStyle w:val="Heading2"/>
+      </w:pPr>
+      <w:r>
+        <w:rPr>
+          <w:rFonts w:ascii="Cambria" w:hAnsi="Cambria" w:cs="Cambria"/>
+        </w:rPr>
+        <w:lastRenderedPageBreak/>
+        <w:t>📊</w:t>
+      </w:r>
+      <w:r>
+        <w:t xml:space="preserve"> Step-by-Step Example</w:t>
+      </w:r>
+    </w:p>
+    <w:p>
+      <w:pPr>
+        <w:pStyle w:val="NormalWeb"/>
+      </w:pPr>
+      <w:r>
+        <w:t xml:space="preserve">Suppose we want to sort this array of decimal numbers using </w:t>
+      </w:r>
+      <w:r>
+        <w:rPr>
+          <w:b/>
+          <w:bCs/>
+        </w:rPr>
+        <w:t>10 buckets</w:t>
+      </w:r>
+      <w:r>
+        <w:t>:</w:t>
+      </w:r>
+    </w:p>
+    <w:p>
+      <w:pPr>
+        <w:pStyle w:val="NormalWeb"/>
+      </w:pPr>
+      <w:r>
+        <w:rPr>
+          <w:rStyle w:val="HTMLCode"/>
+        </w:rPr>
+        <w:t>[0.78, 0.17, 0.39, 0.26, 0.72, 0.94, 0.21, 0.12, 0.23, 0.68]</w:t>
+      </w:r>
+    </w:p>
+    <w:p>
+      <w:pPr>
+        <w:pStyle w:val="NormalWeb"/>
+        <w:numPr>
+          <w:ilvl w:val="0"/>
+          <w:numId w:val="14"/>
+        </w:numPr>
+      </w:pPr>
+      <w:r>
+        <w:rPr>
+          <w:b/>
+          <w:bCs/>
+        </w:rPr>
+        <w:t>Step 1 (Scatter):</w:t>
+      </w:r>
+      <w:r>
+        <w:t xml:space="preserve"> We calculate the bucket index for each element using a simple formula: </w:t>
+      </w:r>
+      <w:r>
+        <w:rPr>
+          <w:rStyle w:val="HTMLCode"/>
+        </w:rPr>
+        <w:t xml:space="preserve">index = </w:t>
+      </w:r>
+      <w:proofErr w:type="spellStart"/>
+      <w:proofErr w:type="gramStart"/>
+      <w:r>
+        <w:rPr>
+          <w:rStyle w:val="HTMLCode"/>
+        </w:rPr>
+        <w:t>int</w:t>
+      </w:r>
+      <w:proofErr w:type="spellEnd"/>
+      <w:r>
+        <w:rPr>
+          <w:rStyle w:val="HTMLCode"/>
+        </w:rPr>
+        <w:t>(</w:t>
+      </w:r>
+      <w:proofErr w:type="gramEnd"/>
+      <w:r>
+        <w:rPr>
+          <w:rStyle w:val="HTMLCode"/>
+        </w:rPr>
+        <w:t>value * 10)</w:t>
+      </w:r>
+      <w:r>
+        <w:t>.</w:t>
+      </w:r>
+    </w:p>
+    <w:p>
+      <w:pPr>
+        <w:pStyle w:val="NormalWeb"/>
+        <w:numPr>
+          <w:ilvl w:val="1"/>
+          <w:numId w:val="14"/>
+        </w:numPr>
+      </w:pPr>
+      <w:r>
+        <w:rPr>
+          <w:rStyle w:val="HTMLCode"/>
+        </w:rPr>
+        <w:t>0.17</w:t>
+      </w:r>
+      <w:r>
+        <w:t xml:space="preserve"> and </w:t>
+      </w:r>
+      <w:r>
+        <w:rPr>
+          <w:rStyle w:val="HTMLCode"/>
+        </w:rPr>
+        <w:t>0.12</w:t>
+      </w:r>
+      <w:r>
+        <w:t xml:space="preserve"> go into </w:t>
+      </w:r>
+      <w:r>
+        <w:rPr>
+          <w:b/>
+          <w:bCs/>
+        </w:rPr>
+        <w:t>Bucket 1</w:t>
+      </w:r>
+    </w:p>
+    <w:p>
+      <w:pPr>
+        <w:pStyle w:val="NormalWeb"/>
+        <w:numPr>
+          <w:ilvl w:val="1"/>
+          <w:numId w:val="14"/>
+        </w:numPr>
+      </w:pPr>
+      <w:r>
+        <w:rPr>
+          <w:rStyle w:val="HTMLCode"/>
+        </w:rPr>
+        <w:t>0.26</w:t>
+      </w:r>
+      <w:r>
+        <w:t xml:space="preserve">, </w:t>
+      </w:r>
+      <w:r>
+        <w:rPr>
+          <w:rStyle w:val="HTMLCode"/>
+        </w:rPr>
+        <w:t>0.21</w:t>
+      </w:r>
+      <w:r>
+        <w:t xml:space="preserve">, and </w:t>
+      </w:r>
+      <w:r>
+        <w:rPr>
+          <w:rStyle w:val="HTMLCode"/>
+        </w:rPr>
+        <w:t>0.23</w:t>
+      </w:r>
+      <w:r>
+        <w:t xml:space="preserve"> go into </w:t>
+      </w:r>
+      <w:r>
+        <w:rPr>
+          <w:b/>
+          <w:bCs/>
+        </w:rPr>
+        <w:t>Bucket 2</w:t>
+      </w:r>
+    </w:p>
+    <w:p>
+      <w:pPr>
+        <w:pStyle w:val="NormalWeb"/>
+        <w:numPr>
+          <w:ilvl w:val="1"/>
+          <w:numId w:val="14"/>
+        </w:numPr>
+      </w:pPr>
+      <w:r>
+        <w:rPr>
+          <w:rStyle w:val="HTMLCode"/>
+        </w:rPr>
+        <w:t>0.39</w:t>
+      </w:r>
+      <w:r>
+        <w:t xml:space="preserve"> goes into </w:t>
+      </w:r>
+      <w:r>
+        <w:rPr>
+          <w:b/>
+          <w:bCs/>
+        </w:rPr>
+        <w:t>Bucket 3</w:t>
+      </w:r>
+    </w:p>
+    <w:p>
+      <w:pPr>
+        <w:pStyle w:val="NormalWeb"/>
+        <w:numPr>
+          <w:ilvl w:val="1"/>
+          <w:numId w:val="14"/>
+        </w:numPr>
+      </w:pPr>
+      <w:r>
+        <w:t>...and so on.</w:t>
+      </w:r>
+    </w:p>
+    <w:p>
+      <w:pPr>
+        <w:pStyle w:val="NormalWeb"/>
+        <w:numPr>
+          <w:ilvl w:val="0"/>
+          <w:numId w:val="14"/>
+        </w:numPr>
+      </w:pPr>
+      <w:r>
+        <w:rPr>
+          <w:b/>
+          <w:bCs/>
+        </w:rPr>
+        <w:t>Step 2 (Sort Buckets):</w:t>
+      </w:r>
+      <w:r>
+        <w:t xml:space="preserve"> Each individual bucket is sorted.</w:t>
+      </w:r>
+    </w:p>
+    <w:p>
+      <w:pPr>
+        <w:pStyle w:val="NormalWeb"/>
+        <w:numPr>
+          <w:ilvl w:val="1"/>
+          <w:numId w:val="14"/>
+        </w:numPr>
+      </w:pPr>
+      <w:r>
+        <w:rPr>
+          <w:b/>
+          <w:bCs/>
+        </w:rPr>
+        <w:t>Bucket 1:</w:t>
+      </w:r>
+      <w:r>
+        <w:t xml:space="preserve"> </w:t>
+      </w:r>
+      <w:r>
+        <w:rPr>
+          <w:rStyle w:val="HTMLCode"/>
+        </w:rPr>
+        <w:t>[0.17, 0.12]</w:t>
+      </w:r>
+      <w:r>
+        <w:t xml:space="preserve"> becomes </w:t>
+      </w:r>
+      <w:r>
+        <w:rPr>
+          <w:rStyle w:val="HTMLCode"/>
+        </w:rPr>
+        <w:t>[0.12, 0.17]</w:t>
+      </w:r>
+    </w:p>
+    <w:p>
+      <w:pPr>
+        <w:pStyle w:val="NormalWeb"/>
+        <w:numPr>
+          <w:ilvl w:val="1"/>
+          <w:numId w:val="14"/>
+        </w:numPr>
+      </w:pPr>
+      <w:r>
+        <w:rPr>
+          <w:b/>
+          <w:bCs/>
+        </w:rPr>
+        <w:t>Bucket 2:</w:t>
+      </w:r>
+      <w:r>
+        <w:t xml:space="preserve"> </w:t>
+      </w:r>
+      <w:r>
+        <w:rPr>
+          <w:rStyle w:val="HTMLCode"/>
+        </w:rPr>
+        <w:t>[0.26, 0.21, 0.23]</w:t>
+      </w:r>
+      <w:r>
+        <w:t xml:space="preserve"> becomes </w:t>
+      </w:r>
+      <w:r>
+        <w:rPr>
+          <w:rStyle w:val="HTMLCode"/>
+        </w:rPr>
+        <w:t>[0.21, 0.23, 0.26]</w:t>
+      </w:r>
+    </w:p>
+    <w:p>
+      <w:pPr>
+        <w:pStyle w:val="NormalWeb"/>
+        <w:numPr>
+          <w:ilvl w:val="0"/>
+          <w:numId w:val="14"/>
+        </w:numPr>
+      </w:pPr>
+      <w:r>
+        <w:rPr>
+          <w:b/>
+          <w:bCs/>
+        </w:rPr>
+        <w:t>Step 3 (Gather):</w:t>
+      </w:r>
+      <w:r>
+        <w:t xml:space="preserve"> We read the buckets from index 0 to 9 and merge them back:</w:t>
+      </w:r>
+    </w:p>
+    <w:p>
+      <w:pPr>
+        <w:pStyle w:val="NormalWeb"/>
+        <w:ind w:left="720"/>
+      </w:pPr>
+      <w:r>
+        <w:t xml:space="preserve">Result: </w:t>
+      </w:r>
+      <w:r>
+        <w:rPr>
+          <w:rStyle w:val="HTMLCode"/>
+        </w:rPr>
+        <w:t>[0.12, 0.17, 0.21, 0.23, 0.26, 0.39, 0.68, 0.72, 0.78, 0.94]</w:t>
+      </w:r>
+    </w:p>
+    <w:p>
+      <w:pPr>
+        <w:pStyle w:val="Heading2"/>
+      </w:pPr>
+      <w:r>
+        <w:rPr>
+          <w:rFonts w:ascii="Cambria" w:hAnsi="Cambria" w:cs="Cambria"/>
+        </w:rPr>
+        <w:t>⏱️</w:t>
+      </w:r>
+      <w:r>
+        <w:t xml:space="preserve"> Time &amp; Space Complexity</w:t>
+      </w:r>
+    </w:p>
+    <w:p>
+      <w:pPr>
+        <w:pStyle w:val="NormalWeb"/>
+      </w:pPr>
+      <w:r>
+        <w:t>The performance of Bucket Sort relies heavily on how evenly the input data is distributed.</w:t>
+      </w:r>
+    </w:p>
+    <w:tbl>
+      <w:tblPr>
+        <w:tblW w:w="0" w:type="auto"/>
+        <w:tblCellSpacing w:w="15" w:type="dxa"/>
+        <w:tblCellMar>
+          <w:top w:w="15" w:type="dxa"/>
+          <w:left w:w="15" w:type="dxa"/>
+          <w:bottom w:w="15" w:type="dxa"/>
+          <w:right w:w="15" w:type="dxa"/>
+        </w:tblCellMar>
+        <w:tblLook w:val="04A0"/>
+      </w:tblPr>
+      <w:tblGrid>
+        <w:gridCol w:w="1019"/>
+        <w:gridCol w:w="1297"/>
+        <w:gridCol w:w="7154"/>
+      </w:tblGrid>
+      <w:tr>
+        <w:trPr>
+          <w:tblHeader/>
+          <w:tblCellSpacing w:w="15" w:type="dxa"/>
+        </w:trPr>
+        <w:tc>
+          <w:tcPr>
+            <w:tcW w:w="0" w:type="auto"/>
+            <w:tcBorders>
+              <w:top w:val="single" w:sz="4" w:space="0" w:color="auto"/>
+              <w:left w:val="single" w:sz="4" w:space="0" w:color="auto"/>
+              <w:bottom w:val="single" w:sz="4" w:space="0" w:color="auto"/>
+              <w:right w:val="single" w:sz="4" w:space="0" w:color="auto"/>
+            </w:tcBorders>
+            <w:vAlign w:val="center"/>
+            <w:hideMark/>
+          </w:tcPr>
+          <w:p>
+            <w:pPr>
+              <w:spacing w:after="320"/>
+              <w:rPr>
+                <w:sz w:val="24"/>
+                <w:szCs w:val="24"/>
+              </w:rPr>
+            </w:pPr>
+            <w:r>
+              <w:rPr>
+                <w:rStyle w:val="Strong"/>
+              </w:rPr>
+              <w:t>Case</w:t>
+            </w:r>
+          </w:p>
+        </w:tc>
+        <w:tc>
+          <w:tcPr>
+            <w:tcW w:w="0" w:type="auto"/>
+            <w:tcBorders>
+              <w:top w:val="single" w:sz="4" w:space="0" w:color="auto"/>
+              <w:left w:val="single" w:sz="4" w:space="0" w:color="auto"/>
+              <w:bottom w:val="single" w:sz="4" w:space="0" w:color="auto"/>
+              <w:right w:val="single" w:sz="4" w:space="0" w:color="auto"/>
+            </w:tcBorders>
+            <w:vAlign w:val="center"/>
+            <w:hideMark/>
+          </w:tcPr>
+          <w:p>
+            <w:pPr>
+              <w:spacing w:after="320"/>
+              <w:rPr>
+                <w:sz w:val="24"/>
+                <w:szCs w:val="24"/>
+              </w:rPr>
+            </w:pPr>
+            <w:r>
+              <w:rPr>
+                <w:rStyle w:val="Strong"/>
+              </w:rPr>
+              <w:t>Time Complexity</w:t>
+            </w:r>
+          </w:p>
+        </w:tc>
+        <w:tc>
+          <w:tcPr>
+            <w:tcW w:w="0" w:type="auto"/>
+            <w:tcBorders>
+              <w:top w:val="single" w:sz="4" w:space="0" w:color="auto"/>
+              <w:left w:val="single" w:sz="4" w:space="0" w:color="auto"/>
+              <w:bottom w:val="single" w:sz="4" w:space="0" w:color="auto"/>
+              <w:right w:val="single" w:sz="4" w:space="0" w:color="auto"/>
+            </w:tcBorders>
+            <w:vAlign w:val="center"/>
+            <w:hideMark/>
+          </w:tcPr>
+          <w:p>
+            <w:pPr>
+              <w:spacing w:after="320"/>
+              <w:rPr>
+                <w:sz w:val="24"/>
+                <w:szCs w:val="24"/>
+              </w:rPr>
+            </w:pPr>
+            <w:r>
+              <w:rPr>
+                <w:rStyle w:val="Strong"/>
+              </w:rPr>
+              <w:t>When it Happens</w:t>
+            </w:r>
+          </w:p>
+        </w:tc>
+      </w:tr>
+      <w:tr>
+        <w:trPr>
+          <w:tblCellSpacing w:w="15" w:type="dxa"/>
+        </w:trPr>
+        <w:tc>
+          <w:tcPr>
+            <w:tcW w:w="0" w:type="auto"/>
+            <w:tcBorders>
+              <w:top w:val="single" w:sz="4" w:space="0" w:color="auto"/>
+              <w:left w:val="single" w:sz="4" w:space="0" w:color="auto"/>
+              <w:bottom w:val="single" w:sz="4" w:space="0" w:color="auto"/>
+              <w:right w:val="single" w:sz="4" w:space="0" w:color="auto"/>
+            </w:tcBorders>
+            <w:vAlign w:val="center"/>
+            <w:hideMark/>
+          </w:tcPr>
+          <w:p>
+            <w:pPr>
+              <w:spacing w:after="320"/>
+              <w:rPr>
+                <w:sz w:val="24"/>
+                <w:szCs w:val="24"/>
+              </w:rPr>
+            </w:pPr>
+            <w:r>
+              <w:rPr>
+                <w:b/>
+                <w:bCs/>
+              </w:rPr>
+              <w:t>Best Case</w:t>
+            </w:r>
+          </w:p>
+        </w:tc>
+        <w:tc>
+          <w:tcPr>
+            <w:tcW w:w="0" w:type="auto"/>
+            <w:tcBorders>
+              <w:top w:val="single" w:sz="4" w:space="0" w:color="auto"/>
+              <w:left w:val="single" w:sz="4" w:space="0" w:color="auto"/>
+              <w:bottom w:val="single" w:sz="4" w:space="0" w:color="auto"/>
+              <w:right w:val="single" w:sz="4" w:space="0" w:color="auto"/>
+            </w:tcBorders>
+            <w:vAlign w:val="center"/>
+            <w:hideMark/>
+          </w:tcPr>
+          <w:p>
+            <w:pPr>
+              <w:spacing w:after="320"/>
+              <w:rPr>
+                <w:sz w:val="24"/>
+                <w:szCs w:val="24"/>
+              </w:rPr>
+            </w:pPr>
+            <w:r>
+              <w:rPr>
+                <w:b/>
+                <w:bCs/>
+              </w:rPr>
+              <w:t>O(n + k)</w:t>
+            </w:r>
+          </w:p>
+        </w:tc>
+        <w:tc>
+          <w:tcPr>
+            <w:tcW w:w="0" w:type="auto"/>
+            <w:tcBorders>
+              <w:top w:val="single" w:sz="4" w:space="0" w:color="auto"/>
+              <w:left w:val="single" w:sz="4" w:space="0" w:color="auto"/>
+              <w:bottom w:val="single" w:sz="4" w:space="0" w:color="auto"/>
+              <w:right w:val="single" w:sz="4" w:space="0" w:color="auto"/>
+            </w:tcBorders>
+            <w:vAlign w:val="center"/>
+            <w:hideMark/>
+          </w:tcPr>
+          <w:p>
+            <w:pPr>
+              <w:spacing w:after="320"/>
+              <w:rPr>
+                <w:sz w:val="24"/>
+                <w:szCs w:val="24"/>
+              </w:rPr>
+            </w:pPr>
+            <w:r>
+              <w:t>Elements are completely uniformly distributed, putting an equal, tiny number of elements in each bucket.</w:t>
+            </w:r>
+          </w:p>
+        </w:tc>
+      </w:tr>
+      <w:tr>
+        <w:trPr>
+          <w:tblCellSpacing w:w="15" w:type="dxa"/>
+        </w:trPr>
+        <w:tc>
+          <w:tcPr>
+            <w:tcW w:w="0" w:type="auto"/>
+            <w:tcBorders>
+              <w:top w:val="single" w:sz="4" w:space="0" w:color="auto"/>
+              <w:left w:val="single" w:sz="4" w:space="0" w:color="auto"/>
+              <w:bottom w:val="single" w:sz="4" w:space="0" w:color="auto"/>
+              <w:right w:val="single" w:sz="4" w:space="0" w:color="auto"/>
+            </w:tcBorders>
+            <w:vAlign w:val="center"/>
+            <w:hideMark/>
+          </w:tcPr>
+          <w:p>
+            <w:pPr>
+              <w:spacing w:after="320"/>
+              <w:rPr>
+                <w:sz w:val="24"/>
+                <w:szCs w:val="24"/>
+              </w:rPr>
+            </w:pPr>
+            <w:r>
+              <w:rPr>
+                <w:b/>
+                <w:bCs/>
+              </w:rPr>
+              <w:t>Average Case</w:t>
+            </w:r>
+          </w:p>
+        </w:tc>
+        <w:tc>
+          <w:tcPr>
+            <w:tcW w:w="0" w:type="auto"/>
+            <w:tcBorders>
+              <w:top w:val="single" w:sz="4" w:space="0" w:color="auto"/>
+              <w:left w:val="single" w:sz="4" w:space="0" w:color="auto"/>
+              <w:bottom w:val="single" w:sz="4" w:space="0" w:color="auto"/>
+              <w:right w:val="single" w:sz="4" w:space="0" w:color="auto"/>
+            </w:tcBorders>
+            <w:vAlign w:val="center"/>
+            <w:hideMark/>
+          </w:tcPr>
+          <w:p>
+            <w:pPr>
+              <w:spacing w:after="320"/>
+              <w:rPr>
+                <w:sz w:val="24"/>
+                <w:szCs w:val="24"/>
+              </w:rPr>
+            </w:pPr>
+            <w:r>
+              <w:rPr>
+                <w:b/>
+                <w:bCs/>
+              </w:rPr>
+              <w:t>O(n)</w:t>
+            </w:r>
+          </w:p>
+        </w:tc>
+        <w:tc>
+          <w:tcPr>
+            <w:tcW w:w="0" w:type="auto"/>
+            <w:tcBorders>
+              <w:top w:val="single" w:sz="4" w:space="0" w:color="auto"/>
+              <w:left w:val="single" w:sz="4" w:space="0" w:color="auto"/>
+              <w:bottom w:val="single" w:sz="4" w:space="0" w:color="auto"/>
+              <w:right w:val="single" w:sz="4" w:space="0" w:color="auto"/>
+            </w:tcBorders>
+            <w:vAlign w:val="center"/>
+            <w:hideMark/>
+          </w:tcPr>
+          <w:p>
+            <w:pPr>
+              <w:spacing w:after="320"/>
+              <w:rPr>
+                <w:sz w:val="24"/>
+                <w:szCs w:val="24"/>
+              </w:rPr>
+            </w:pPr>
+            <w:r>
+              <w:t>Elements are distributed randomly. Even if not perfectly uniform, it runs in linear time as long as elements don't bunch up in one bucket.</w:t>
+            </w:r>
+          </w:p>
+        </w:tc>
+      </w:tr>
+      <w:tr>
+        <w:trPr>
+          <w:tblCellSpacing w:w="15" w:type="dxa"/>
+        </w:trPr>
+        <w:tc>
+          <w:tcPr>
+            <w:tcW w:w="0" w:type="auto"/>
+            <w:tcBorders>
+              <w:top w:val="single" w:sz="4" w:space="0" w:color="auto"/>
+              <w:left w:val="single" w:sz="4" w:space="0" w:color="auto"/>
+              <w:bottom w:val="single" w:sz="4" w:space="0" w:color="auto"/>
+              <w:right w:val="single" w:sz="4" w:space="0" w:color="auto"/>
+            </w:tcBorders>
+            <w:vAlign w:val="center"/>
+            <w:hideMark/>
+          </w:tcPr>
+          <w:p>
+            <w:pPr>
+              <w:spacing w:after="320"/>
+              <w:rPr>
+                <w:sz w:val="24"/>
+                <w:szCs w:val="24"/>
+              </w:rPr>
+            </w:pPr>
+            <w:r>
+              <w:rPr>
+                <w:b/>
+                <w:bCs/>
+              </w:rPr>
+              <w:t>Worst Case</w:t>
+            </w:r>
+          </w:p>
+        </w:tc>
+        <w:tc>
+          <w:tcPr>
+            <w:tcW w:w="0" w:type="auto"/>
+            <w:tcBorders>
+              <w:top w:val="single" w:sz="4" w:space="0" w:color="auto"/>
+              <w:left w:val="single" w:sz="4" w:space="0" w:color="auto"/>
+              <w:bottom w:val="single" w:sz="4" w:space="0" w:color="auto"/>
+              <w:right w:val="single" w:sz="4" w:space="0" w:color="auto"/>
+            </w:tcBorders>
+            <w:vAlign w:val="center"/>
+            <w:hideMark/>
+          </w:tcPr>
+          <w:p>
+            <w:pPr>
+              <w:spacing w:after="320"/>
+              <w:rPr>
+                <w:sz w:val="24"/>
+                <w:szCs w:val="24"/>
+              </w:rPr>
+            </w:pPr>
+            <w:r>
+              <w:rPr>
+                <w:b/>
+                <w:bCs/>
+              </w:rPr>
+              <w:t>O(n²)</w:t>
+            </w:r>
+          </w:p>
+        </w:tc>
+        <w:tc>
+          <w:tcPr>
+            <w:tcW w:w="0" w:type="auto"/>
+            <w:tcBorders>
+              <w:top w:val="single" w:sz="4" w:space="0" w:color="auto"/>
+              <w:left w:val="single" w:sz="4" w:space="0" w:color="auto"/>
+              <w:bottom w:val="single" w:sz="4" w:space="0" w:color="auto"/>
+              <w:right w:val="single" w:sz="4" w:space="0" w:color="auto"/>
+            </w:tcBorders>
+            <w:vAlign w:val="center"/>
+            <w:hideMark/>
+          </w:tcPr>
+          <w:p>
+            <w:pPr>
+              <w:spacing w:after="320"/>
+              <w:rPr>
+                <w:sz w:val="24"/>
+                <w:szCs w:val="24"/>
+              </w:rPr>
+            </w:pPr>
+            <w:r>
+              <w:t>Elements are heavily clustered together, meaning almost everything ends up in a single bucket. The complexity then degrades to whatever algorithm is used to sort that bucket (like Insertion Sort).</w:t>
+            </w:r>
+          </w:p>
+        </w:tc>
+      </w:tr>
+    </w:tbl>
+    <w:p>
+      <w:pPr>
+        <w:pStyle w:val="NormalWeb"/>
+        <w:numPr>
+          <w:ilvl w:val="0"/>
+          <w:numId w:val="15"/>
+        </w:numPr>
+      </w:pPr>
+      <w:r>
+        <w:rPr>
+          <w:b/>
+          <w:bCs/>
+        </w:rPr>
+        <w:t>Space Complexity:</w:t>
+      </w:r>
+      <w:r>
+        <w:t xml:space="preserve"> </w:t>
+      </w:r>
+      <w:proofErr w:type="gramStart"/>
+      <w:r>
+        <w:rPr>
+          <w:b/>
+          <w:bCs/>
+        </w:rPr>
+        <w:t>O(</w:t>
+      </w:r>
+      <w:proofErr w:type="gramEnd"/>
+      <w:r>
+        <w:rPr>
+          <w:b/>
+          <w:bCs/>
+        </w:rPr>
+        <w:t>n + k)</w:t>
+      </w:r>
+      <w:r>
+        <w:t xml:space="preserve"> where </w:t>
+      </w:r>
+      <w:r>
+        <w:rPr>
+          <w:rStyle w:val="HTMLCode"/>
+        </w:rPr>
+        <w:t>n</w:t>
+      </w:r>
+      <w:r>
+        <w:t xml:space="preserve"> is the number of elements and </w:t>
+      </w:r>
+      <w:r>
+        <w:rPr>
+          <w:rStyle w:val="HTMLCode"/>
+        </w:rPr>
+        <w:t>k</w:t>
+      </w:r>
+      <w:r>
+        <w:t xml:space="preserve"> is the number of buckets, because it requires extra memory to store the buckets.</w:t>
+      </w:r>
+    </w:p>
+    <w:p>
+      <w:pPr>
+        <w:jc w:val="center"/>
+        <w:rPr>
+          <w:b/>
+          <w:sz w:val="36"/>
+          <w:szCs w:val="36"/>
+        </w:rPr>
+      </w:pPr>
+    </w:p>
     <w:sectPr>
       <w:pgSz w:w="12240" w:h="15840"/>
       <w:pgMar w:top="1440" w:right="1440" w:bottom="1440" w:left="1440" w:header="720" w:footer="720" w:gutter="0"/>
@@ -7787,6 +8763,119 @@
     </w:lvl>
   </w:abstractNum>
   <w:abstractNum w:abstractNumId="6">
+    <w:nsid w:val="380148B5"/>
+    <w:multiLevelType w:val="multilevel"/>
+    <w:tmpl w:val="1F30FEB8"/>
+    <w:lvl w:ilvl="0">
+      <w:start w:val="1"/>
+      <w:numFmt w:val="decimal"/>
+      <w:lvlText w:val="%1."/>
+      <w:lvlJc w:val="left"/>
+      <w:pPr>
+        <w:tabs>
+          <w:tab w:val="num" w:pos="720"/>
+        </w:tabs>
+        <w:ind w:left="720" w:hanging="360"/>
+      </w:pPr>
+    </w:lvl>
+    <w:lvl w:ilvl="1" w:tentative="1">
+      <w:start w:val="1"/>
+      <w:numFmt w:val="decimal"/>
+      <w:lvlText w:val="%2."/>
+      <w:lvlJc w:val="left"/>
+      <w:pPr>
+        <w:tabs>
+          <w:tab w:val="num" w:pos="1440"/>
+        </w:tabs>
+        <w:ind w:left="1440" w:hanging="360"/>
+      </w:pPr>
+    </w:lvl>
+    <w:lvl w:ilvl="2" w:tentative="1">
+      <w:start w:val="1"/>
+      <w:numFmt w:val="decimal"/>
+      <w:lvlText w:val="%3."/>
+      <w:lvlJc w:val="left"/>
+      <w:pPr>
+        <w:tabs>
+          <w:tab w:val="num" w:pos="2160"/>
+        </w:tabs>
+        <w:ind w:left="2160" w:hanging="360"/>
+      </w:pPr>
+    </w:lvl>
+    <w:lvl w:ilvl="3" w:tentative="1">
+      <w:start w:val="1"/>
+      <w:numFmt w:val="decimal"/>
+      <w:lvlText w:val="%4."/>
+      <w:lvlJc w:val="left"/>
+      <w:pPr>
+        <w:tabs>
+          <w:tab w:val="num" w:pos="2880"/>
+        </w:tabs>
+        <w:ind w:left="2880" w:hanging="360"/>
+      </w:pPr>
+    </w:lvl>
+    <w:lvl w:ilvl="4" w:tentative="1">
+      <w:start w:val="1"/>
+      <w:numFmt w:val="decimal"/>
+      <w:lvlText w:val="%5."/>
+      <w:lvlJc w:val="left"/>
+      <w:pPr>
+        <w:tabs>
+          <w:tab w:val="num" w:pos="3600"/>
+        </w:tabs>
+        <w:ind w:left="3600" w:hanging="360"/>
+      </w:pPr>
+    </w:lvl>
+    <w:lvl w:ilvl="5" w:tentative="1">
+      <w:start w:val="1"/>
+      <w:numFmt w:val="decimal"/>
+      <w:lvlText w:val="%6."/>
+      <w:lvlJc w:val="left"/>
+      <w:pPr>
+        <w:tabs>
+          <w:tab w:val="num" w:pos="4320"/>
+        </w:tabs>
+        <w:ind w:left="4320" w:hanging="360"/>
+      </w:pPr>
+    </w:lvl>
+    <w:lvl w:ilvl="6" w:tentative="1">
+      <w:start w:val="1"/>
+      <w:numFmt w:val="decimal"/>
+      <w:lvlText w:val="%7."/>
+      <w:lvlJc w:val="left"/>
+      <w:pPr>
+        <w:tabs>
+          <w:tab w:val="num" w:pos="5040"/>
+        </w:tabs>
+        <w:ind w:left="5040" w:hanging="360"/>
+      </w:pPr>
+    </w:lvl>
+    <w:lvl w:ilvl="7" w:tentative="1">
+      <w:start w:val="1"/>
+      <w:numFmt w:val="decimal"/>
+      <w:lvlText w:val="%8."/>
+      <w:lvlJc w:val="left"/>
+      <w:pPr>
+        <w:tabs>
+          <w:tab w:val="num" w:pos="5760"/>
+        </w:tabs>
+        <w:ind w:left="5760" w:hanging="360"/>
+      </w:pPr>
+    </w:lvl>
+    <w:lvl w:ilvl="8" w:tentative="1">
+      <w:start w:val="1"/>
+      <w:numFmt w:val="decimal"/>
+      <w:lvlText w:val="%9."/>
+      <w:lvlJc w:val="left"/>
+      <w:pPr>
+        <w:tabs>
+          <w:tab w:val="num" w:pos="6480"/>
+        </w:tabs>
+        <w:ind w:left="6480" w:hanging="360"/>
+      </w:pPr>
+    </w:lvl>
+  </w:abstractNum>
+  <w:abstractNum w:abstractNumId="7">
     <w:nsid w:val="3A35349D"/>
     <w:multiLevelType w:val="multilevel"/>
     <w:tmpl w:val="2C48345A"/>
@@ -7935,7 +9024,7 @@
       </w:rPr>
     </w:lvl>
   </w:abstractNum>
-  <w:abstractNum w:abstractNumId="7">
+  <w:abstractNum w:abstractNumId="8">
     <w:nsid w:val="3C973128"/>
     <w:multiLevelType w:val="multilevel"/>
     <w:tmpl w:val="277C0526"/>
@@ -8048,7 +9137,7 @@
       </w:pPr>
     </w:lvl>
   </w:abstractNum>
-  <w:abstractNum w:abstractNumId="8">
+  <w:abstractNum w:abstractNumId="9">
     <w:nsid w:val="3F2C3468"/>
     <w:multiLevelType w:val="multilevel"/>
     <w:tmpl w:val="875EAECE"/>
@@ -8197,7 +9286,7 @@
       </w:rPr>
     </w:lvl>
   </w:abstractNum>
-  <w:abstractNum w:abstractNumId="9">
+  <w:abstractNum w:abstractNumId="10">
     <w:nsid w:val="43A30779"/>
     <w:multiLevelType w:val="multilevel"/>
     <w:tmpl w:val="BACC9242"/>
@@ -8314,7 +9403,7 @@
       </w:pPr>
     </w:lvl>
   </w:abstractNum>
-  <w:abstractNum w:abstractNumId="10">
+  <w:abstractNum w:abstractNumId="11">
     <w:nsid w:val="595278FC"/>
     <w:multiLevelType w:val="multilevel"/>
     <w:tmpl w:val="3908365E"/>
@@ -8427,7 +9516,7 @@
       </w:pPr>
     </w:lvl>
   </w:abstractNum>
-  <w:abstractNum w:abstractNumId="11">
+  <w:abstractNum w:abstractNumId="12">
     <w:nsid w:val="67B67538"/>
     <w:multiLevelType w:val="multilevel"/>
     <w:tmpl w:val="6FD26896"/>
@@ -8448,6 +9537,304 @@
       </w:rPr>
     </w:lvl>
     <w:lvl w:ilvl="1">
+      <w:start w:val="1"/>
+      <w:numFmt w:val="bullet"/>
+      <w:lvlText w:val="o"/>
+      <w:lvlJc w:val="left"/>
+      <w:pPr>
+        <w:tabs>
+          <w:tab w:val="num" w:pos="1440"/>
+        </w:tabs>
+        <w:ind w:left="1440" w:hanging="360"/>
+      </w:pPr>
+      <w:rPr>
+        <w:rFonts w:ascii="Courier New" w:hAnsi="Courier New" w:hint="default"/>
+        <w:sz w:val="20"/>
+      </w:rPr>
+    </w:lvl>
+    <w:lvl w:ilvl="2" w:tentative="1">
+      <w:start w:val="1"/>
+      <w:numFmt w:val="bullet"/>
+      <w:lvlText w:val=""/>
+      <w:lvlJc w:val="left"/>
+      <w:pPr>
+        <w:tabs>
+          <w:tab w:val="num" w:pos="2160"/>
+        </w:tabs>
+        <w:ind w:left="2160" w:hanging="360"/>
+      </w:pPr>
+      <w:rPr>
+        <w:rFonts w:ascii="Wingdings" w:hAnsi="Wingdings" w:hint="default"/>
+        <w:sz w:val="20"/>
+      </w:rPr>
+    </w:lvl>
+    <w:lvl w:ilvl="3" w:tentative="1">
+      <w:start w:val="1"/>
+      <w:numFmt w:val="bullet"/>
+      <w:lvlText w:val=""/>
+      <w:lvlJc w:val="left"/>
+      <w:pPr>
+        <w:tabs>
+          <w:tab w:val="num" w:pos="2880"/>
+        </w:tabs>
+        <w:ind w:left="2880" w:hanging="360"/>
+      </w:pPr>
+      <w:rPr>
+        <w:rFonts w:ascii="Wingdings" w:hAnsi="Wingdings" w:hint="default"/>
+        <w:sz w:val="20"/>
+      </w:rPr>
+    </w:lvl>
+    <w:lvl w:ilvl="4" w:tentative="1">
+      <w:start w:val="1"/>
+      <w:numFmt w:val="bullet"/>
+      <w:lvlText w:val=""/>
+      <w:lvlJc w:val="left"/>
+      <w:pPr>
+        <w:tabs>
+          <w:tab w:val="num" w:pos="3600"/>
+        </w:tabs>
+        <w:ind w:left="3600" w:hanging="360"/>
+      </w:pPr>
+      <w:rPr>
+        <w:rFonts w:ascii="Wingdings" w:hAnsi="Wingdings" w:hint="default"/>
+        <w:sz w:val="20"/>
+      </w:rPr>
+    </w:lvl>
+    <w:lvl w:ilvl="5" w:tentative="1">
+      <w:start w:val="1"/>
+      <w:numFmt w:val="bullet"/>
+      <w:lvlText w:val=""/>
+      <w:lvlJc w:val="left"/>
+      <w:pPr>
+        <w:tabs>
+          <w:tab w:val="num" w:pos="4320"/>
+        </w:tabs>
+        <w:ind w:left="4320" w:hanging="360"/>
+      </w:pPr>
+      <w:rPr>
+        <w:rFonts w:ascii="Wingdings" w:hAnsi="Wingdings" w:hint="default"/>
+        <w:sz w:val="20"/>
+      </w:rPr>
+    </w:lvl>
+    <w:lvl w:ilvl="6" w:tentative="1">
+      <w:start w:val="1"/>
+      <w:numFmt w:val="bullet"/>
+      <w:lvlText w:val=""/>
+      <w:lvlJc w:val="left"/>
+      <w:pPr>
+        <w:tabs>
+          <w:tab w:val="num" w:pos="5040"/>
+        </w:tabs>
+        <w:ind w:left="5040" w:hanging="360"/>
+      </w:pPr>
+      <w:rPr>
+        <w:rFonts w:ascii="Wingdings" w:hAnsi="Wingdings" w:hint="default"/>
+        <w:sz w:val="20"/>
+      </w:rPr>
+    </w:lvl>
+    <w:lvl w:ilvl="7" w:tentative="1">
+      <w:start w:val="1"/>
+      <w:numFmt w:val="bullet"/>
+      <w:lvlText w:val=""/>
+      <w:lvlJc w:val="left"/>
+      <w:pPr>
+        <w:tabs>
+          <w:tab w:val="num" w:pos="5760"/>
+        </w:tabs>
+        <w:ind w:left="5760" w:hanging="360"/>
+      </w:pPr>
+      <w:rPr>
+        <w:rFonts w:ascii="Wingdings" w:hAnsi="Wingdings" w:hint="default"/>
+        <w:sz w:val="20"/>
+      </w:rPr>
+    </w:lvl>
+    <w:lvl w:ilvl="8" w:tentative="1">
+      <w:start w:val="1"/>
+      <w:numFmt w:val="bullet"/>
+      <w:lvlText w:val=""/>
+      <w:lvlJc w:val="left"/>
+      <w:pPr>
+        <w:tabs>
+          <w:tab w:val="num" w:pos="6480"/>
+        </w:tabs>
+        <w:ind w:left="6480" w:hanging="360"/>
+      </w:pPr>
+      <w:rPr>
+        <w:rFonts w:ascii="Wingdings" w:hAnsi="Wingdings" w:hint="default"/>
+        <w:sz w:val="20"/>
+      </w:rPr>
+    </w:lvl>
+  </w:abstractNum>
+  <w:abstractNum w:abstractNumId="13">
+    <w:nsid w:val="79EF139C"/>
+    <w:multiLevelType w:val="multilevel"/>
+    <w:tmpl w:val="FD623862"/>
+    <w:lvl w:ilvl="0">
+      <w:start w:val="1"/>
+      <w:numFmt w:val="bullet"/>
+      <w:lvlText w:val=""/>
+      <w:lvlJc w:val="left"/>
+      <w:pPr>
+        <w:tabs>
+          <w:tab w:val="num" w:pos="720"/>
+        </w:tabs>
+        <w:ind w:left="720" w:hanging="360"/>
+      </w:pPr>
+      <w:rPr>
+        <w:rFonts w:ascii="Symbol" w:hAnsi="Symbol" w:hint="default"/>
+        <w:sz w:val="20"/>
+      </w:rPr>
+    </w:lvl>
+    <w:lvl w:ilvl="1">
+      <w:start w:val="1"/>
+      <w:numFmt w:val="bullet"/>
+      <w:lvlText w:val="o"/>
+      <w:lvlJc w:val="left"/>
+      <w:pPr>
+        <w:tabs>
+          <w:tab w:val="num" w:pos="1440"/>
+        </w:tabs>
+        <w:ind w:left="1440" w:hanging="360"/>
+      </w:pPr>
+      <w:rPr>
+        <w:rFonts w:ascii="Courier New" w:hAnsi="Courier New" w:hint="default"/>
+        <w:sz w:val="20"/>
+      </w:rPr>
+    </w:lvl>
+    <w:lvl w:ilvl="2" w:tentative="1">
+      <w:start w:val="1"/>
+      <w:numFmt w:val="bullet"/>
+      <w:lvlText w:val=""/>
+      <w:lvlJc w:val="left"/>
+      <w:pPr>
+        <w:tabs>
+          <w:tab w:val="num" w:pos="2160"/>
+        </w:tabs>
+        <w:ind w:left="2160" w:hanging="360"/>
+      </w:pPr>
+      <w:rPr>
+        <w:rFonts w:ascii="Wingdings" w:hAnsi="Wingdings" w:hint="default"/>
+        <w:sz w:val="20"/>
+      </w:rPr>
+    </w:lvl>
+    <w:lvl w:ilvl="3" w:tentative="1">
+      <w:start w:val="1"/>
+      <w:numFmt w:val="bullet"/>
+      <w:lvlText w:val=""/>
+      <w:lvlJc w:val="left"/>
+      <w:pPr>
+        <w:tabs>
+          <w:tab w:val="num" w:pos="2880"/>
+        </w:tabs>
+        <w:ind w:left="2880" w:hanging="360"/>
+      </w:pPr>
+      <w:rPr>
+        <w:rFonts w:ascii="Wingdings" w:hAnsi="Wingdings" w:hint="default"/>
+        <w:sz w:val="20"/>
+      </w:rPr>
+    </w:lvl>
+    <w:lvl w:ilvl="4" w:tentative="1">
+      <w:start w:val="1"/>
+      <w:numFmt w:val="bullet"/>
+      <w:lvlText w:val=""/>
+      <w:lvlJc w:val="left"/>
+      <w:pPr>
+        <w:tabs>
+          <w:tab w:val="num" w:pos="3600"/>
+        </w:tabs>
+        <w:ind w:left="3600" w:hanging="360"/>
+      </w:pPr>
+      <w:rPr>
+        <w:rFonts w:ascii="Wingdings" w:hAnsi="Wingdings" w:hint="default"/>
+        <w:sz w:val="20"/>
+      </w:rPr>
+    </w:lvl>
+    <w:lvl w:ilvl="5" w:tentative="1">
+      <w:start w:val="1"/>
+      <w:numFmt w:val="bullet"/>
+      <w:lvlText w:val=""/>
+      <w:lvlJc w:val="left"/>
+      <w:pPr>
+        <w:tabs>
+          <w:tab w:val="num" w:pos="4320"/>
+        </w:tabs>
+        <w:ind w:left="4320" w:hanging="360"/>
+      </w:pPr>
+      <w:rPr>
+        <w:rFonts w:ascii="Wingdings" w:hAnsi="Wingdings" w:hint="default"/>
+        <w:sz w:val="20"/>
+      </w:rPr>
+    </w:lvl>
+    <w:lvl w:ilvl="6" w:tentative="1">
+      <w:start w:val="1"/>
+      <w:numFmt w:val="bullet"/>
+      <w:lvlText w:val=""/>
+      <w:lvlJc w:val="left"/>
+      <w:pPr>
+        <w:tabs>
+          <w:tab w:val="num" w:pos="5040"/>
+        </w:tabs>
+        <w:ind w:left="5040" w:hanging="360"/>
+      </w:pPr>
+      <w:rPr>
+        <w:rFonts w:ascii="Wingdings" w:hAnsi="Wingdings" w:hint="default"/>
+        <w:sz w:val="20"/>
+      </w:rPr>
+    </w:lvl>
+    <w:lvl w:ilvl="7" w:tentative="1">
+      <w:start w:val="1"/>
+      <w:numFmt w:val="bullet"/>
+      <w:lvlText w:val=""/>
+      <w:lvlJc w:val="left"/>
+      <w:pPr>
+        <w:tabs>
+          <w:tab w:val="num" w:pos="5760"/>
+        </w:tabs>
+        <w:ind w:left="5760" w:hanging="360"/>
+      </w:pPr>
+      <w:rPr>
+        <w:rFonts w:ascii="Wingdings" w:hAnsi="Wingdings" w:hint="default"/>
+        <w:sz w:val="20"/>
+      </w:rPr>
+    </w:lvl>
+    <w:lvl w:ilvl="8" w:tentative="1">
+      <w:start w:val="1"/>
+      <w:numFmt w:val="bullet"/>
+      <w:lvlText w:val=""/>
+      <w:lvlJc w:val="left"/>
+      <w:pPr>
+        <w:tabs>
+          <w:tab w:val="num" w:pos="6480"/>
+        </w:tabs>
+        <w:ind w:left="6480" w:hanging="360"/>
+      </w:pPr>
+      <w:rPr>
+        <w:rFonts w:ascii="Wingdings" w:hAnsi="Wingdings" w:hint="default"/>
+        <w:sz w:val="20"/>
+      </w:rPr>
+    </w:lvl>
+  </w:abstractNum>
+  <w:abstractNum w:abstractNumId="14">
+    <w:nsid w:val="7E351390"/>
+    <w:multiLevelType w:val="multilevel"/>
+    <w:tmpl w:val="7AA6C8D8"/>
+    <w:lvl w:ilvl="0">
+      <w:start w:val="1"/>
+      <w:numFmt w:val="bullet"/>
+      <w:lvlText w:val=""/>
+      <w:lvlJc w:val="left"/>
+      <w:pPr>
+        <w:tabs>
+          <w:tab w:val="num" w:pos="720"/>
+        </w:tabs>
+        <w:ind w:left="720" w:hanging="360"/>
+      </w:pPr>
+      <w:rPr>
+        <w:rFonts w:ascii="Symbol" w:hAnsi="Symbol" w:hint="default"/>
+        <w:sz w:val="20"/>
+      </w:rPr>
+    </w:lvl>
+    <w:lvl w:ilvl="1" w:tentative="1">
       <w:start w:val="1"/>
       <w:numFmt w:val="bullet"/>
       <w:lvlText w:val="o"/>
@@ -8583,34 +9970,43 @@
     <w:abstractNumId w:val="1"/>
   </w:num>
   <w:num w:numId="3">
-    <w:abstractNumId w:val="7"/>
+    <w:abstractNumId w:val="8"/>
   </w:num>
   <w:num w:numId="4">
-    <w:abstractNumId w:val="11"/>
+    <w:abstractNumId w:val="12"/>
   </w:num>
   <w:num w:numId="5">
     <w:abstractNumId w:val="5"/>
   </w:num>
   <w:num w:numId="6">
-    <w:abstractNumId w:val="6"/>
+    <w:abstractNumId w:val="7"/>
   </w:num>
   <w:num w:numId="7">
-    <w:abstractNumId w:val="10"/>
+    <w:abstractNumId w:val="11"/>
   </w:num>
   <w:num w:numId="8">
     <w:abstractNumId w:val="2"/>
   </w:num>
   <w:num w:numId="9">
-    <w:abstractNumId w:val="9"/>
+    <w:abstractNumId w:val="10"/>
   </w:num>
   <w:num w:numId="10">
-    <w:abstractNumId w:val="8"/>
+    <w:abstractNumId w:val="9"/>
   </w:num>
   <w:num w:numId="11">
     <w:abstractNumId w:val="4"/>
   </w:num>
   <w:num w:numId="12">
     <w:abstractNumId w:val="3"/>
+  </w:num>
+  <w:num w:numId="13">
+    <w:abstractNumId w:val="6"/>
+  </w:num>
+  <w:num w:numId="14">
+    <w:abstractNumId w:val="13"/>
+  </w:num>
+  <w:num w:numId="15">
+    <w:abstractNumId w:val="14"/>
   </w:num>
 </w:numbering>
 </file>
@@ -8776,6 +10172,31 @@
     <w:qFormat/>
     <w:rsid w:val="00637954"/>
   </w:style>
+  <w:style w:type="paragraph" w:styleId="Heading2">
+    <w:name w:val="heading 2"/>
+    <w:basedOn w:val="Normal"/>
+    <w:next w:val="Normal"/>
+    <w:link w:val="Heading2Char"/>
+    <w:uiPriority w:val="9"/>
+    <w:semiHidden/>
+    <w:unhideWhenUsed/>
+    <w:qFormat/>
+    <w:rsid w:val="003801AA"/>
+    <w:pPr>
+      <w:keepNext/>
+      <w:keepLines/>
+      <w:spacing w:before="200" w:after="0"/>
+      <w:outlineLvl w:val="1"/>
+    </w:pPr>
+    <w:rPr>
+      <w:rFonts w:asciiTheme="majorHAnsi" w:eastAsiaTheme="majorEastAsia" w:hAnsiTheme="majorHAnsi" w:cstheme="majorBidi"/>
+      <w:b/>
+      <w:bCs/>
+      <w:color w:val="4F81BD" w:themeColor="accent1"/>
+      <w:sz w:val="26"/>
+      <w:szCs w:val="26"/>
+    </w:rPr>
+  </w:style>
   <w:style w:type="paragraph" w:styleId="Heading3">
     <w:name w:val="heading 3"/>
     <w:basedOn w:val="Normal"/>
@@ -8892,6 +10313,22 @@
       <w:ind w:left="720"/>
       <w:contextualSpacing/>
     </w:pPr>
+  </w:style>
+  <w:style w:type="character" w:customStyle="1" w:styleId="Heading2Char">
+    <w:name w:val="Heading 2 Char"/>
+    <w:basedOn w:val="DefaultParagraphFont"/>
+    <w:link w:val="Heading2"/>
+    <w:uiPriority w:val="9"/>
+    <w:semiHidden/>
+    <w:rsid w:val="003801AA"/>
+    <w:rPr>
+      <w:rFonts w:asciiTheme="majorHAnsi" w:eastAsiaTheme="majorEastAsia" w:hAnsiTheme="majorHAnsi" w:cstheme="majorBidi"/>
+      <w:b/>
+      <w:bCs/>
+      <w:color w:val="4F81BD" w:themeColor="accent1"/>
+      <w:sz w:val="26"/>
+      <w:szCs w:val="26"/>
+    </w:rPr>
   </w:style>
 </w:styles>
 </file>

</xml_diff>